<commit_message>
Validaciones en node.js y en el frontend -->actualizacion mensajes en archibos de constantes
</commit_message>
<xml_diff>
--- a/proyecto.docx
+++ b/proyecto.docx
@@ -3347,7 +3347,7 @@
                   </wp:anchor>
                 </w:drawing>
               </mc:Choice>
-              <mc:Fallback xmlns:w16du="http://schemas.microsoft.com/office/word/2023/wordml/word16du" xmlns:w16sdtfl="http://schemas.microsoft.com/office/word/2024/wordml/sdtformatlock">
+              <mc:Fallback xmlns:w16sdtfl="http://schemas.microsoft.com/office/word/2024/wordml/sdtformatlock" xmlns:w16du="http://schemas.microsoft.com/office/word/2023/wordml/word16du">
                 <w:pict>
                   <v:group w14:anchorId="07305E3A" id="Grupo 26" o:spid="_x0000_s1026" style="position:absolute;margin-left:0;margin-top:0;width:168pt;height:718.55pt;z-index:-251643904;mso-height-percent:950;mso-left-percent:40;mso-position-horizontal-relative:page;mso-position-vertical:center;mso-position-vertical-relative:page;mso-height-percent:950;mso-left-percent:40" coordsize="21336,91257" o:gfxdata="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">
                     <v:rect id="Rectángulo 3" o:spid="_x0000_s1027" style="position:absolute;width:1945;height:91257;visibility:visible;mso-wrap-style:square;v-text-anchor:middle" o:gfxdata="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" fillcolor="#0e2841 [3215]" stroked="f" strokeweight="1.5pt"/>
@@ -5544,7 +5544,7 @@
           <w:noProof/>
         </w:rPr>
         <w:drawing>
-          <wp:inline distT="0" distB="0" distL="0" distR="0" wp14:anchorId="3A9F5494" wp14:editId="5ECD2069">
+          <wp:inline distT="0" distB="0" distL="0" distR="0" wp14:anchorId="3A9F5494" wp14:editId="23141AFC">
             <wp:extent cx="4443624" cy="3161307"/>
             <wp:effectExtent l="76200" t="76200" r="128905" b="134620"/>
             <wp:docPr id="935891741" name="Imagen 1"/>
@@ -5697,7 +5697,7 @@
           <w:noProof/>
         </w:rPr>
         <w:drawing>
-          <wp:inline distT="0" distB="0" distL="0" distR="0" wp14:anchorId="6CC8F11D" wp14:editId="0E5B475B">
+          <wp:inline distT="0" distB="0" distL="0" distR="0" wp14:anchorId="6CC8F11D" wp14:editId="5A4BA55F">
             <wp:extent cx="5396230" cy="3834130"/>
             <wp:effectExtent l="76200" t="76200" r="128270" b="128270"/>
             <wp:docPr id="1285130325" name="Imagen 3"/>
@@ -5853,7 +5853,7 @@
           <w:noProof/>
         </w:rPr>
         <w:drawing>
-          <wp:inline distT="0" distB="0" distL="0" distR="0" wp14:anchorId="100023D7" wp14:editId="31225D1F">
+          <wp:inline distT="0" distB="0" distL="0" distR="0" wp14:anchorId="100023D7" wp14:editId="2D1D5B7D">
             <wp:extent cx="4772025" cy="3395500"/>
             <wp:effectExtent l="95250" t="95250" r="85725" b="90805"/>
             <wp:docPr id="418913" name="Imagen 8"/>
@@ -5936,7 +5936,7 @@
           <w:noProof/>
         </w:rPr>
         <w:drawing>
-          <wp:inline distT="0" distB="0" distL="0" distR="0" wp14:anchorId="252BBB8C" wp14:editId="086BF854">
+          <wp:inline distT="0" distB="0" distL="0" distR="0" wp14:anchorId="252BBB8C" wp14:editId="56EF159F">
             <wp:extent cx="4974873" cy="3539836"/>
             <wp:effectExtent l="76200" t="76200" r="130810" b="137160"/>
             <wp:docPr id="913894690" name="Imagen 7"/>
@@ -6012,7 +6012,7 @@
           <w:noProof/>
         </w:rPr>
         <w:drawing>
-          <wp:inline distT="0" distB="0" distL="0" distR="0" wp14:anchorId="1C3A36F7" wp14:editId="538AA1BF">
+          <wp:inline distT="0" distB="0" distL="0" distR="0" wp14:anchorId="1C3A36F7" wp14:editId="75C663C9">
             <wp:extent cx="4949839" cy="3522023"/>
             <wp:effectExtent l="76200" t="76200" r="136525" b="135890"/>
             <wp:docPr id="1340598956" name="Imagen 1"/>
@@ -6319,7 +6319,7 @@
               </wp:anchor>
             </w:drawing>
           </mc:Choice>
-          <mc:Fallback xmlns:w16du="http://schemas.microsoft.com/office/word/2023/wordml/word16du" xmlns:w16sdtfl="http://schemas.microsoft.com/office/word/2024/wordml/sdtformatlock">
+          <mc:Fallback xmlns:w16sdtfl="http://schemas.microsoft.com/office/word/2024/wordml/sdtformatlock" xmlns:w16du="http://schemas.microsoft.com/office/word/2023/wordml/word16du">
             <w:pict>
               <v:shapetype w14:anchorId="49C09E3A" id="_x0000_t75" coordsize="21600,21600" o:spt="75" o:preferrelative="t" path="m@4@5l@4@11@9@11@9@5xe" filled="f" stroked="f">
                 <v:stroke joinstyle="miter"/>
@@ -6383,7 +6383,7 @@
               </wp:anchor>
             </w:drawing>
           </mc:Choice>
-          <mc:Fallback xmlns:w16du="http://schemas.microsoft.com/office/word/2023/wordml/word16du" xmlns:w16sdtfl="http://schemas.microsoft.com/office/word/2024/wordml/sdtformatlock">
+          <mc:Fallback xmlns:w16sdtfl="http://schemas.microsoft.com/office/word/2024/wordml/sdtformatlock" xmlns:w16du="http://schemas.microsoft.com/office/word/2023/wordml/word16du">
             <w:pict>
               <v:shape w14:anchorId="061103E0" id="Entrada de lápiz 3" o:spid="_x0000_s1026" type="#_x0000_t75" style="position:absolute;margin-left:65.5pt;margin-top:218.45pt;width:27.45pt;height:1.05pt;z-index:251664384;visibility:visible;mso-wrap-style:square;mso-wrap-distance-left:9pt;mso-wrap-distance-top:0;mso-wrap-distance-right:9pt;mso-wrap-distance-bottom:0;mso-position-horizontal:absolute;mso-position-horizontal-relative:text;mso-position-vertical:absolute;mso-position-vertical-relative:text" o:gfxdata="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">
                 <v:imagedata r:id="rId20" o:title=""/>
@@ -6428,7 +6428,7 @@
               </wp:anchor>
             </w:drawing>
           </mc:Choice>
-          <mc:Fallback xmlns:w16du="http://schemas.microsoft.com/office/word/2023/wordml/word16du" xmlns:w16sdtfl="http://schemas.microsoft.com/office/word/2024/wordml/sdtformatlock">
+          <mc:Fallback xmlns:w16sdtfl="http://schemas.microsoft.com/office/word/2024/wordml/sdtformatlock" xmlns:w16du="http://schemas.microsoft.com/office/word/2023/wordml/word16du">
             <w:pict>
               <v:shapetype w14:anchorId="26ED7025" id="_x0000_t75" coordsize="21600,21600" o:spt="75" o:preferrelative="t" path="m@4@5l@4@11@9@11@9@5xe" filled="f" stroked="f">
                 <v:stroke joinstyle="miter"/>
@@ -6525,7 +6525,7 @@
           <w:noProof/>
         </w:rPr>
         <w:drawing>
-          <wp:inline distT="0" distB="0" distL="0" distR="0" wp14:anchorId="4A834548" wp14:editId="624D88EC">
+          <wp:inline distT="0" distB="0" distL="0" distR="0" wp14:anchorId="4A834548" wp14:editId="66C6DAD7">
             <wp:extent cx="5396230" cy="3834130"/>
             <wp:effectExtent l="76200" t="76200" r="128270" b="128270"/>
             <wp:docPr id="433170619" name="Imagen 2"/>
@@ -6598,7 +6598,7 @@
           <w:noProof/>
         </w:rPr>
         <w:drawing>
-          <wp:inline distT="0" distB="0" distL="0" distR="0" wp14:anchorId="322F9951" wp14:editId="2D1D90EC">
+          <wp:inline distT="0" distB="0" distL="0" distR="0" wp14:anchorId="322F9951" wp14:editId="465C877F">
             <wp:extent cx="4621432" cy="3283620"/>
             <wp:effectExtent l="76200" t="76200" r="141605" b="126365"/>
             <wp:docPr id="784425407" name="Imagen 7"/>
@@ -6697,7 +6697,7 @@
           <w:noProof/>
         </w:rPr>
         <w:drawing>
-          <wp:inline distT="0" distB="0" distL="0" distR="0" wp14:anchorId="6F09FAA3" wp14:editId="624FDEA7">
+          <wp:inline distT="0" distB="0" distL="0" distR="0" wp14:anchorId="6F09FAA3" wp14:editId="6CDF1CB0">
             <wp:extent cx="4461002" cy="3171884"/>
             <wp:effectExtent l="76200" t="76200" r="130175" b="123825"/>
             <wp:docPr id="1755659709" name="Imagen 12"/>
@@ -6844,7 +6844,7 @@
           <w:noProof/>
         </w:rPr>
         <w:drawing>
-          <wp:inline distT="0" distB="0" distL="0" distR="0" wp14:anchorId="5534E4D8" wp14:editId="49BC9293">
+          <wp:inline distT="0" distB="0" distL="0" distR="0" wp14:anchorId="5534E4D8" wp14:editId="363D6882">
             <wp:extent cx="4368895" cy="3106393"/>
             <wp:effectExtent l="76200" t="76200" r="127000" b="132715"/>
             <wp:docPr id="1844187693" name="Imagen 13"/>
@@ -6932,7 +6932,7 @@
           <w:noProof/>
         </w:rPr>
         <w:drawing>
-          <wp:inline distT="0" distB="0" distL="0" distR="0" wp14:anchorId="48AE76E1" wp14:editId="173790D9">
+          <wp:inline distT="0" distB="0" distL="0" distR="0" wp14:anchorId="48AE76E1" wp14:editId="0EF709BE">
             <wp:extent cx="4855490" cy="3452374"/>
             <wp:effectExtent l="76200" t="76200" r="135890" b="129540"/>
             <wp:docPr id="1526789695" name="Imagen 12" descr="Interfaz de usuario gráfica, Aplicación&#10;&#10;El contenido generado por IA puede ser incorrecto."/>
@@ -7005,7 +7005,7 @@
           <w:noProof/>
         </w:rPr>
         <w:drawing>
-          <wp:inline distT="0" distB="0" distL="0" distR="0" wp14:anchorId="6794A471" wp14:editId="2A0B869A">
+          <wp:inline distT="0" distB="0" distL="0" distR="0" wp14:anchorId="6794A471" wp14:editId="7C7E28FA">
             <wp:extent cx="4933366" cy="3507746"/>
             <wp:effectExtent l="76200" t="76200" r="133985" b="130810"/>
             <wp:docPr id="760556303" name="Imagen 1"/>
@@ -7079,7 +7079,7 @@
           <w:noProof/>
         </w:rPr>
         <w:drawing>
-          <wp:inline distT="0" distB="0" distL="0" distR="0" wp14:anchorId="41E0CD49" wp14:editId="3032DB15">
+          <wp:inline distT="0" distB="0" distL="0" distR="0" wp14:anchorId="41E0CD49" wp14:editId="6AAFFCB2">
             <wp:extent cx="4989464" cy="3547635"/>
             <wp:effectExtent l="76200" t="76200" r="135255" b="129540"/>
             <wp:docPr id="272702160" name="Imagen 2"/>
@@ -7152,7 +7152,7 @@
           <w:noProof/>
         </w:rPr>
         <w:drawing>
-          <wp:inline distT="0" distB="0" distL="0" distR="0" wp14:anchorId="1DD9C742" wp14:editId="4A977A12">
+          <wp:inline distT="0" distB="0" distL="0" distR="0" wp14:anchorId="1DD9C742" wp14:editId="5DB45865">
             <wp:extent cx="5030649" cy="3576916"/>
             <wp:effectExtent l="76200" t="76200" r="132080" b="138430"/>
             <wp:docPr id="1519085843" name="Imagen 3"/>
@@ -7231,7 +7231,7 @@
           <w:noProof/>
         </w:rPr>
         <w:drawing>
-          <wp:inline distT="0" distB="0" distL="0" distR="0" wp14:anchorId="08C08F08" wp14:editId="6B558335">
+          <wp:inline distT="0" distB="0" distL="0" distR="0" wp14:anchorId="08C08F08" wp14:editId="1911DF68">
             <wp:extent cx="4873889" cy="3466106"/>
             <wp:effectExtent l="76200" t="76200" r="136525" b="134620"/>
             <wp:docPr id="1997279975" name="Imagen 1"/>
@@ -7307,7 +7307,7 @@
           <w:noProof/>
         </w:rPr>
         <w:drawing>
-          <wp:inline distT="0" distB="0" distL="0" distR="0" wp14:anchorId="68ACB7BF" wp14:editId="52A6FD70">
+          <wp:inline distT="0" distB="0" distL="0" distR="0" wp14:anchorId="68ACB7BF" wp14:editId="3D91AFCB">
             <wp:extent cx="4862708" cy="3458154"/>
             <wp:effectExtent l="76200" t="76200" r="128905" b="142875"/>
             <wp:docPr id="1649579706" name="Imagen 2"/>
@@ -10472,6 +10472,9 @@
         <w:ind w:left="360"/>
       </w:pPr>
       <w:r>
+        <w:rPr>
+          <w:noProof/>
+        </w:rPr>
         <w:drawing>
           <wp:inline distT="0" distB="0" distL="0" distR="0" wp14:anchorId="47237619" wp14:editId="36767C8B">
             <wp:extent cx="5363323" cy="704948"/>
@@ -10524,16 +10527,19 @@
     <w:p>
       <w:pPr>
         <w:pStyle w:val="Prrafodelista"/>
+        <w:ind w:left="2160"/>
+      </w:pPr>
+    </w:p>
+    <w:p>
+      <w:pPr>
+        <w:pStyle w:val="Prrafodelista"/>
         <w:numPr>
           <w:ilvl w:val="1"/>
           <w:numId w:val="6"/>
         </w:numPr>
       </w:pPr>
       <w:r>
-        <w:t xml:space="preserve">En la vista de administrador </w:t>
-      </w:r>
-      <w:r>
-        <w:t>quitar componente explorar cuando el usuario navega en su perfil u otras rutas relacionadas que no tienen nada que ver.</w:t>
+        <w:t>Añadir comprobaciones de seguridad.</w:t>
       </w:r>
     </w:p>
     <w:p>
@@ -10545,62 +10551,7 @@
         </w:numPr>
       </w:pPr>
       <w:r>
-        <w:t>Sustituir componente por otro igual pero con las opciones del menú desplegable:</w:t>
-      </w:r>
-    </w:p>
-    <w:p>
-      <w:pPr>
-        <w:pStyle w:val="Prrafodelista"/>
-        <w:ind w:left="2160"/>
-      </w:pPr>
-      <w:r>
-        <w:drawing>
-          <wp:inline distT="0" distB="0" distL="0" distR="0" wp14:anchorId="7AE4A8FA" wp14:editId="39BCB03E">
-            <wp:extent cx="782475" cy="1210391"/>
-            <wp:effectExtent l="0" t="0" r="0" b="8890"/>
-            <wp:docPr id="11" name="Imagen 11"/>
-            <wp:cNvGraphicFramePr>
-              <a:graphicFrameLocks xmlns:a="http://schemas.openxmlformats.org/drawingml/2006/main" noChangeAspect="1"/>
-            </wp:cNvGraphicFramePr>
-            <a:graphic xmlns:a="http://schemas.openxmlformats.org/drawingml/2006/main">
-              <a:graphicData uri="http://schemas.openxmlformats.org/drawingml/2006/picture">
-                <pic:pic xmlns:pic="http://schemas.openxmlformats.org/drawingml/2006/picture">
-                  <pic:nvPicPr>
-                    <pic:cNvPr id="1" name=""/>
-                    <pic:cNvPicPr/>
-                  </pic:nvPicPr>
-                  <pic:blipFill>
-                    <a:blip r:embed="rId41"/>
-                    <a:stretch>
-                      <a:fillRect/>
-                    </a:stretch>
-                  </pic:blipFill>
-                  <pic:spPr>
-                    <a:xfrm>
-                      <a:off x="0" y="0"/>
-                      <a:ext cx="787381" cy="1217980"/>
-                    </a:xfrm>
-                    <a:prstGeom prst="rect">
-                      <a:avLst/>
-                    </a:prstGeom>
-                  </pic:spPr>
-                </pic:pic>
-              </a:graphicData>
-            </a:graphic>
-          </wp:inline>
-        </w:drawing>
-      </w:r>
-    </w:p>
-    <w:p>
-      <w:pPr>
-        <w:pStyle w:val="Prrafodelista"/>
-        <w:numPr>
-          <w:ilvl w:val="1"/>
-          <w:numId w:val="6"/>
-        </w:numPr>
-      </w:pPr>
-      <w:r>
-        <w:t>Añadir comprobaciones de seguridad.</w:t>
+        <w:t xml:space="preserve"> Que no se puedan acceder a rutas que no existen… error personalizado</w:t>
       </w:r>
     </w:p>
     <w:p>
@@ -10612,18 +10563,6 @@
         </w:numPr>
       </w:pPr>
       <w:r>
-        <w:t xml:space="preserve"> Que no se puedan acceder a rutas que no existen… error personalizado</w:t>
-      </w:r>
-    </w:p>
-    <w:p>
-      <w:pPr>
-        <w:pStyle w:val="Prrafodelista"/>
-        <w:numPr>
-          <w:ilvl w:val="2"/>
-          <w:numId w:val="6"/>
-        </w:numPr>
-      </w:pPr>
-      <w:r>
         <w:t>Revisar seguridad de password (tanto en node.js como a nivel de web)</w:t>
       </w:r>
     </w:p>
@@ -10736,7 +10675,6 @@
           <w:i/>
           <w:iCs/>
         </w:rPr>
-        <w:lastRenderedPageBreak/>
         <w:t>Qué es:</w:t>
       </w:r>
       <w:r>
@@ -10820,6 +10758,7 @@
           <w:i/>
           <w:iCs/>
         </w:rPr>
+        <w:lastRenderedPageBreak/>
         <w:t>Qué es:</w:t>
       </w:r>
       <w:r>
@@ -11161,7 +11100,6 @@
           <w:b/>
           <w:bCs/>
         </w:rPr>
-        <w:lastRenderedPageBreak/>
         <w:t>⚙</w:t>
       </w:r>
       <w:r>
@@ -11305,6 +11243,7 @@
           <w:i/>
           <w:iCs/>
         </w:rPr>
+        <w:lastRenderedPageBreak/>
         <w:t>Por qué:</w:t>
       </w:r>
       <w:r>
@@ -11698,7 +11637,7 @@
       </w:pPr>
     </w:p>
     <w:sectPr>
-      <w:headerReference w:type="default" r:id="rId42"/>
+      <w:headerReference w:type="default" r:id="rId41"/>
       <w:pgSz w:w="11906" w:h="16838"/>
       <w:pgMar w:top="1417" w:right="1701" w:bottom="1417" w:left="1701" w:header="708" w:footer="708" w:gutter="0"/>
       <w:pgNumType w:start="0"/>
@@ -16239,6 +16178,7 @@
   <w:style w:type="character" w:default="1" w:styleId="Fuentedeprrafopredeter">
     <w:name w:val="Default Paragraph Font"/>
     <w:uiPriority w:val="1"/>
+    <w:semiHidden/>
     <w:unhideWhenUsed/>
   </w:style>
   <w:style w:type="table" w:default="1" w:styleId="Tablanormal">

</xml_diff>

<commit_message>
nodemailer -->instalación y configuracion de sistema para enviar correos para restablecer pass
</commit_message>
<xml_diff>
--- a/proyecto.docx
+++ b/proyecto.docx
@@ -3347,7 +3347,7 @@
                   </wp:anchor>
                 </w:drawing>
               </mc:Choice>
-              <mc:Fallback xmlns:w16sdtfl="http://schemas.microsoft.com/office/word/2024/wordml/sdtformatlock" xmlns:w16du="http://schemas.microsoft.com/office/word/2023/wordml/word16du">
+              <mc:Fallback xmlns:w16du="http://schemas.microsoft.com/office/word/2023/wordml/word16du" xmlns:w16sdtfl="http://schemas.microsoft.com/office/word/2024/wordml/sdtformatlock">
                 <w:pict>
                   <v:group w14:anchorId="07305E3A" id="Grupo 26" o:spid="_x0000_s1026" style="position:absolute;margin-left:0;margin-top:0;width:168pt;height:718.55pt;z-index:-251643904;mso-height-percent:950;mso-left-percent:40;mso-position-horizontal-relative:page;mso-position-vertical:center;mso-position-vertical-relative:page;mso-height-percent:950;mso-left-percent:40" coordsize="21336,91257" o:gfxdata="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">
                     <v:rect id="Rectángulo 3" o:spid="_x0000_s1027" style="position:absolute;width:1945;height:91257;visibility:visible;mso-wrap-style:square;v-text-anchor:middle" o:gfxdata="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" fillcolor="#0e2841 [3215]" stroked="f" strokeweight="1.5pt"/>
@@ -4498,8 +4498,13 @@
         <w:t xml:space="preserve">de "Recomendados para ti" </w:t>
       </w:r>
       <w:r>
-        <w:t>estará en la home</w:t>
-      </w:r>
+        <w:t xml:space="preserve">estará en </w:t>
+      </w:r>
+      <w:proofErr w:type="gramStart"/>
+      <w:r>
+        <w:t>la home</w:t>
+      </w:r>
+      <w:proofErr w:type="gramEnd"/>
       <w:r>
         <w:t xml:space="preserve"> del usuario</w:t>
       </w:r>
@@ -5535,7 +5540,27 @@
           <w:sz w:val="20"/>
           <w:szCs w:val="20"/>
         </w:rPr>
-        <w:t xml:space="preserve">Nota: Cada uno de los apartados incluidos dentro de explorar abren diferentes vistas, idénticas a la página principal pero con diferente título y contenido: </w:t>
+        <w:t xml:space="preserve">Nota: Cada uno de los apartados incluidos dentro de explorar abren diferentes vistas, idénticas a la página </w:t>
+      </w:r>
+      <w:proofErr w:type="gramStart"/>
+      <w:r>
+        <w:rPr>
+          <w:b/>
+          <w:bCs/>
+          <w:sz w:val="20"/>
+          <w:szCs w:val="20"/>
+        </w:rPr>
+        <w:t>principal</w:t>
+      </w:r>
+      <w:proofErr w:type="gramEnd"/>
+      <w:r>
+        <w:rPr>
+          <w:b/>
+          <w:bCs/>
+          <w:sz w:val="20"/>
+          <w:szCs w:val="20"/>
+        </w:rPr>
+        <w:t xml:space="preserve"> pero con diferente título y contenido: </w:t>
       </w:r>
     </w:p>
     <w:p>
@@ -5544,7 +5569,7 @@
           <w:noProof/>
         </w:rPr>
         <w:drawing>
-          <wp:inline distT="0" distB="0" distL="0" distR="0" wp14:anchorId="3A9F5494" wp14:editId="23141AFC">
+          <wp:inline distT="0" distB="0" distL="0" distR="0" wp14:anchorId="3A9F5494" wp14:editId="1FD08F89">
             <wp:extent cx="4443624" cy="3161307"/>
             <wp:effectExtent l="76200" t="76200" r="128905" b="134620"/>
             <wp:docPr id="935891741" name="Imagen 1"/>
@@ -5697,7 +5722,7 @@
           <w:noProof/>
         </w:rPr>
         <w:drawing>
-          <wp:inline distT="0" distB="0" distL="0" distR="0" wp14:anchorId="6CC8F11D" wp14:editId="5A4BA55F">
+          <wp:inline distT="0" distB="0" distL="0" distR="0" wp14:anchorId="6CC8F11D" wp14:editId="7FC0BAF0">
             <wp:extent cx="5396230" cy="3834130"/>
             <wp:effectExtent l="76200" t="76200" r="128270" b="128270"/>
             <wp:docPr id="1285130325" name="Imagen 3"/>
@@ -5853,7 +5878,7 @@
           <w:noProof/>
         </w:rPr>
         <w:drawing>
-          <wp:inline distT="0" distB="0" distL="0" distR="0" wp14:anchorId="100023D7" wp14:editId="2D1D5B7D">
+          <wp:inline distT="0" distB="0" distL="0" distR="0" wp14:anchorId="100023D7" wp14:editId="2B9EA22F">
             <wp:extent cx="4772025" cy="3395500"/>
             <wp:effectExtent l="95250" t="95250" r="85725" b="90805"/>
             <wp:docPr id="418913" name="Imagen 8"/>
@@ -5936,7 +5961,7 @@
           <w:noProof/>
         </w:rPr>
         <w:drawing>
-          <wp:inline distT="0" distB="0" distL="0" distR="0" wp14:anchorId="252BBB8C" wp14:editId="56EF159F">
+          <wp:inline distT="0" distB="0" distL="0" distR="0" wp14:anchorId="252BBB8C" wp14:editId="03FD6880">
             <wp:extent cx="4974873" cy="3539836"/>
             <wp:effectExtent l="76200" t="76200" r="130810" b="137160"/>
             <wp:docPr id="913894690" name="Imagen 7"/>
@@ -6012,7 +6037,7 @@
           <w:noProof/>
         </w:rPr>
         <w:drawing>
-          <wp:inline distT="0" distB="0" distL="0" distR="0" wp14:anchorId="1C3A36F7" wp14:editId="75C663C9">
+          <wp:inline distT="0" distB="0" distL="0" distR="0" wp14:anchorId="1C3A36F7" wp14:editId="7FAF5283">
             <wp:extent cx="4949839" cy="3522023"/>
             <wp:effectExtent l="76200" t="76200" r="136525" b="135890"/>
             <wp:docPr id="1340598956" name="Imagen 1"/>
@@ -6319,7 +6344,7 @@
               </wp:anchor>
             </w:drawing>
           </mc:Choice>
-          <mc:Fallback xmlns:w16sdtfl="http://schemas.microsoft.com/office/word/2024/wordml/sdtformatlock" xmlns:w16du="http://schemas.microsoft.com/office/word/2023/wordml/word16du">
+          <mc:Fallback xmlns:w16du="http://schemas.microsoft.com/office/word/2023/wordml/word16du" xmlns:w16sdtfl="http://schemas.microsoft.com/office/word/2024/wordml/sdtformatlock">
             <w:pict>
               <v:shapetype w14:anchorId="49C09E3A" id="_x0000_t75" coordsize="21600,21600" o:spt="75" o:preferrelative="t" path="m@4@5l@4@11@9@11@9@5xe" filled="f" stroked="f">
                 <v:stroke joinstyle="miter"/>
@@ -6383,7 +6408,7 @@
               </wp:anchor>
             </w:drawing>
           </mc:Choice>
-          <mc:Fallback xmlns:w16sdtfl="http://schemas.microsoft.com/office/word/2024/wordml/sdtformatlock" xmlns:w16du="http://schemas.microsoft.com/office/word/2023/wordml/word16du">
+          <mc:Fallback xmlns:w16du="http://schemas.microsoft.com/office/word/2023/wordml/word16du" xmlns:w16sdtfl="http://schemas.microsoft.com/office/word/2024/wordml/sdtformatlock">
             <w:pict>
               <v:shape w14:anchorId="061103E0" id="Entrada de lápiz 3" o:spid="_x0000_s1026" type="#_x0000_t75" style="position:absolute;margin-left:65.5pt;margin-top:218.45pt;width:27.45pt;height:1.05pt;z-index:251664384;visibility:visible;mso-wrap-style:square;mso-wrap-distance-left:9pt;mso-wrap-distance-top:0;mso-wrap-distance-right:9pt;mso-wrap-distance-bottom:0;mso-position-horizontal:absolute;mso-position-horizontal-relative:text;mso-position-vertical:absolute;mso-position-vertical-relative:text" o:gfxdata="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">
                 <v:imagedata r:id="rId20" o:title=""/>
@@ -6428,7 +6453,7 @@
               </wp:anchor>
             </w:drawing>
           </mc:Choice>
-          <mc:Fallback xmlns:w16sdtfl="http://schemas.microsoft.com/office/word/2024/wordml/sdtformatlock" xmlns:w16du="http://schemas.microsoft.com/office/word/2023/wordml/word16du">
+          <mc:Fallback xmlns:w16du="http://schemas.microsoft.com/office/word/2023/wordml/word16du" xmlns:w16sdtfl="http://schemas.microsoft.com/office/word/2024/wordml/sdtformatlock">
             <w:pict>
               <v:shapetype w14:anchorId="26ED7025" id="_x0000_t75" coordsize="21600,21600" o:spt="75" o:preferrelative="t" path="m@4@5l@4@11@9@11@9@5xe" filled="f" stroked="f">
                 <v:stroke joinstyle="miter"/>
@@ -6525,7 +6550,7 @@
           <w:noProof/>
         </w:rPr>
         <w:drawing>
-          <wp:inline distT="0" distB="0" distL="0" distR="0" wp14:anchorId="4A834548" wp14:editId="66C6DAD7">
+          <wp:inline distT="0" distB="0" distL="0" distR="0" wp14:anchorId="4A834548" wp14:editId="265E033F">
             <wp:extent cx="5396230" cy="3834130"/>
             <wp:effectExtent l="76200" t="76200" r="128270" b="128270"/>
             <wp:docPr id="433170619" name="Imagen 2"/>
@@ -6598,7 +6623,7 @@
           <w:noProof/>
         </w:rPr>
         <w:drawing>
-          <wp:inline distT="0" distB="0" distL="0" distR="0" wp14:anchorId="322F9951" wp14:editId="465C877F">
+          <wp:inline distT="0" distB="0" distL="0" distR="0" wp14:anchorId="322F9951" wp14:editId="186CF0C9">
             <wp:extent cx="4621432" cy="3283620"/>
             <wp:effectExtent l="76200" t="76200" r="141605" b="126365"/>
             <wp:docPr id="784425407" name="Imagen 7"/>
@@ -6697,7 +6722,7 @@
           <w:noProof/>
         </w:rPr>
         <w:drawing>
-          <wp:inline distT="0" distB="0" distL="0" distR="0" wp14:anchorId="6F09FAA3" wp14:editId="6CDF1CB0">
+          <wp:inline distT="0" distB="0" distL="0" distR="0" wp14:anchorId="6F09FAA3" wp14:editId="161400BC">
             <wp:extent cx="4461002" cy="3171884"/>
             <wp:effectExtent l="76200" t="76200" r="130175" b="123825"/>
             <wp:docPr id="1755659709" name="Imagen 12"/>
@@ -6844,7 +6869,7 @@
           <w:noProof/>
         </w:rPr>
         <w:drawing>
-          <wp:inline distT="0" distB="0" distL="0" distR="0" wp14:anchorId="5534E4D8" wp14:editId="363D6882">
+          <wp:inline distT="0" distB="0" distL="0" distR="0" wp14:anchorId="5534E4D8" wp14:editId="2BDB45DD">
             <wp:extent cx="4368895" cy="3106393"/>
             <wp:effectExtent l="76200" t="76200" r="127000" b="132715"/>
             <wp:docPr id="1844187693" name="Imagen 13"/>
@@ -6932,7 +6957,7 @@
           <w:noProof/>
         </w:rPr>
         <w:drawing>
-          <wp:inline distT="0" distB="0" distL="0" distR="0" wp14:anchorId="48AE76E1" wp14:editId="0EF709BE">
+          <wp:inline distT="0" distB="0" distL="0" distR="0" wp14:anchorId="48AE76E1" wp14:editId="7C42DB12">
             <wp:extent cx="4855490" cy="3452374"/>
             <wp:effectExtent l="76200" t="76200" r="135890" b="129540"/>
             <wp:docPr id="1526789695" name="Imagen 12" descr="Interfaz de usuario gráfica, Aplicación&#10;&#10;El contenido generado por IA puede ser incorrecto."/>
@@ -7005,7 +7030,7 @@
           <w:noProof/>
         </w:rPr>
         <w:drawing>
-          <wp:inline distT="0" distB="0" distL="0" distR="0" wp14:anchorId="6794A471" wp14:editId="7C7E28FA">
+          <wp:inline distT="0" distB="0" distL="0" distR="0" wp14:anchorId="6794A471" wp14:editId="385A5385">
             <wp:extent cx="4933366" cy="3507746"/>
             <wp:effectExtent l="76200" t="76200" r="133985" b="130810"/>
             <wp:docPr id="760556303" name="Imagen 1"/>
@@ -7079,7 +7104,7 @@
           <w:noProof/>
         </w:rPr>
         <w:drawing>
-          <wp:inline distT="0" distB="0" distL="0" distR="0" wp14:anchorId="41E0CD49" wp14:editId="6AAFFCB2">
+          <wp:inline distT="0" distB="0" distL="0" distR="0" wp14:anchorId="41E0CD49" wp14:editId="72120518">
             <wp:extent cx="4989464" cy="3547635"/>
             <wp:effectExtent l="76200" t="76200" r="135255" b="129540"/>
             <wp:docPr id="272702160" name="Imagen 2"/>
@@ -7152,7 +7177,7 @@
           <w:noProof/>
         </w:rPr>
         <w:drawing>
-          <wp:inline distT="0" distB="0" distL="0" distR="0" wp14:anchorId="1DD9C742" wp14:editId="5DB45865">
+          <wp:inline distT="0" distB="0" distL="0" distR="0" wp14:anchorId="1DD9C742" wp14:editId="102B8ECD">
             <wp:extent cx="5030649" cy="3576916"/>
             <wp:effectExtent l="76200" t="76200" r="132080" b="138430"/>
             <wp:docPr id="1519085843" name="Imagen 3"/>
@@ -7231,7 +7256,7 @@
           <w:noProof/>
         </w:rPr>
         <w:drawing>
-          <wp:inline distT="0" distB="0" distL="0" distR="0" wp14:anchorId="08C08F08" wp14:editId="1911DF68">
+          <wp:inline distT="0" distB="0" distL="0" distR="0" wp14:anchorId="08C08F08" wp14:editId="50ACCC6F">
             <wp:extent cx="4873889" cy="3466106"/>
             <wp:effectExtent l="76200" t="76200" r="136525" b="134620"/>
             <wp:docPr id="1997279975" name="Imagen 1"/>
@@ -7307,7 +7332,7 @@
           <w:noProof/>
         </w:rPr>
         <w:drawing>
-          <wp:inline distT="0" distB="0" distL="0" distR="0" wp14:anchorId="68ACB7BF" wp14:editId="3D91AFCB">
+          <wp:inline distT="0" distB="0" distL="0" distR="0" wp14:anchorId="68ACB7BF" wp14:editId="33795489">
             <wp:extent cx="4862708" cy="3458154"/>
             <wp:effectExtent l="76200" t="76200" r="128905" b="142875"/>
             <wp:docPr id="1649579706" name="Imagen 2"/>
@@ -7886,6 +7911,74 @@
       </w:pPr>
       <w:r>
         <w:lastRenderedPageBreak/>
+        <w:t>Despliegue:</w:t>
+      </w:r>
+    </w:p>
+    <w:p>
+      <w:r>
+        <w:t xml:space="preserve">Utilizo la web </w:t>
+      </w:r>
+      <w:hyperlink r:id="rId40" w:history="1">
+        <w:r>
+          <w:rPr>
+            <w:rStyle w:val="Hipervnculo"/>
+          </w:rPr>
+          <w:t>https://railway.com/</w:t>
+        </w:r>
+      </w:hyperlink>
+      <w:r>
+        <w:t xml:space="preserve"> que permite desplegar con node.js </w:t>
+      </w:r>
+    </w:p>
+    <w:p>
+      <w:r>
+        <w:drawing>
+          <wp:inline distT="0" distB="0" distL="0" distR="0" wp14:anchorId="5376CD5C" wp14:editId="49B1D426">
+            <wp:extent cx="3426490" cy="2692760"/>
+            <wp:effectExtent l="0" t="0" r="2540" b="0"/>
+            <wp:docPr id="11" name="Imagen 11"/>
+            <wp:cNvGraphicFramePr>
+              <a:graphicFrameLocks xmlns:a="http://schemas.openxmlformats.org/drawingml/2006/main" noChangeAspect="1"/>
+            </wp:cNvGraphicFramePr>
+            <a:graphic xmlns:a="http://schemas.openxmlformats.org/drawingml/2006/main">
+              <a:graphicData uri="http://schemas.openxmlformats.org/drawingml/2006/picture">
+                <pic:pic xmlns:pic="http://schemas.openxmlformats.org/drawingml/2006/picture">
+                  <pic:nvPicPr>
+                    <pic:cNvPr id="1" name=""/>
+                    <pic:cNvPicPr/>
+                  </pic:nvPicPr>
+                  <pic:blipFill>
+                    <a:blip r:embed="rId41"/>
+                    <a:stretch>
+                      <a:fillRect/>
+                    </a:stretch>
+                  </pic:blipFill>
+                  <pic:spPr>
+                    <a:xfrm>
+                      <a:off x="0" y="0"/>
+                      <a:ext cx="3433423" cy="2698209"/>
+                    </a:xfrm>
+                    <a:prstGeom prst="rect">
+                      <a:avLst/>
+                    </a:prstGeom>
+                  </pic:spPr>
+                </pic:pic>
+              </a:graphicData>
+            </a:graphic>
+          </wp:inline>
+        </w:drawing>
+      </w:r>
+    </w:p>
+    <w:p>
+      <w:pPr>
+        <w:pStyle w:val="Ttulo1"/>
+      </w:pPr>
+    </w:p>
+    <w:p>
+      <w:pPr>
+        <w:pStyle w:val="Ttulo1"/>
+      </w:pPr>
+      <w:r>
         <w:t>Mejoras</w:t>
       </w:r>
       <w:r>
@@ -8100,6 +8193,7 @@
       </w:pPr>
       <w:proofErr w:type="spellStart"/>
       <w:r>
+        <w:lastRenderedPageBreak/>
         <w:t>SessionStorage</w:t>
       </w:r>
       <w:proofErr w:type="spellEnd"/>
@@ -8323,187 +8417,187 @@
         <w:pStyle w:val="Ttulo2"/>
       </w:pPr>
       <w:r>
+        <w:t>D</w:t>
+      </w:r>
+      <w:r>
+        <w:t xml:space="preserve">ocumento de </w:t>
+      </w:r>
+      <w:proofErr w:type="spellStart"/>
+      <w:r>
+        <w:t>mongoDB</w:t>
+      </w:r>
+      <w:proofErr w:type="spellEnd"/>
+      <w:r>
+        <w:t xml:space="preserve"> para </w:t>
+      </w:r>
+      <w:r>
+        <w:t>registrar</w:t>
+      </w:r>
+      <w:r>
+        <w:t xml:space="preserve"> la información.</w:t>
+      </w:r>
+      <w:r>
+        <w:t xml:space="preserve"> </w:t>
+      </w:r>
+    </w:p>
+    <w:p>
+      <w:r>
+        <w:t>Creación de nuevo</w:t>
+      </w:r>
+      <w:r>
+        <w:t xml:space="preserve"> documento de </w:t>
+      </w:r>
+      <w:proofErr w:type="spellStart"/>
+      <w:r>
+        <w:t>mongoDB</w:t>
+      </w:r>
+      <w:proofErr w:type="spellEnd"/>
+      <w:r>
+        <w:t xml:space="preserve"> </w:t>
+      </w:r>
+      <w:r>
+        <w:t xml:space="preserve">llamado </w:t>
+      </w:r>
+      <w:proofErr w:type="spellStart"/>
+      <w:r>
+        <w:t>iteraccion</w:t>
+      </w:r>
+      <w:proofErr w:type="spellEnd"/>
+      <w:r>
+        <w:t xml:space="preserve">, </w:t>
+      </w:r>
+      <w:r>
+        <w:t xml:space="preserve">relacionado con el documento </w:t>
+      </w:r>
+      <w:r>
+        <w:t>usuarios</w:t>
+      </w:r>
+      <w:r>
+        <w:t xml:space="preserve"> </w:t>
+      </w:r>
+      <w:r>
+        <w:t xml:space="preserve">mediante el campo </w:t>
+      </w:r>
+      <w:proofErr w:type="spellStart"/>
+      <w:r>
+        <w:t>perfil_afinidad</w:t>
+      </w:r>
+      <w:proofErr w:type="spellEnd"/>
+      <w:r>
+        <w:t xml:space="preserve">, </w:t>
+      </w:r>
+      <w:r>
+        <w:t>para guardar la información</w:t>
+      </w:r>
+      <w:r>
+        <w:t xml:space="preserve"> relacionada con las </w:t>
+      </w:r>
+      <w:proofErr w:type="spellStart"/>
+      <w:r>
+        <w:t>itera</w:t>
+      </w:r>
+      <w:r>
+        <w:t>cciones</w:t>
+      </w:r>
+      <w:proofErr w:type="spellEnd"/>
+      <w:r>
+        <w:t xml:space="preserve"> que el usuario realiza en la web.</w:t>
+      </w:r>
+    </w:p>
+    <w:p>
+      <w:r>
+        <w:t>La base de datos deberá guardar la información de los usuarios</w:t>
+      </w:r>
+      <w:r>
+        <w:t xml:space="preserve">. Cada vez que un usuario haga clic sobre un libro el sistema </w:t>
+      </w:r>
+      <w:r>
+        <w:t>registrará</w:t>
+      </w:r>
+      <w:r>
+        <w:t xml:space="preserve"> la id del usuario</w:t>
+      </w:r>
+      <w:r>
+        <w:t>, d</w:t>
+      </w:r>
+      <w:r>
+        <w:t>el libro y la fecha.</w:t>
+      </w:r>
+      <w:r>
+        <w:t xml:space="preserve"> También</w:t>
+      </w:r>
+      <w:r>
+        <w:t xml:space="preserve"> cuando lo agreg</w:t>
+      </w:r>
+      <w:r>
+        <w:t>ue</w:t>
+      </w:r>
+      <w:r>
+        <w:t xml:space="preserve"> a la lista de deseos y cuando lo compr</w:t>
+      </w:r>
+      <w:r>
+        <w:t>e</w:t>
+      </w:r>
+      <w:r>
+        <w:t>, puntuando cada acción</w:t>
+      </w:r>
+      <w:r>
+        <w:t xml:space="preserve"> en el documento de </w:t>
+      </w:r>
+      <w:proofErr w:type="spellStart"/>
+      <w:r>
+        <w:t>iteraccion</w:t>
+      </w:r>
+      <w:proofErr w:type="spellEnd"/>
+      <w:r>
+        <w:t>.</w:t>
+      </w:r>
+    </w:p>
+    <w:p>
+      <w:pPr>
+        <w:pStyle w:val="Ttulo3"/>
+      </w:pPr>
+      <w:r>
+        <w:t>Uso de datos obtenidos:</w:t>
+      </w:r>
+    </w:p>
+    <w:p>
+      <w:r>
+        <w:t xml:space="preserve">La vista principal muestra recomendaciones personalizadas </w:t>
+      </w:r>
+      <w:r>
+        <w:t>basándose</w:t>
+      </w:r>
+      <w:r>
+        <w:t xml:space="preserve"> en los datos obtenidos. Se analiza que libros han tenido más visitas, se cruzan con el </w:t>
+      </w:r>
+      <w:r>
+        <w:t>género</w:t>
+      </w:r>
+      <w:r>
+        <w:t xml:space="preserve"> o </w:t>
+      </w:r>
+      <w:r>
+        <w:t>los géneros</w:t>
+      </w:r>
+      <w:r>
+        <w:t xml:space="preserve"> que los usuarios han seleccionado en su perfil y muestra las recomendaciones.</w:t>
+      </w:r>
+    </w:p>
+    <w:p>
+      <w:r>
+        <w:t xml:space="preserve">Dependiendo de si el usuario esta registrado o no, </w:t>
+      </w:r>
+      <w:r>
+        <w:t>se mostraran unos carruseles de libros u otros.</w:t>
+      </w:r>
+    </w:p>
+    <w:p>
+      <w:pPr>
+        <w:pStyle w:val="Ttulo3"/>
+      </w:pPr>
+      <w:r>
         <w:lastRenderedPageBreak/>
-        <w:t>D</w:t>
-      </w:r>
-      <w:r>
-        <w:t xml:space="preserve">ocumento de </w:t>
-      </w:r>
-      <w:proofErr w:type="spellStart"/>
-      <w:r>
-        <w:t>mongoDB</w:t>
-      </w:r>
-      <w:proofErr w:type="spellEnd"/>
-      <w:r>
-        <w:t xml:space="preserve"> para </w:t>
-      </w:r>
-      <w:r>
-        <w:t>registrar</w:t>
-      </w:r>
-      <w:r>
-        <w:t xml:space="preserve"> la información.</w:t>
-      </w:r>
-      <w:r>
-        <w:t xml:space="preserve"> </w:t>
-      </w:r>
-    </w:p>
-    <w:p>
-      <w:r>
-        <w:t>Creación de nuevo</w:t>
-      </w:r>
-      <w:r>
-        <w:t xml:space="preserve"> documento de </w:t>
-      </w:r>
-      <w:proofErr w:type="spellStart"/>
-      <w:r>
-        <w:t>mongoDB</w:t>
-      </w:r>
-      <w:proofErr w:type="spellEnd"/>
-      <w:r>
-        <w:t xml:space="preserve"> </w:t>
-      </w:r>
-      <w:r>
-        <w:t xml:space="preserve">llamado </w:t>
-      </w:r>
-      <w:proofErr w:type="spellStart"/>
-      <w:r>
-        <w:t>iteraccion</w:t>
-      </w:r>
-      <w:proofErr w:type="spellEnd"/>
-      <w:r>
-        <w:t xml:space="preserve">, </w:t>
-      </w:r>
-      <w:r>
-        <w:t xml:space="preserve">relacionado con el documento </w:t>
-      </w:r>
-      <w:r>
-        <w:t>usuarios</w:t>
-      </w:r>
-      <w:r>
-        <w:t xml:space="preserve"> </w:t>
-      </w:r>
-      <w:r>
-        <w:t xml:space="preserve">mediante el campo </w:t>
-      </w:r>
-      <w:proofErr w:type="spellStart"/>
-      <w:r>
-        <w:t>perfil_afinidad</w:t>
-      </w:r>
-      <w:proofErr w:type="spellEnd"/>
-      <w:r>
-        <w:t xml:space="preserve">, </w:t>
-      </w:r>
-      <w:r>
-        <w:t>para guardar la información</w:t>
-      </w:r>
-      <w:r>
-        <w:t xml:space="preserve"> relacionada con las </w:t>
-      </w:r>
-      <w:proofErr w:type="spellStart"/>
-      <w:r>
-        <w:t>itera</w:t>
-      </w:r>
-      <w:r>
-        <w:t>cciones</w:t>
-      </w:r>
-      <w:proofErr w:type="spellEnd"/>
-      <w:r>
-        <w:t xml:space="preserve"> que el usuario realiza en la web.</w:t>
-      </w:r>
-    </w:p>
-    <w:p>
-      <w:r>
-        <w:t>La base de datos deberá guardar la información de los usuarios</w:t>
-      </w:r>
-      <w:r>
-        <w:t xml:space="preserve">. Cada vez que un usuario haga clic sobre un libro el sistema </w:t>
-      </w:r>
-      <w:r>
-        <w:t>registrará</w:t>
-      </w:r>
-      <w:r>
-        <w:t xml:space="preserve"> la id del usuario</w:t>
-      </w:r>
-      <w:r>
-        <w:t>, d</w:t>
-      </w:r>
-      <w:r>
-        <w:t>el libro y la fecha.</w:t>
-      </w:r>
-      <w:r>
-        <w:t xml:space="preserve"> También</w:t>
-      </w:r>
-      <w:r>
-        <w:t xml:space="preserve"> cuando lo agreg</w:t>
-      </w:r>
-      <w:r>
-        <w:t>ue</w:t>
-      </w:r>
-      <w:r>
-        <w:t xml:space="preserve"> a la lista de deseos y cuando lo compr</w:t>
-      </w:r>
-      <w:r>
-        <w:t>e</w:t>
-      </w:r>
-      <w:r>
-        <w:t>, puntuando cada acción</w:t>
-      </w:r>
-      <w:r>
-        <w:t xml:space="preserve"> en el documento de </w:t>
-      </w:r>
-      <w:proofErr w:type="spellStart"/>
-      <w:r>
-        <w:t>iteraccion</w:t>
-      </w:r>
-      <w:proofErr w:type="spellEnd"/>
-      <w:r>
-        <w:t>.</w:t>
-      </w:r>
-    </w:p>
-    <w:p>
-      <w:pPr>
-        <w:pStyle w:val="Ttulo3"/>
-      </w:pPr>
-      <w:r>
-        <w:t>Uso de datos obtenidos:</w:t>
-      </w:r>
-    </w:p>
-    <w:p>
-      <w:r>
-        <w:t xml:space="preserve">La vista principal muestra recomendaciones personalizadas </w:t>
-      </w:r>
-      <w:r>
-        <w:t>basándose</w:t>
-      </w:r>
-      <w:r>
-        <w:t xml:space="preserve"> en los datos obtenidos. Se analiza que libros han tenido más visitas, se cruzan con el </w:t>
-      </w:r>
-      <w:r>
-        <w:t>género</w:t>
-      </w:r>
-      <w:r>
-        <w:t xml:space="preserve"> o </w:t>
-      </w:r>
-      <w:r>
-        <w:t>los géneros</w:t>
-      </w:r>
-      <w:r>
-        <w:t xml:space="preserve"> que los usuarios han seleccionado en su perfil y muestra las recomendaciones.</w:t>
-      </w:r>
-    </w:p>
-    <w:p>
-      <w:r>
-        <w:t xml:space="preserve">Dependiendo de si el usuario esta registrado o no, </w:t>
-      </w:r>
-      <w:r>
-        <w:t>se mostraran unos carruseles de libros u otros.</w:t>
-      </w:r>
-    </w:p>
-    <w:p>
-      <w:pPr>
-        <w:pStyle w:val="Ttulo3"/>
-      </w:pPr>
-      <w:r>
         <w:t>Vistas:</w:t>
       </w:r>
     </w:p>
@@ -8870,7 +8964,23 @@
           <w:b/>
           <w:bCs/>
         </w:rPr>
-        <w:t>**Violación del Principio de Responsabilidad Única (SRP):**</w:t>
+        <w:t>**Violación del Principio de Responsabilidad Única (SRP</w:t>
+      </w:r>
+      <w:proofErr w:type="gramStart"/>
+      <w:r>
+        <w:rPr>
+          <w:b/>
+          <w:bCs/>
+        </w:rPr>
+        <w:t>):*</w:t>
+      </w:r>
+      <w:proofErr w:type="gramEnd"/>
+      <w:r>
+        <w:rPr>
+          <w:b/>
+          <w:bCs/>
+        </w:rPr>
+        <w:t>*</w:t>
       </w:r>
       <w:r>
         <w:t xml:space="preserve"> Un solo archivo manejaba el estado local, las peticiones HTTP (</w:t>
@@ -8896,7 +9006,23 @@
           <w:b/>
           <w:bCs/>
         </w:rPr>
-        <w:t>**Baja Mantenibilidad:**</w:t>
+        <w:t xml:space="preserve">**Baja </w:t>
+      </w:r>
+      <w:proofErr w:type="gramStart"/>
+      <w:r>
+        <w:rPr>
+          <w:b/>
+          <w:bCs/>
+        </w:rPr>
+        <w:t>Mantenibilidad:*</w:t>
+      </w:r>
+      <w:proofErr w:type="gramEnd"/>
+      <w:r>
+        <w:rPr>
+          <w:b/>
+          <w:bCs/>
+        </w:rPr>
+        <w:t>*</w:t>
       </w:r>
       <w:r>
         <w:t xml:space="preserve"> Archivos con cientos de líneas de código hacían que la lectura, depuración y modificación de funcionalidades específicas fuera propensa a errores.</w:t>
@@ -8914,7 +9040,23 @@
           <w:b/>
           <w:bCs/>
         </w:rPr>
-        <w:t>**Acoplamiento Fuerte:**</w:t>
+        <w:t xml:space="preserve">**Acoplamiento </w:t>
+      </w:r>
+      <w:proofErr w:type="gramStart"/>
+      <w:r>
+        <w:rPr>
+          <w:b/>
+          <w:bCs/>
+        </w:rPr>
+        <w:t>Fuerte:*</w:t>
+      </w:r>
+      <w:proofErr w:type="gramEnd"/>
+      <w:r>
+        <w:rPr>
+          <w:b/>
+          <w:bCs/>
+        </w:rPr>
+        <w:t>*</w:t>
       </w:r>
       <w:r>
         <w:t xml:space="preserve"> La lógica de obtención de datos estaba fuertemente acoplada al renderizado visual, dificultando la reutilización de la lógica en otras partes de la aplicación.</w:t>
@@ -8935,6 +9077,7 @@
         <w:t xml:space="preserve">**Dificultad para el </w:t>
       </w:r>
       <w:proofErr w:type="spellStart"/>
+      <w:proofErr w:type="gramStart"/>
       <w:r>
         <w:rPr>
           <w:b/>
@@ -8948,7 +9091,15 @@
           <w:b/>
           <w:bCs/>
         </w:rPr>
-        <w:t>:**</w:t>
+        <w:t>:*</w:t>
+      </w:r>
+      <w:proofErr w:type="gramEnd"/>
+      <w:r>
+        <w:rPr>
+          <w:b/>
+          <w:bCs/>
+        </w:rPr>
+        <w:t>*</w:t>
       </w:r>
       <w:r>
         <w:t xml:space="preserve"> Probar componentes monolíticos requiere </w:t>
@@ -9133,7 +9284,23 @@
           <w:b/>
           <w:bCs/>
         </w:rPr>
-        <w:t>**Ejemplos implementados:**</w:t>
+        <w:t xml:space="preserve">**Ejemplos </w:t>
+      </w:r>
+      <w:proofErr w:type="gramStart"/>
+      <w:r>
+        <w:rPr>
+          <w:b/>
+          <w:bCs/>
+        </w:rPr>
+        <w:t>implementados:*</w:t>
+      </w:r>
+      <w:proofErr w:type="gramEnd"/>
+      <w:r>
+        <w:rPr>
+          <w:b/>
+          <w:bCs/>
+        </w:rPr>
+        <w:t>*</w:t>
       </w:r>
       <w:r>
         <w:t xml:space="preserve"> `</w:t>
@@ -9191,7 +9358,23 @@
           <w:b/>
           <w:bCs/>
         </w:rPr>
-        <w:t>**Beneficios:**</w:t>
+        <w:t>**</w:t>
+      </w:r>
+      <w:proofErr w:type="gramStart"/>
+      <w:r>
+        <w:rPr>
+          <w:b/>
+          <w:bCs/>
+        </w:rPr>
+        <w:t>Beneficios:*</w:t>
+      </w:r>
+      <w:proofErr w:type="gramEnd"/>
+      <w:r>
+        <w:rPr>
+          <w:b/>
+          <w:bCs/>
+        </w:rPr>
+        <w:t>*</w:t>
       </w:r>
     </w:p>
     <w:p>
@@ -9217,12 +9400,21 @@
         <w:t>SoC</w:t>
       </w:r>
       <w:proofErr w:type="spellEnd"/>
-      <w:r>
-        <w:rPr>
-          <w:b/>
-          <w:bCs/>
-        </w:rPr>
-        <w:t>):**</w:t>
+      <w:proofErr w:type="gramStart"/>
+      <w:r>
+        <w:rPr>
+          <w:b/>
+          <w:bCs/>
+        </w:rPr>
+        <w:t>):*</w:t>
+      </w:r>
+      <w:proofErr w:type="gramEnd"/>
+      <w:r>
+        <w:rPr>
+          <w:b/>
+          <w:bCs/>
+        </w:rPr>
+        <w:t>*</w:t>
       </w:r>
       <w:r>
         <w:t xml:space="preserve"> Los componentes de </w:t>
@@ -9280,7 +9472,23 @@
           <w:b/>
           <w:bCs/>
         </w:rPr>
-        <w:t>**Reusabilidad de la Lógica:**</w:t>
+        <w:t xml:space="preserve">**Reusabilidad de la </w:t>
+      </w:r>
+      <w:proofErr w:type="gramStart"/>
+      <w:r>
+        <w:rPr>
+          <w:b/>
+          <w:bCs/>
+        </w:rPr>
+        <w:t>Lógica:*</w:t>
+      </w:r>
+      <w:proofErr w:type="gramEnd"/>
+      <w:r>
+        <w:rPr>
+          <w:b/>
+          <w:bCs/>
+        </w:rPr>
+        <w:t>*</w:t>
       </w:r>
       <w:r>
         <w:t xml:space="preserve"> Si en el futuro otra vista necesita la misma lógica de filtrado de editoriales, se puede importar `</w:t>
@@ -9310,6 +9518,7 @@
         <w:t>**</w:t>
       </w:r>
       <w:proofErr w:type="spellStart"/>
+      <w:proofErr w:type="gramStart"/>
       <w:r>
         <w:rPr>
           <w:b/>
@@ -9323,7 +9532,15 @@
           <w:b/>
           <w:bCs/>
         </w:rPr>
-        <w:t>:**</w:t>
+        <w:t>:*</w:t>
+      </w:r>
+      <w:proofErr w:type="gramEnd"/>
+      <w:r>
+        <w:rPr>
+          <w:b/>
+          <w:bCs/>
+        </w:rPr>
+        <w:t>*</w:t>
       </w:r>
       <w:r>
         <w:t xml:space="preserve"> Es mucho más sencillo escribir </w:t>
@@ -9417,7 +9634,23 @@
           <w:b/>
           <w:bCs/>
         </w:rPr>
-        <w:t>**Estructura anterior:**</w:t>
+        <w:t xml:space="preserve">**Estructura </w:t>
+      </w:r>
+      <w:proofErr w:type="gramStart"/>
+      <w:r>
+        <w:rPr>
+          <w:b/>
+          <w:bCs/>
+        </w:rPr>
+        <w:t>anterior:*</w:t>
+      </w:r>
+      <w:proofErr w:type="gramEnd"/>
+      <w:r>
+        <w:rPr>
+          <w:b/>
+          <w:bCs/>
+        </w:rPr>
+        <w:t>*</w:t>
       </w:r>
     </w:p>
     <w:p>
@@ -9697,7 +9930,23 @@
           <w:b/>
           <w:bCs/>
         </w:rPr>
-        <w:t>` y `Editoriales`):**</w:t>
+        <w:t>` y `Editoriales`</w:t>
+      </w:r>
+      <w:proofErr w:type="gramStart"/>
+      <w:r>
+        <w:rPr>
+          <w:b/>
+          <w:bCs/>
+        </w:rPr>
+        <w:t>):*</w:t>
+      </w:r>
+      <w:proofErr w:type="gramEnd"/>
+      <w:r>
+        <w:rPr>
+          <w:b/>
+          <w:bCs/>
+        </w:rPr>
+        <w:t>*</w:t>
       </w:r>
     </w:p>
     <w:p>
@@ -10144,7 +10393,23 @@
           <w:b/>
           <w:bCs/>
         </w:rPr>
-        <w:t>**Beneficios:**</w:t>
+        <w:t>**</w:t>
+      </w:r>
+      <w:proofErr w:type="gramStart"/>
+      <w:r>
+        <w:rPr>
+          <w:b/>
+          <w:bCs/>
+        </w:rPr>
+        <w:t>Beneficios:*</w:t>
+      </w:r>
+      <w:proofErr w:type="gramEnd"/>
+      <w:r>
+        <w:rPr>
+          <w:b/>
+          <w:bCs/>
+        </w:rPr>
+        <w:t>*</w:t>
       </w:r>
     </w:p>
     <w:p>
@@ -10159,7 +10424,23 @@
           <w:b/>
           <w:bCs/>
         </w:rPr>
-        <w:t>**Cohesión Espacial:**</w:t>
+        <w:t xml:space="preserve">**Cohesión </w:t>
+      </w:r>
+      <w:proofErr w:type="gramStart"/>
+      <w:r>
+        <w:rPr>
+          <w:b/>
+          <w:bCs/>
+        </w:rPr>
+        <w:t>Espacial:*</w:t>
+      </w:r>
+      <w:proofErr w:type="gramEnd"/>
+      <w:r>
+        <w:rPr>
+          <w:b/>
+          <w:bCs/>
+        </w:rPr>
+        <w:t>*</w:t>
       </w:r>
       <w:r>
         <w:t xml:space="preserve"> Los archivos que cambian juntos, viven juntos. Si necesitas modificar la vista de Editoriales, sabes que todo lo relacionado (excepto la lógica del </w:t>
@@ -10193,7 +10474,23 @@
           <w:b/>
           <w:bCs/>
         </w:rPr>
-        <w:t>**Limpieza del Directorio Global:**</w:t>
+        <w:t xml:space="preserve">**Limpieza del Directorio </w:t>
+      </w:r>
+      <w:proofErr w:type="gramStart"/>
+      <w:r>
+        <w:rPr>
+          <w:b/>
+          <w:bCs/>
+        </w:rPr>
+        <w:t>Global:*</w:t>
+      </w:r>
+      <w:proofErr w:type="gramEnd"/>
+      <w:r>
+        <w:rPr>
+          <w:b/>
+          <w:bCs/>
+        </w:rPr>
+        <w:t>*</w:t>
       </w:r>
       <w:r>
         <w:t xml:space="preserve"> La carpeta `</w:t>
@@ -10247,7 +10544,23 @@
           <w:b/>
           <w:bCs/>
         </w:rPr>
-        <w:t>**Centralización de Mensajes:**</w:t>
+        <w:t xml:space="preserve">**Centralización de </w:t>
+      </w:r>
+      <w:proofErr w:type="gramStart"/>
+      <w:r>
+        <w:rPr>
+          <w:b/>
+          <w:bCs/>
+        </w:rPr>
+        <w:t>Mensajes:*</w:t>
+      </w:r>
+      <w:proofErr w:type="gramEnd"/>
+      <w:r>
+        <w:rPr>
+          <w:b/>
+          <w:bCs/>
+        </w:rPr>
+        <w:t>*</w:t>
       </w:r>
       <w:r>
         <w:t xml:space="preserve"> Se crearon diccionarios de constantes (`</w:t>
@@ -10300,12 +10613,21 @@
         <w:t>useInfiniteScroll</w:t>
       </w:r>
       <w:proofErr w:type="spellEnd"/>
-      <w:r>
-        <w:rPr>
-          <w:b/>
-          <w:bCs/>
-        </w:rPr>
-        <w:t>`:**</w:t>
+      <w:proofErr w:type="gramStart"/>
+      <w:r>
+        <w:rPr>
+          <w:b/>
+          <w:bCs/>
+        </w:rPr>
+        <w:t>`:*</w:t>
+      </w:r>
+      <w:proofErr w:type="gramEnd"/>
+      <w:r>
+        <w:rPr>
+          <w:b/>
+          <w:bCs/>
+        </w:rPr>
+        <w:t>*</w:t>
       </w:r>
       <w:r>
         <w:t xml:space="preserve"> Se detectó que la lógica de paginación por </w:t>
@@ -10335,6 +10657,7 @@
         <w:t xml:space="preserve"> genérico `</w:t>
       </w:r>
       <w:proofErr w:type="spellStart"/>
+      <w:proofErr w:type="gramStart"/>
       <w:r>
         <w:t>useInfiniteScroll</w:t>
       </w:r>
@@ -10343,6 +10666,7 @@
         <w:t>(</w:t>
       </w:r>
       <w:proofErr w:type="spellStart"/>
+      <w:proofErr w:type="gramEnd"/>
       <w:r>
         <w:t>callback</w:t>
       </w:r>
@@ -10441,18 +10765,6 @@
       </w:pPr>
       <w:r>
         <w:t>MEJORAS PENDIENTES:</w:t>
-      </w:r>
-    </w:p>
-    <w:p>
-      <w:pPr>
-        <w:pStyle w:val="Prrafodelista"/>
-        <w:numPr>
-          <w:ilvl w:val="1"/>
-          <w:numId w:val="6"/>
-        </w:numPr>
-      </w:pPr>
-      <w:r>
-        <w:t>Verificar correo electrónico cuando un usuario se registra.</w:t>
       </w:r>
     </w:p>
     <w:p>
@@ -10491,7 +10803,7 @@
                     <pic:cNvPicPr/>
                   </pic:nvPicPr>
                   <pic:blipFill>
-                    <a:blip r:embed="rId40"/>
+                    <a:blip r:embed="rId42"/>
                     <a:stretch>
                       <a:fillRect/>
                     </a:stretch>
@@ -11632,12 +11944,23 @@
     </w:p>
     <w:p/>
     <w:p>
+      <w:r>
+        <w:br w:type="page"/>
+      </w:r>
+    </w:p>
+    <w:p>
+      <w:r>
+        <w:lastRenderedPageBreak/>
+        <w:br w:type="page"/>
+      </w:r>
+    </w:p>
+    <w:p>
       <w:pPr>
         <w:ind w:left="360"/>
       </w:pPr>
     </w:p>
     <w:sectPr>
-      <w:headerReference w:type="default" r:id="rId41"/>
+      <w:headerReference w:type="default" r:id="rId43"/>
       <w:pgSz w:w="11906" w:h="16838"/>
       <w:pgMar w:top="1417" w:right="1701" w:bottom="1417" w:left="1701" w:header="708" w:footer="708" w:gutter="0"/>
       <w:pgNumType w:start="0"/>

</xml_diff>

<commit_message>
Vista agegada--> Simulación de compra Vista agregada --> Favoritos Refactorizacion de controladores y rutas --> De adminRecomendaciones a paginaPrincipalController --> lo mismo con las rutas. Uso de componentes: Distinción entre los que se utilizan solo en las vistas de libro y los genericoss. -->Solo libros: Movidos a: src/features/libros/components/ --> Genericos: src/components/ Modal confirmación: Nuevo diseño. -->Implementado en casi todas las vistas para pedir confirmación.
</commit_message>
<xml_diff>
--- a/proyecto.docx
+++ b/proyecto.docx
@@ -5569,7 +5569,7 @@
           <w:noProof/>
         </w:rPr>
         <w:drawing>
-          <wp:inline distT="0" distB="0" distL="0" distR="0" wp14:anchorId="3A9F5494" wp14:editId="1FD08F89">
+          <wp:inline distT="0" distB="0" distL="0" distR="0" wp14:anchorId="3A9F5494" wp14:editId="25D1CD82">
             <wp:extent cx="4443624" cy="3161307"/>
             <wp:effectExtent l="76200" t="76200" r="128905" b="134620"/>
             <wp:docPr id="935891741" name="Imagen 1"/>
@@ -5722,7 +5722,7 @@
           <w:noProof/>
         </w:rPr>
         <w:drawing>
-          <wp:inline distT="0" distB="0" distL="0" distR="0" wp14:anchorId="6CC8F11D" wp14:editId="7FC0BAF0">
+          <wp:inline distT="0" distB="0" distL="0" distR="0" wp14:anchorId="6CC8F11D" wp14:editId="2FDBFEFC">
             <wp:extent cx="5396230" cy="3834130"/>
             <wp:effectExtent l="76200" t="76200" r="128270" b="128270"/>
             <wp:docPr id="1285130325" name="Imagen 3"/>
@@ -5878,7 +5878,7 @@
           <w:noProof/>
         </w:rPr>
         <w:drawing>
-          <wp:inline distT="0" distB="0" distL="0" distR="0" wp14:anchorId="100023D7" wp14:editId="2B9EA22F">
+          <wp:inline distT="0" distB="0" distL="0" distR="0" wp14:anchorId="100023D7" wp14:editId="3ED94294">
             <wp:extent cx="4772025" cy="3395500"/>
             <wp:effectExtent l="95250" t="95250" r="85725" b="90805"/>
             <wp:docPr id="418913" name="Imagen 8"/>
@@ -5961,7 +5961,7 @@
           <w:noProof/>
         </w:rPr>
         <w:drawing>
-          <wp:inline distT="0" distB="0" distL="0" distR="0" wp14:anchorId="252BBB8C" wp14:editId="03FD6880">
+          <wp:inline distT="0" distB="0" distL="0" distR="0" wp14:anchorId="252BBB8C" wp14:editId="38480AF6">
             <wp:extent cx="4974873" cy="3539836"/>
             <wp:effectExtent l="76200" t="76200" r="130810" b="137160"/>
             <wp:docPr id="913894690" name="Imagen 7"/>
@@ -6037,7 +6037,7 @@
           <w:noProof/>
         </w:rPr>
         <w:drawing>
-          <wp:inline distT="0" distB="0" distL="0" distR="0" wp14:anchorId="1C3A36F7" wp14:editId="7FAF5283">
+          <wp:inline distT="0" distB="0" distL="0" distR="0" wp14:anchorId="1C3A36F7" wp14:editId="49AE2180">
             <wp:extent cx="4949839" cy="3522023"/>
             <wp:effectExtent l="76200" t="76200" r="136525" b="135890"/>
             <wp:docPr id="1340598956" name="Imagen 1"/>
@@ -6550,7 +6550,7 @@
           <w:noProof/>
         </w:rPr>
         <w:drawing>
-          <wp:inline distT="0" distB="0" distL="0" distR="0" wp14:anchorId="4A834548" wp14:editId="265E033F">
+          <wp:inline distT="0" distB="0" distL="0" distR="0" wp14:anchorId="4A834548" wp14:editId="67E4A581">
             <wp:extent cx="5396230" cy="3834130"/>
             <wp:effectExtent l="76200" t="76200" r="128270" b="128270"/>
             <wp:docPr id="433170619" name="Imagen 2"/>
@@ -6623,7 +6623,7 @@
           <w:noProof/>
         </w:rPr>
         <w:drawing>
-          <wp:inline distT="0" distB="0" distL="0" distR="0" wp14:anchorId="322F9951" wp14:editId="186CF0C9">
+          <wp:inline distT="0" distB="0" distL="0" distR="0" wp14:anchorId="322F9951" wp14:editId="388BD7DA">
             <wp:extent cx="4621432" cy="3283620"/>
             <wp:effectExtent l="76200" t="76200" r="141605" b="126365"/>
             <wp:docPr id="784425407" name="Imagen 7"/>
@@ -6722,7 +6722,7 @@
           <w:noProof/>
         </w:rPr>
         <w:drawing>
-          <wp:inline distT="0" distB="0" distL="0" distR="0" wp14:anchorId="6F09FAA3" wp14:editId="161400BC">
+          <wp:inline distT="0" distB="0" distL="0" distR="0" wp14:anchorId="6F09FAA3" wp14:editId="1545F9C6">
             <wp:extent cx="4461002" cy="3171884"/>
             <wp:effectExtent l="76200" t="76200" r="130175" b="123825"/>
             <wp:docPr id="1755659709" name="Imagen 12"/>
@@ -6869,7 +6869,7 @@
           <w:noProof/>
         </w:rPr>
         <w:drawing>
-          <wp:inline distT="0" distB="0" distL="0" distR="0" wp14:anchorId="5534E4D8" wp14:editId="2BDB45DD">
+          <wp:inline distT="0" distB="0" distL="0" distR="0" wp14:anchorId="5534E4D8" wp14:editId="4DCEE578">
             <wp:extent cx="4368895" cy="3106393"/>
             <wp:effectExtent l="76200" t="76200" r="127000" b="132715"/>
             <wp:docPr id="1844187693" name="Imagen 13"/>
@@ -6957,7 +6957,7 @@
           <w:noProof/>
         </w:rPr>
         <w:drawing>
-          <wp:inline distT="0" distB="0" distL="0" distR="0" wp14:anchorId="48AE76E1" wp14:editId="7C42DB12">
+          <wp:inline distT="0" distB="0" distL="0" distR="0" wp14:anchorId="48AE76E1" wp14:editId="456BA612">
             <wp:extent cx="4855490" cy="3452374"/>
             <wp:effectExtent l="76200" t="76200" r="135890" b="129540"/>
             <wp:docPr id="1526789695" name="Imagen 12" descr="Interfaz de usuario gráfica, Aplicación&#10;&#10;El contenido generado por IA puede ser incorrecto."/>
@@ -7030,7 +7030,7 @@
           <w:noProof/>
         </w:rPr>
         <w:drawing>
-          <wp:inline distT="0" distB="0" distL="0" distR="0" wp14:anchorId="6794A471" wp14:editId="385A5385">
+          <wp:inline distT="0" distB="0" distL="0" distR="0" wp14:anchorId="6794A471" wp14:editId="50FE4360">
             <wp:extent cx="4933366" cy="3507746"/>
             <wp:effectExtent l="76200" t="76200" r="133985" b="130810"/>
             <wp:docPr id="760556303" name="Imagen 1"/>
@@ -7104,7 +7104,7 @@
           <w:noProof/>
         </w:rPr>
         <w:drawing>
-          <wp:inline distT="0" distB="0" distL="0" distR="0" wp14:anchorId="41E0CD49" wp14:editId="72120518">
+          <wp:inline distT="0" distB="0" distL="0" distR="0" wp14:anchorId="41E0CD49" wp14:editId="548D6F93">
             <wp:extent cx="4989464" cy="3547635"/>
             <wp:effectExtent l="76200" t="76200" r="135255" b="129540"/>
             <wp:docPr id="272702160" name="Imagen 2"/>
@@ -7177,7 +7177,7 @@
           <w:noProof/>
         </w:rPr>
         <w:drawing>
-          <wp:inline distT="0" distB="0" distL="0" distR="0" wp14:anchorId="1DD9C742" wp14:editId="102B8ECD">
+          <wp:inline distT="0" distB="0" distL="0" distR="0" wp14:anchorId="1DD9C742" wp14:editId="4F824B3E">
             <wp:extent cx="5030649" cy="3576916"/>
             <wp:effectExtent l="76200" t="76200" r="132080" b="138430"/>
             <wp:docPr id="1519085843" name="Imagen 3"/>
@@ -7256,7 +7256,7 @@
           <w:noProof/>
         </w:rPr>
         <w:drawing>
-          <wp:inline distT="0" distB="0" distL="0" distR="0" wp14:anchorId="08C08F08" wp14:editId="50ACCC6F">
+          <wp:inline distT="0" distB="0" distL="0" distR="0" wp14:anchorId="08C08F08" wp14:editId="0462707E">
             <wp:extent cx="4873889" cy="3466106"/>
             <wp:effectExtent l="76200" t="76200" r="136525" b="134620"/>
             <wp:docPr id="1997279975" name="Imagen 1"/>
@@ -7332,7 +7332,7 @@
           <w:noProof/>
         </w:rPr>
         <w:drawing>
-          <wp:inline distT="0" distB="0" distL="0" distR="0" wp14:anchorId="68ACB7BF" wp14:editId="33795489">
+          <wp:inline distT="0" distB="0" distL="0" distR="0" wp14:anchorId="68ACB7BF" wp14:editId="61D35B4C">
             <wp:extent cx="4862708" cy="3458154"/>
             <wp:effectExtent l="76200" t="76200" r="128905" b="142875"/>
             <wp:docPr id="1649579706" name="Imagen 2"/>
@@ -7916,7 +7916,7 @@
     </w:p>
     <w:p>
       <w:r>
-        <w:t xml:space="preserve">Utilizo la web </w:t>
+        <w:t xml:space="preserve">Dado que el servicio de hosting facilitado por el centro no ofrecía en su plan básico la posibilidad de desplegar en él un proyecto con tecnología node.js, he recorrido a la web </w:t>
       </w:r>
       <w:hyperlink r:id="rId40" w:history="1">
         <w:r>
@@ -7927,11 +7927,50 @@
         </w:r>
       </w:hyperlink>
       <w:r>
-        <w:t xml:space="preserve"> que permite desplegar con node.js </w:t>
-      </w:r>
-    </w:p>
-    <w:p>
-      <w:r>
+        <w:t>.</w:t>
+      </w:r>
+    </w:p>
+    <w:p/>
+    <w:p>
+      <w:pPr>
+        <w:pStyle w:val="Ttulo4"/>
+      </w:pPr>
+      <w:proofErr w:type="spellStart"/>
+      <w:r>
+        <w:t>C</w:t>
+      </w:r>
+      <w:r>
+        <w:t>loudinary</w:t>
+      </w:r>
+      <w:proofErr w:type="spellEnd"/>
+      <w:r>
+        <w:t>:</w:t>
+      </w:r>
+    </w:p>
+    <w:p>
+      <w:r>
+        <w:t xml:space="preserve">Utilizo la API de </w:t>
+      </w:r>
+      <w:proofErr w:type="spellStart"/>
+      <w:r>
+        <w:rPr>
+          <w:highlight w:val="yellow"/>
+        </w:rPr>
+        <w:t>Cloudinary</w:t>
+      </w:r>
+      <w:proofErr w:type="spellEnd"/>
+      <w:r>
+        <w:t xml:space="preserve"> para subir las imágenes de las portadas de los libros a la web.</w:t>
+      </w:r>
+    </w:p>
+    <w:p/>
+    <w:p/>
+    <w:p/>
+    <w:p>
+      <w:r>
+        <w:rPr>
+          <w:noProof/>
+        </w:rPr>
         <w:drawing>
           <wp:inline distT="0" distB="0" distL="0" distR="0" wp14:anchorId="5376CD5C" wp14:editId="49B1D426">
             <wp:extent cx="3426490" cy="2692760"/>
@@ -8003,29 +8042,25 @@
       <w:r>
         <w:t>.</w:t>
       </w:r>
-    </w:p>
-    <w:p>
-      <w:r>
-        <w:t xml:space="preserve">En </w:t>
-      </w:r>
-      <w:proofErr w:type="spellStart"/>
-      <w:r>
-        <w:t>el</w:t>
-      </w:r>
-      <w:proofErr w:type="spellEnd"/>
-      <w:r>
-        <w:t xml:space="preserve"> </w:t>
-      </w:r>
-      <w:r>
-        <w:t xml:space="preserve">los archivos </w:t>
-      </w:r>
-      <w:proofErr w:type="spellStart"/>
-      <w:r>
-        <w:t>librosCRUD</w:t>
-      </w:r>
-      <w:proofErr w:type="spellEnd"/>
-      <w:r>
-        <w:t xml:space="preserve"> he añadido</w:t>
+      <w:r>
+        <w:t xml:space="preserve"> Para un proyecto pequeño esto no tiene demasiada utilidad, pero pensando de cara al futuro lo considero una mejora importante.</w:t>
+      </w:r>
+    </w:p>
+    <w:p>
+      <w:pPr>
+        <w:pStyle w:val="Ttulo3"/>
+      </w:pPr>
+      <w:r>
+        <w:lastRenderedPageBreak/>
+        <w:t>¿Cómo lo he implementado?</w:t>
+      </w:r>
+    </w:p>
+    <w:p>
+      <w:r>
+        <w:t>H</w:t>
+      </w:r>
+      <w:r>
+        <w:t>e añadido</w:t>
       </w:r>
       <w:r>
         <w:t xml:space="preserve"> </w:t>
@@ -8106,10 +8141,61 @@
         <w:t>:</w:t>
       </w:r>
     </w:p>
-    <w:bookmarkEnd w:id="0"/>
-    <w:p>
+    <w:p>
+      <w:r>
+        <w:t xml:space="preserve">No caí en la necesidad de utilizarlo hasta que recordé el uso de </w:t>
+      </w:r>
       <w:proofErr w:type="spellStart"/>
       <w:r>
+        <w:t>sessions</w:t>
+      </w:r>
+      <w:proofErr w:type="spellEnd"/>
+      <w:r>
+        <w:t xml:space="preserve"> y </w:t>
+      </w:r>
+      <w:proofErr w:type="spellStart"/>
+      <w:r>
+        <w:t>cokies</w:t>
+      </w:r>
+      <w:proofErr w:type="spellEnd"/>
+      <w:r>
+        <w:t xml:space="preserve"> para guardar sesiones temporales (</w:t>
+      </w:r>
+      <w:proofErr w:type="spellStart"/>
+      <w:r>
+        <w:t>sessions</w:t>
+      </w:r>
+      <w:proofErr w:type="spellEnd"/>
+      <w:r>
+        <w:t>) y guardar datos en el navegador (</w:t>
+      </w:r>
+      <w:proofErr w:type="spellStart"/>
+      <w:r>
+        <w:t>cokies</w:t>
+      </w:r>
+      <w:proofErr w:type="spellEnd"/>
+      <w:r>
+        <w:t>).</w:t>
+      </w:r>
+    </w:p>
+    <w:p>
+      <w:r>
+        <w:t xml:space="preserve">Dado que utilizo node.js y </w:t>
+      </w:r>
+      <w:proofErr w:type="spellStart"/>
+      <w:r>
+        <w:t>react</w:t>
+      </w:r>
+      <w:proofErr w:type="spellEnd"/>
+      <w:r>
+        <w:t xml:space="preserve"> </w:t>
+      </w:r>
+      <w:bookmarkEnd w:id="0"/>
+      <w:r>
+        <w:t xml:space="preserve">tuve que recurrir a </w:t>
+      </w:r>
+      <w:proofErr w:type="spellStart"/>
+      <w:r>
         <w:t>LocalStorage</w:t>
       </w:r>
       <w:proofErr w:type="spellEnd"/>
@@ -8122,13 +8208,16 @@
       </w:r>
       <w:proofErr w:type="spellEnd"/>
       <w:r>
+        <w:t>, que</w:t>
+      </w:r>
+      <w:r>
         <w:t xml:space="preserve"> </w:t>
       </w:r>
       <w:r>
-        <w:t xml:space="preserve">son las herramientas de Web Storage </w:t>
-      </w:r>
-      <w:r>
-        <w:t xml:space="preserve">con la que gestiono </w:t>
+        <w:t>son herramientas de Web Storage</w:t>
+      </w:r>
+      <w:r>
+        <w:t xml:space="preserve">, para gestionar </w:t>
       </w:r>
       <w:r>
         <w:t>la persistencia del usuario</w:t>
@@ -8138,894 +8227,530 @@
       </w:r>
     </w:p>
     <w:p>
-      <w:pPr>
-        <w:pStyle w:val="Prrafodelista"/>
-        <w:numPr>
-          <w:ilvl w:val="0"/>
-          <w:numId w:val="11"/>
-        </w:numPr>
-      </w:pPr>
-      <w:proofErr w:type="spellStart"/>
-      <w:r>
-        <w:t>LocaleStorage</w:t>
-      </w:r>
-      <w:proofErr w:type="spellEnd"/>
-      <w:r>
-        <w:t xml:space="preserve">: Cundo el usuario quiere recordar la sesión sus datos se guardan utilizando </w:t>
-      </w:r>
-      <w:proofErr w:type="spellStart"/>
-      <w:r>
-        <w:t>localeStorage</w:t>
-      </w:r>
-      <w:proofErr w:type="spellEnd"/>
-      <w:r>
-        <w:t xml:space="preserve">. Al utilizar </w:t>
-      </w:r>
-      <w:proofErr w:type="spellStart"/>
-      <w:r>
-        <w:t>localeStorage</w:t>
-      </w:r>
-      <w:proofErr w:type="spellEnd"/>
-      <w:r>
-        <w:t xml:space="preserve"> la sesión se </w:t>
-      </w:r>
-      <w:proofErr w:type="spellStart"/>
-      <w:r>
-        <w:t>almacen</w:t>
-      </w:r>
-      <w:proofErr w:type="spellEnd"/>
-      <w:r>
-        <w:t xml:space="preserve"> en el disco.</w:t>
-      </w:r>
-    </w:p>
-    <w:p>
-      <w:pPr>
-        <w:pStyle w:val="Prrafodelista"/>
-      </w:pPr>
-    </w:p>
-    <w:p>
-      <w:pPr>
-        <w:pStyle w:val="Prrafodelista"/>
-        <w:numPr>
-          <w:ilvl w:val="0"/>
-          <w:numId w:val="11"/>
-        </w:numPr>
-      </w:pPr>
-      <w:proofErr w:type="spellStart"/>
-      <w:r>
-        <w:lastRenderedPageBreak/>
-        <w:t>SessionStorage</w:t>
-      </w:r>
-      <w:proofErr w:type="spellEnd"/>
-      <w:r>
-        <w:t xml:space="preserve">: Cuando el usuario </w:t>
+      <w:r>
+        <w:t>E</w:t>
+      </w:r>
+      <w:r>
+        <w:t xml:space="preserve">l tiempo de validez real de la sesión lo determina el </w:t>
       </w:r>
       <w:r>
         <w:rPr>
           <w:b/>
           <w:bCs/>
         </w:rPr>
-        <w:t>no</w:t>
-      </w:r>
-      <w:r>
-        <w:t xml:space="preserve"> marca la opción de recordar sesión, sus datos de inicio de sesión se guardan con </w:t>
+        <w:t>Token JWT</w:t>
+      </w:r>
+      <w:r>
+        <w:t xml:space="preserve"> </w:t>
+      </w:r>
+      <w:r>
+        <w:t xml:space="preserve">que genera </w:t>
+      </w:r>
+      <w:r>
+        <w:t>el servidor, que actúa como un pase con fecha de caducidad."</w:t>
+      </w:r>
+      <w:r>
+        <w:t xml:space="preserve"> Esto significa </w:t>
+      </w:r>
+      <w:proofErr w:type="gramStart"/>
+      <w:r>
+        <w:t>que</w:t>
+      </w:r>
+      <w:proofErr w:type="gramEnd"/>
+      <w:r>
+        <w:t xml:space="preserve"> aunque un usuario seleccioné la opción recordar sesión, pasados X días (los configurados en el servidor) el servidor rechazara el token guardado en el navegador del usuario y lo obligará a volver a iniciar sesión.</w:t>
+      </w:r>
+    </w:p>
+    <w:p>
+      <w:pPr>
+        <w:pStyle w:val="Ttulo2"/>
+      </w:pPr>
+      <w:bookmarkStart w:id="1" w:name="_Sistema_de_recomendaciones"/>
+      <w:bookmarkEnd w:id="1"/>
+      <w:r>
+        <w:t>Sistema de recomendaciones</w:t>
+      </w:r>
+    </w:p>
+    <w:p>
+      <w:r>
+        <w:t>El sistema recopila</w:t>
+      </w:r>
+      <w:r>
+        <w:t>:</w:t>
+      </w:r>
+    </w:p>
+    <w:p>
+      <w:r>
+        <w:t>L</w:t>
+      </w:r>
+      <w:r>
+        <w:t>as visitas que un usuario realiza a un determinado libro.</w:t>
+      </w:r>
+    </w:p>
+    <w:p>
+      <w:r>
+        <w:t>Los libros que guarda en la lista de deseos</w:t>
+      </w:r>
+      <w:r>
+        <w:t>.</w:t>
+      </w:r>
+    </w:p>
+    <w:p>
+      <w:r>
+        <w:t>Los libros que añade al carrito de la compra.</w:t>
+      </w:r>
+    </w:p>
+    <w:p>
+      <w:r>
+        <w:t xml:space="preserve">Si el usuario esta registrado, coteja esta información con los gustos literarios definidos en el perfil y cruza los datos para mostrar libros de interés en la </w:t>
       </w:r>
       <w:proofErr w:type="spellStart"/>
       <w:r>
-        <w:t>sesionStorage</w:t>
+        <w:t>pagina</w:t>
       </w:r>
       <w:proofErr w:type="spellEnd"/>
       <w:r>
-        <w:t>. Esto hace que cuando el usuario cierra la pestaña o el navegador, la sesión de usuario se cierre.</w:t>
-      </w:r>
-    </w:p>
-    <w:p>
-      <w:r>
-        <w:t xml:space="preserve">Pese al uso de </w:t>
+        <w:t xml:space="preserve"> principal.</w:t>
+      </w:r>
+    </w:p>
+    <w:p>
+      <w:pPr>
+        <w:pStyle w:val="Ttulo3"/>
+      </w:pPr>
+      <w:r>
+        <w:t>Uso de datos obtenidos:</w:t>
+      </w:r>
+    </w:p>
+    <w:p>
+      <w:r>
+        <w:t>La vista principal muestra recomendaciones personalizadas basándose en los datos obtenidos. Se analiza que libros han tenido más visitas, se cruzan con el género o los géneros que los usuarios han seleccionado en su perfil y muestra las recomendaciones.</w:t>
+      </w:r>
+    </w:p>
+    <w:p>
+      <w:r>
+        <w:t>Dependiendo de si el usuario esta registrado o no, se mostraran unos carruseles de libros u otros.</w:t>
+      </w:r>
+    </w:p>
+    <w:p>
+      <w:pPr>
+        <w:pStyle w:val="Ttulo4"/>
+      </w:pPr>
+      <w:r>
+        <w:lastRenderedPageBreak/>
+        <w:t xml:space="preserve">1. </w:t>
+      </w:r>
+      <w:r>
+        <w:t>P</w:t>
+      </w:r>
+      <w:r>
+        <w:t>ara usuarios no registrados:</w:t>
+      </w:r>
+    </w:p>
+    <w:p>
+      <w:r>
+        <w:t>De base, la página principal muestra:</w:t>
+      </w:r>
+    </w:p>
+    <w:p>
+      <w:r>
+        <w:rPr>
+          <w:highlight w:val="yellow"/>
+        </w:rPr>
+        <w:t>¿Qué tres categorías muestra?</w:t>
+      </w:r>
+    </w:p>
+    <w:p>
+      <w:pPr>
+        <w:rPr>
+          <w:strike/>
+        </w:rPr>
+      </w:pPr>
+      <w:r>
+        <w:rPr>
+          <w:strike/>
+        </w:rPr>
+        <w:t>Top Ventas Global Novedades, Tendencias de la semana (</w:t>
       </w:r>
       <w:proofErr w:type="spellStart"/>
       <w:r>
-        <w:t>l</w:t>
-      </w:r>
-      <w:r>
-        <w:t>ocalStorage</w:t>
+        <w:rPr>
+          <w:strike/>
+        </w:rPr>
+        <w:t>Trending</w:t>
       </w:r>
       <w:proofErr w:type="spellEnd"/>
       <w:r>
-        <w:t xml:space="preserve"> y </w:t>
+        <w:rPr>
+          <w:strike/>
+        </w:rPr>
+        <w:t>), Autores del Momento y Autores Emergentes.</w:t>
+      </w:r>
+    </w:p>
+    <w:p>
+      <w:pPr>
+        <w:pStyle w:val="Ttulo4"/>
+      </w:pPr>
+      <w:r>
+        <w:t xml:space="preserve">2. </w:t>
+      </w:r>
+      <w:r>
+        <w:t>P</w:t>
+      </w:r>
+      <w:r>
+        <w:t>ara usuarios registrados:</w:t>
+      </w:r>
+    </w:p>
+    <w:p>
+      <w:r>
+        <w:t>Porque leíste</w:t>
+      </w:r>
+      <w:r>
+        <w:t xml:space="preserve"> [</w:t>
       </w:r>
       <w:proofErr w:type="spellStart"/>
       <w:r>
-        <w:t>sesionStorage</w:t>
+        <w:t>titulo</w:t>
       </w:r>
       <w:proofErr w:type="spellEnd"/>
       <w:r>
-        <w:t xml:space="preserve">, </w:t>
-      </w:r>
-      <w:r>
-        <w:t xml:space="preserve">el tiempo de validez real de la sesión lo determina el </w:t>
+        <w:t xml:space="preserve"> de libro],</w:t>
+      </w:r>
+      <w:r>
+        <w:t xml:space="preserve"> </w:t>
+      </w:r>
+      <w:r>
+        <w:t>Tus géneros favoritos</w:t>
+      </w:r>
+      <w:r>
+        <w:t>, tus autores favoritos…</w:t>
+      </w:r>
+    </w:p>
+    <w:p/>
+    <w:p>
+      <w:pPr>
+        <w:pStyle w:val="Ttulo2"/>
+      </w:pPr>
+      <w:r>
+        <w:t xml:space="preserve">Refactorización de código </w:t>
+      </w:r>
+    </w:p>
+    <w:p>
+      <w:pPr>
+        <w:pStyle w:val="Ttulo3"/>
+      </w:pPr>
+      <w:proofErr w:type="spellStart"/>
+      <w:r>
+        <w:t>Frontend</w:t>
+      </w:r>
+      <w:proofErr w:type="spellEnd"/>
+    </w:p>
+    <w:p>
+      <w:r>
+        <w:t xml:space="preserve">Siguiendo el diseño </w:t>
       </w:r>
       <w:r>
         <w:rPr>
           <w:b/>
           <w:bCs/>
         </w:rPr>
-        <w:t>Token JWT</w:t>
-      </w:r>
-      <w:r>
-        <w:t xml:space="preserve"> </w:t>
-      </w:r>
-      <w:r>
-        <w:t xml:space="preserve">que genera </w:t>
-      </w:r>
-      <w:r>
-        <w:t>el servidor, que actúa como un pase con fecha de caducidad."</w:t>
-      </w:r>
-    </w:p>
-    <w:p>
-      <w:pPr>
-        <w:pStyle w:val="Ttulo2"/>
-      </w:pPr>
-      <w:r>
-        <w:t>Sistema de recomendaciones</w:t>
-      </w:r>
-    </w:p>
-    <w:p>
-      <w:r>
-        <w:t>Dependiendo de si el usuario esta registrado o no</w:t>
+        <w:t>modelo</w:t>
       </w:r>
       <w:r>
         <w:t xml:space="preserve">, </w:t>
       </w:r>
-      <w:r>
-        <w:t>se hacen</w:t>
-      </w:r>
-      <w:r>
-        <w:t xml:space="preserve"> dos distinciones </w:t>
-      </w:r>
-      <w:r>
-        <w:t xml:space="preserve">en la </w:t>
-      </w:r>
-      <w:r>
-        <w:t>vista</w:t>
-      </w:r>
-      <w:r>
-        <w:t xml:space="preserve"> </w:t>
-      </w:r>
-      <w:r>
-        <w:t>principal</w:t>
-      </w:r>
-      <w:r>
-        <w:t xml:space="preserve">: </w:t>
-      </w:r>
-    </w:p>
-    <w:p>
-      <w:pPr>
-        <w:pStyle w:val="Ttulo3"/>
-      </w:pPr>
-      <w:r>
-        <w:t xml:space="preserve">1. </w:t>
-      </w:r>
-      <w:r>
-        <w:t>P</w:t>
-      </w:r>
-      <w:r>
-        <w:t>ara usuarios no registrados:</w:t>
-      </w:r>
-    </w:p>
-    <w:p>
-      <w:r>
-        <w:t>Top Ventas Global</w:t>
-      </w:r>
-      <w:r>
-        <w:t xml:space="preserve"> Novedades</w:t>
-      </w:r>
-      <w:r>
-        <w:t>,</w:t>
-      </w:r>
-      <w:r>
-        <w:t xml:space="preserve"> Tendencias de la semana (</w:t>
-      </w:r>
-      <w:proofErr w:type="spellStart"/>
-      <w:r>
-        <w:t>Trending</w:t>
-      </w:r>
-      <w:proofErr w:type="spellEnd"/>
-      <w:r>
-        <w:t>)</w:t>
-      </w:r>
-      <w:r>
-        <w:t>,</w:t>
-      </w:r>
-      <w:r>
-        <w:t xml:space="preserve"> Autores del Momento</w:t>
-      </w:r>
-      <w:r>
-        <w:t xml:space="preserve"> y </w:t>
-      </w:r>
-      <w:r>
-        <w:t>Autores Emergentes</w:t>
-      </w:r>
-      <w:r>
-        <w:t>.</w:t>
-      </w:r>
-    </w:p>
-    <w:p>
-      <w:pPr>
-        <w:pStyle w:val="Ttulo3"/>
-      </w:pPr>
-      <w:r>
-        <w:t xml:space="preserve">2. </w:t>
-      </w:r>
-      <w:r>
-        <w:t>V</w:t>
-      </w:r>
-      <w:r>
-        <w:t>ista inicial para usuarios registrados:</w:t>
-      </w:r>
-    </w:p>
-    <w:p>
-      <w:r>
-        <w:t>El sistema recopila</w:t>
-      </w:r>
-      <w:r>
-        <w:t xml:space="preserve"> </w:t>
-      </w:r>
-      <w:proofErr w:type="spellStart"/>
-      <w:r>
-        <w:t>informacion</w:t>
-      </w:r>
-      <w:proofErr w:type="spellEnd"/>
-      <w:r>
-        <w:t xml:space="preserve"> sobre los usuarios para utilizarla con fines de marketing</w:t>
-      </w:r>
-      <w:r>
-        <w:t>. A parte de alguna de las filas del primer punto</w:t>
-      </w:r>
-      <w:r>
-        <w:t>, en la vista,</w:t>
-      </w:r>
-      <w:r>
-        <w:t xml:space="preserve"> se añadirían: </w:t>
-      </w:r>
-      <w:r>
-        <w:t>Porque leíste</w:t>
-      </w:r>
-      <w:r>
-        <w:t xml:space="preserve"> [</w:t>
-      </w:r>
-      <w:proofErr w:type="spellStart"/>
-      <w:r>
-        <w:t>titulo</w:t>
-      </w:r>
-      <w:proofErr w:type="spellEnd"/>
-      <w:r>
-        <w:t xml:space="preserve"> de libro],</w:t>
-      </w:r>
-      <w:r>
-        <w:t xml:space="preserve"> </w:t>
-      </w:r>
-      <w:r>
-        <w:t>Tus géneros favoritos</w:t>
-      </w:r>
-      <w:r>
-        <w:t>, tus autores favoritos…</w:t>
-      </w:r>
-    </w:p>
-    <w:p>
-      <w:pPr>
-        <w:pStyle w:val="Ttulo2"/>
-      </w:pPr>
-      <w:r>
-        <w:t>D</w:t>
-      </w:r>
-      <w:r>
-        <w:t xml:space="preserve">ocumento de </w:t>
-      </w:r>
-      <w:proofErr w:type="spellStart"/>
-      <w:r>
-        <w:t>mongoDB</w:t>
-      </w:r>
-      <w:proofErr w:type="spellEnd"/>
-      <w:r>
-        <w:t xml:space="preserve"> para </w:t>
-      </w:r>
-      <w:r>
-        <w:t>registrar</w:t>
-      </w:r>
-      <w:r>
-        <w:t xml:space="preserve"> la información.</w:t>
-      </w:r>
-      <w:r>
-        <w:t xml:space="preserve"> </w:t>
-      </w:r>
-    </w:p>
-    <w:p>
-      <w:r>
-        <w:t>Creación de nuevo</w:t>
-      </w:r>
-      <w:r>
-        <w:t xml:space="preserve"> documento de </w:t>
-      </w:r>
-      <w:proofErr w:type="spellStart"/>
-      <w:r>
-        <w:t>mongoDB</w:t>
-      </w:r>
-      <w:proofErr w:type="spellEnd"/>
-      <w:r>
-        <w:t xml:space="preserve"> </w:t>
-      </w:r>
-      <w:r>
-        <w:t xml:space="preserve">llamado </w:t>
-      </w:r>
-      <w:proofErr w:type="spellStart"/>
-      <w:r>
-        <w:t>iteraccion</w:t>
-      </w:r>
-      <w:proofErr w:type="spellEnd"/>
-      <w:r>
-        <w:t xml:space="preserve">, </w:t>
-      </w:r>
-      <w:r>
-        <w:t xml:space="preserve">relacionado con el documento </w:t>
-      </w:r>
-      <w:r>
-        <w:t>usuarios</w:t>
-      </w:r>
-      <w:r>
-        <w:t xml:space="preserve"> </w:t>
-      </w:r>
-      <w:r>
-        <w:t xml:space="preserve">mediante el campo </w:t>
-      </w:r>
-      <w:proofErr w:type="spellStart"/>
-      <w:r>
-        <w:t>perfil_afinidad</w:t>
-      </w:r>
-      <w:proofErr w:type="spellEnd"/>
-      <w:r>
-        <w:t xml:space="preserve">, </w:t>
-      </w:r>
-      <w:r>
-        <w:t>para guardar la información</w:t>
-      </w:r>
-      <w:r>
-        <w:t xml:space="preserve"> relacionada con las </w:t>
-      </w:r>
-      <w:proofErr w:type="spellStart"/>
-      <w:r>
-        <w:t>itera</w:t>
-      </w:r>
-      <w:r>
-        <w:t>cciones</w:t>
-      </w:r>
-      <w:proofErr w:type="spellEnd"/>
-      <w:r>
-        <w:t xml:space="preserve"> que el usuario realiza en la web.</w:t>
-      </w:r>
-    </w:p>
-    <w:p>
-      <w:r>
-        <w:t>La base de datos deberá guardar la información de los usuarios</w:t>
-      </w:r>
-      <w:r>
-        <w:t xml:space="preserve">. Cada vez que un usuario haga clic sobre un libro el sistema </w:t>
-      </w:r>
-      <w:r>
-        <w:t>registrará</w:t>
-      </w:r>
-      <w:r>
-        <w:t xml:space="preserve"> la id del usuario</w:t>
-      </w:r>
-      <w:r>
-        <w:t>, d</w:t>
-      </w:r>
-      <w:r>
-        <w:t>el libro y la fecha.</w:t>
-      </w:r>
-      <w:r>
-        <w:t xml:space="preserve"> También</w:t>
-      </w:r>
-      <w:r>
-        <w:t xml:space="preserve"> cuando lo agreg</w:t>
-      </w:r>
-      <w:r>
-        <w:t>ue</w:t>
-      </w:r>
-      <w:r>
-        <w:t xml:space="preserve"> a la lista de deseos y cuando lo compr</w:t>
-      </w:r>
-      <w:r>
-        <w:t>e</w:t>
-      </w:r>
-      <w:r>
-        <w:t>, puntuando cada acción</w:t>
-      </w:r>
-      <w:r>
-        <w:t xml:space="preserve"> en el documento de </w:t>
-      </w:r>
-      <w:proofErr w:type="spellStart"/>
-      <w:r>
-        <w:t>iteraccion</w:t>
-      </w:r>
-      <w:proofErr w:type="spellEnd"/>
-      <w:r>
-        <w:t>.</w:t>
-      </w:r>
-    </w:p>
-    <w:p>
-      <w:pPr>
-        <w:pStyle w:val="Ttulo3"/>
-      </w:pPr>
-      <w:r>
-        <w:t>Uso de datos obtenidos:</w:t>
-      </w:r>
-    </w:p>
-    <w:p>
-      <w:r>
-        <w:t xml:space="preserve">La vista principal muestra recomendaciones personalizadas </w:t>
-      </w:r>
-      <w:r>
-        <w:t>basándose</w:t>
-      </w:r>
-      <w:r>
-        <w:t xml:space="preserve"> en los datos obtenidos. Se analiza que libros han tenido más visitas, se cruzan con el </w:t>
-      </w:r>
-      <w:r>
-        <w:t>género</w:t>
-      </w:r>
-      <w:r>
-        <w:t xml:space="preserve"> o </w:t>
-      </w:r>
-      <w:r>
-        <w:t>los géneros</w:t>
-      </w:r>
-      <w:r>
-        <w:t xml:space="preserve"> que los usuarios han seleccionado en su perfil y muestra las recomendaciones.</w:t>
-      </w:r>
-    </w:p>
-    <w:p>
-      <w:r>
-        <w:t xml:space="preserve">Dependiendo de si el usuario esta registrado o no, </w:t>
-      </w:r>
-      <w:r>
-        <w:t>se mostraran unos carruseles de libros u otros.</w:t>
-      </w:r>
-    </w:p>
-    <w:p>
-      <w:pPr>
-        <w:pStyle w:val="Ttulo3"/>
-      </w:pPr>
-      <w:r>
-        <w:lastRenderedPageBreak/>
-        <w:t>Vistas:</w:t>
-      </w:r>
-    </w:p>
-    <w:p>
-      <w:pPr>
-        <w:pStyle w:val="Ttulo4"/>
-      </w:pPr>
-      <w:r>
-        <w:t>1. Vista inicial para usuarios no registrados:</w:t>
-      </w:r>
-    </w:p>
-    <w:p>
-      <w:pPr>
-        <w:numPr>
-          <w:ilvl w:val="0"/>
-          <w:numId w:val="16"/>
-        </w:numPr>
-      </w:pPr>
       <w:r>
         <w:rPr>
           <w:b/>
           <w:bCs/>
         </w:rPr>
-        <w:t>Top Ventas Global:</w:t>
-      </w:r>
-      <w:r>
-        <w:t xml:space="preserve"> Los 15 libros más vendidos de la historia de la tienda (o del último mes).</w:t>
-      </w:r>
-    </w:p>
-    <w:p>
-      <w:pPr>
-        <w:numPr>
-          <w:ilvl w:val="0"/>
-          <w:numId w:val="16"/>
-        </w:numPr>
-      </w:pPr>
+        <w:t>vista</w:t>
+      </w:r>
+      <w:r>
+        <w:t xml:space="preserve">, </w:t>
+      </w:r>
       <w:r>
         <w:rPr>
           <w:b/>
           <w:bCs/>
         </w:rPr>
-        <w:t>Novedades:</w:t>
-      </w:r>
-      <w:r>
-        <w:t xml:space="preserve"> Los últimos libros añadidos a la plataforma.</w:t>
-      </w:r>
-    </w:p>
-    <w:p>
-      <w:pPr>
-        <w:numPr>
-          <w:ilvl w:val="0"/>
-          <w:numId w:val="16"/>
-        </w:numPr>
-      </w:pPr>
+        <w:t>controlador</w:t>
+      </w:r>
       <w:r>
         <w:rPr>
           <w:b/>
           <w:bCs/>
         </w:rPr>
-        <w:t>Tendencias de la semana (</w:t>
-      </w:r>
+        <w:t xml:space="preserve">, </w:t>
+      </w:r>
+      <w:r>
+        <w:t>t</w:t>
+      </w:r>
+      <w:r>
+        <w:t>odas las vistas del proyecto</w:t>
+      </w:r>
+      <w:r>
+        <w:t xml:space="preserve"> </w:t>
+      </w:r>
+      <w:r>
+        <w:t>han sido reestructuradas y divididas en</w:t>
+      </w:r>
+      <w:r>
+        <w:t xml:space="preserve"> carpetas</w:t>
+      </w:r>
+      <w:r>
+        <w:t>, donde he extraído y separado el código en archivos para facilitar su lectura y mantenimiento.</w:t>
+      </w:r>
+      <w:r>
+        <w:t xml:space="preserve"> </w:t>
+      </w:r>
+    </w:p>
+    <w:p>
+      <w:pPr>
+        <w:pStyle w:val="Ttulo3"/>
+      </w:pPr>
       <w:proofErr w:type="spellStart"/>
+      <w:r>
+        <w:t>Bakend</w:t>
+      </w:r>
+      <w:proofErr w:type="spellEnd"/>
+    </w:p>
+    <w:p>
+      <w:r>
+        <w:t xml:space="preserve">Como en el </w:t>
+      </w:r>
+      <w:proofErr w:type="spellStart"/>
+      <w:r>
+        <w:t>frontend</w:t>
+      </w:r>
+      <w:proofErr w:type="spellEnd"/>
+      <w:r>
+        <w:t xml:space="preserve">, el </w:t>
+      </w:r>
+      <w:proofErr w:type="spellStart"/>
+      <w:r>
+        <w:t>bakend</w:t>
+      </w:r>
+      <w:proofErr w:type="spellEnd"/>
+      <w:r>
+        <w:t xml:space="preserve"> también sigue el diseño de la arquitectura </w:t>
+      </w:r>
       <w:r>
         <w:rPr>
           <w:b/>
           <w:bCs/>
         </w:rPr>
-        <w:t>Trending</w:t>
-      </w:r>
-      <w:proofErr w:type="spellEnd"/>
+        <w:t>modelo</w:t>
+      </w:r>
+      <w:r>
+        <w:t xml:space="preserve">, </w:t>
+      </w:r>
       <w:r>
         <w:rPr>
           <w:b/>
           <w:bCs/>
-        </w:rPr>
-        <w:t>):</w:t>
+          <w:strike/>
+        </w:rPr>
+        <w:t>vista</w:t>
+      </w:r>
+      <w:r>
+        <w:rPr>
+          <w:strike/>
+        </w:rPr>
+        <w:t>,</w:t>
+      </w:r>
+      <w:r>
+        <w:t xml:space="preserve"> </w:t>
       </w:r>
       <w:r>
         <w:rPr>
           <w:b/>
           <w:bCs/>
         </w:rPr>
-        <w:t xml:space="preserve"> </w:t>
-      </w:r>
-      <w:r>
-        <w:t>Muestra q</w:t>
-      </w:r>
-      <w:r>
-        <w:t xml:space="preserve">ué libros están recibiendo más clics </w:t>
-      </w:r>
-      <w:r>
-        <w:t>a lo largo de la</w:t>
-      </w:r>
-      <w:r>
-        <w:t xml:space="preserve"> semana, aunque no se hayan vendido aún</w:t>
-      </w:r>
-      <w:r>
-        <w:t>.</w:t>
-      </w:r>
-      <w:r>
-        <w:t xml:space="preserve"> Esto es ideal para generar curiosidad.</w:t>
-      </w:r>
-    </w:p>
-    <w:p>
-      <w:pPr>
-        <w:numPr>
-          <w:ilvl w:val="0"/>
-          <w:numId w:val="16"/>
-        </w:numPr>
-      </w:pPr>
+        <w:t>controlador</w:t>
+      </w:r>
       <w:r>
         <w:rPr>
           <w:b/>
           <w:bCs/>
         </w:rPr>
-        <w:t>Autores del Momento:</w:t>
-      </w:r>
-      <w:r>
-        <w:t xml:space="preserve"> </w:t>
-      </w:r>
-      <w:r>
-        <w:t>L</w:t>
-      </w:r>
-      <w:r>
-        <w:t>os autores que más volumen de ventas (o de visitas) han generado en los últimos 30 días.</w:t>
-      </w:r>
-    </w:p>
-    <w:p>
-      <w:pPr>
-        <w:numPr>
-          <w:ilvl w:val="0"/>
-          <w:numId w:val="16"/>
-        </w:numPr>
-      </w:pPr>
+        <w:t xml:space="preserve">. </w:t>
+      </w:r>
+      <w:r>
+        <w:t>Solo que no hay</w:t>
+      </w:r>
       <w:r>
         <w:rPr>
           <w:b/>
           <w:bCs/>
         </w:rPr>
-        <w:t>Autores Emergentes:</w:t>
-      </w:r>
-      <w:r>
-        <w:t xml:space="preserve"> </w:t>
-      </w:r>
-      <w:r>
-        <w:t xml:space="preserve">Autores </w:t>
-      </w:r>
-      <w:r>
-        <w:t>que tienen un crecimiento rápido (</w:t>
-      </w:r>
-      <w:r>
-        <w:t>ratio de conversión alto</w:t>
-      </w:r>
-      <w:r>
-        <w:t xml:space="preserve">: </w:t>
-      </w:r>
-      <w:r>
-        <w:t>mucha gente que ve su libro, lo acaba comprando.</w:t>
-      </w:r>
-    </w:p>
-    <w:p>
-      <w:pPr>
-        <w:pStyle w:val="Ttulo4"/>
-      </w:pPr>
-      <w:r>
-        <w:t>2. Vista inicial para usuarios registrados:</w:t>
-      </w:r>
-    </w:p>
-    <w:p>
-      <w:r>
-        <w:t>A parte de las “</w:t>
-      </w:r>
-      <w:proofErr w:type="spellStart"/>
-      <w:r>
-        <w:t>estanterias</w:t>
-      </w:r>
-      <w:proofErr w:type="spellEnd"/>
-      <w:r>
-        <w:t>” anteriores, mostraría:</w:t>
-      </w:r>
-    </w:p>
-    <w:p>
-      <w:pPr>
-        <w:numPr>
-          <w:ilvl w:val="0"/>
-          <w:numId w:val="16"/>
-        </w:numPr>
-      </w:pPr>
+        <w:t xml:space="preserve"> vista. </w:t>
+      </w:r>
+      <w:r>
+        <w:t>Los archivos están divididos principalmente en</w:t>
+      </w:r>
       <w:r>
         <w:rPr>
           <w:b/>
           <w:bCs/>
         </w:rPr>
-        <w:t>Porque leíste [</w:t>
-      </w:r>
-      <w:proofErr w:type="spellStart"/>
+        <w:t xml:space="preserve"> </w:t>
+      </w:r>
       <w:r>
         <w:rPr>
           <w:b/>
           <w:bCs/>
         </w:rPr>
-        <w:t>titulo</w:t>
-      </w:r>
-      <w:proofErr w:type="spellEnd"/>
+        <w:t>modelo, ruta</w:t>
+      </w:r>
       <w:r>
         <w:rPr>
           <w:b/>
           <w:bCs/>
         </w:rPr>
-        <w:t xml:space="preserve"> de libro]</w:t>
+        <w:t xml:space="preserve"> y</w:t>
       </w:r>
       <w:r>
         <w:rPr>
           <w:b/>
           <w:bCs/>
         </w:rPr>
-        <w:t xml:space="preserve">: </w:t>
-      </w:r>
-      <w:proofErr w:type="spellStart"/>
-      <w:r>
-        <w:t>Mostraria</w:t>
-      </w:r>
-      <w:proofErr w:type="spellEnd"/>
-      <w:r>
-        <w:t xml:space="preserve"> más libros de ese autor y de su </w:t>
-      </w:r>
-      <w:proofErr w:type="spellStart"/>
-      <w:r>
-        <w:t>categoria</w:t>
-      </w:r>
-      <w:proofErr w:type="spellEnd"/>
-      <w:r>
-        <w:t>.</w:t>
-      </w:r>
-    </w:p>
-    <w:p>
-      <w:pPr>
-        <w:numPr>
-          <w:ilvl w:val="0"/>
-          <w:numId w:val="16"/>
-        </w:numPr>
-      </w:pPr>
+        <w:t xml:space="preserve"> controlado</w:t>
+      </w:r>
       <w:r>
         <w:rPr>
           <w:b/>
           <w:bCs/>
         </w:rPr>
-        <w:t>Porque te gusta [</w:t>
-      </w:r>
-      <w:proofErr w:type="spellStart"/>
+        <w:t xml:space="preserve">r. </w:t>
+      </w:r>
+      <w:r>
+        <w:t>Cada carpeta</w:t>
+      </w:r>
       <w:r>
         <w:rPr>
           <w:b/>
           <w:bCs/>
         </w:rPr>
-        <w:t>genero</w:t>
-      </w:r>
-      <w:proofErr w:type="spellEnd"/>
+        <w:t xml:space="preserve"> </w:t>
+      </w:r>
+      <w:r>
+        <w:t>contine sus propios archivos</w:t>
+      </w:r>
+      <w:r>
+        <w:t xml:space="preserve">, que a su vez se encargan de gestionar distintas partes del código. </w:t>
+      </w:r>
+    </w:p>
+    <w:p>
+      <w:pPr>
+        <w:pStyle w:val="Ttulo2"/>
+      </w:pPr>
+      <w:r>
+        <w:t>Constantes para definir el texto</w:t>
+      </w:r>
+    </w:p>
+    <w:p>
+      <w:r>
+        <w:t xml:space="preserve">En el proyecto utilizo archivos donde he definido el texto que muestran las distintas vistas. </w:t>
+      </w:r>
+    </w:p>
+    <w:p>
+      <w:pPr>
+        <w:pStyle w:val="Ttulo1"/>
+      </w:pPr>
+      <w:r>
+        <w:t>Cambios realizados</w:t>
+      </w:r>
+    </w:p>
+    <w:p>
+      <w:pPr>
+        <w:pStyle w:val="Ttulo2"/>
+      </w:pPr>
+      <w:r>
+        <w:t>Vistas</w:t>
+      </w:r>
+    </w:p>
+    <w:p>
       <w:r>
         <w:rPr>
           <w:b/>
           <w:bCs/>
         </w:rPr>
-        <w:t xml:space="preserve"> literario]:</w:t>
-      </w:r>
-      <w:r>
-        <w:t xml:space="preserve"> Mostraría libros de un </w:t>
-      </w:r>
-      <w:proofErr w:type="spellStart"/>
-      <w:r>
-        <w:t>genero</w:t>
-      </w:r>
-      <w:proofErr w:type="spellEnd"/>
-      <w:r>
-        <w:t xml:space="preserve"> concreto</w:t>
-      </w:r>
+        <w:t>Página de inicio</w:t>
+      </w:r>
+      <w:r>
+        <w:t xml:space="preserve">: Muestra diversos carruseles de libros en tendencia. Se basa en el </w:t>
+      </w:r>
+      <w:hyperlink w:anchor="_Sistema_de_recomendaciones" w:history="1">
+        <w:r>
+          <w:rPr>
+            <w:rStyle w:val="Hipervnculo"/>
+          </w:rPr>
+          <w:t>sistema de recomendaciones</w:t>
+        </w:r>
+      </w:hyperlink>
       <w:r>
         <w:t>.</w:t>
       </w:r>
     </w:p>
     <w:p>
-      <w:r>
-        <w:br w:type="page"/>
-      </w:r>
-    </w:p>
-    <w:p>
-      <w:pPr>
-        <w:ind w:left="360"/>
-      </w:pPr>
       <w:r>
         <w:rPr>
           <w:b/>
           <w:bCs/>
         </w:rPr>
-        <w:lastRenderedPageBreak/>
-        <w:t>## 1. El Problema Original: Componentes Monolíticos</w:t>
-      </w:r>
-    </w:p>
-    <w:p>
-      <w:pPr>
-        <w:ind w:left="360"/>
-      </w:pPr>
-      <w:r>
-        <w:t>A medida que la aplicación creció, los componentes principales de las vistas (como `</w:t>
-      </w:r>
-      <w:proofErr w:type="spellStart"/>
-      <w:r>
-        <w:t>AdminLibros.jsx</w:t>
-      </w:r>
-      <w:proofErr w:type="spellEnd"/>
-      <w:r>
-        <w:t>`, `</w:t>
-      </w:r>
-      <w:proofErr w:type="spellStart"/>
-      <w:r>
-        <w:t>DetalleLibro.jsx</w:t>
-      </w:r>
-      <w:proofErr w:type="spellEnd"/>
-      <w:r>
-        <w:t>`, `</w:t>
-      </w:r>
-      <w:proofErr w:type="spellStart"/>
-      <w:r>
-        <w:t>EditarPerfil.jsx</w:t>
-      </w:r>
-      <w:proofErr w:type="spellEnd"/>
-      <w:r>
-        <w:t>`, `</w:t>
-      </w:r>
-      <w:proofErr w:type="spellStart"/>
-      <w:r>
-        <w:t>Editoriales.jsx</w:t>
-      </w:r>
-      <w:proofErr w:type="spellEnd"/>
-      <w:r>
-        <w:t>`) se convirtieron en "</w:t>
-      </w:r>
-      <w:proofErr w:type="spellStart"/>
-      <w:r>
-        <w:t>God</w:t>
-      </w:r>
-      <w:proofErr w:type="spellEnd"/>
-      <w:r>
-        <w:t xml:space="preserve"> </w:t>
-      </w:r>
-      <w:proofErr w:type="spellStart"/>
-      <w:r>
-        <w:t>Components</w:t>
-      </w:r>
-      <w:proofErr w:type="spellEnd"/>
-      <w:r>
-        <w:t>" (Componentes Dios). Estos archivos presentaban los siguientes problemas:</w:t>
-      </w:r>
-    </w:p>
-    <w:p>
-      <w:pPr>
-        <w:ind w:left="360"/>
-      </w:pPr>
-      <w:r>
-        <w:t xml:space="preserve">*   </w:t>
-      </w:r>
+        <w:t>Pestaña libros</w:t>
+      </w:r>
+      <w:r>
+        <w:t>: Nueva pestaña que muestra todos los libros de la web. Esta era la antigua página de inicio.</w:t>
+      </w:r>
+    </w:p>
+    <w:p>
       <w:r>
         <w:rPr>
           <w:b/>
           <w:bCs/>
         </w:rPr>
-        <w:t>**Violación del Principio de Responsabilidad Única (SRP</w:t>
-      </w:r>
-      <w:proofErr w:type="gramStart"/>
+        <w:t>C</w:t>
+      </w:r>
       <w:r>
         <w:rPr>
           <w:b/>
           <w:bCs/>
         </w:rPr>
-        <w:t>):*</w:t>
-      </w:r>
-      <w:proofErr w:type="gramEnd"/>
+        <w:t>ategorías, editoriales y autores</w:t>
+      </w:r>
       <w:r>
         <w:rPr>
           <w:b/>
           <w:bCs/>
         </w:rPr>
-        <w:t>*</w:t>
-      </w:r>
-      <w:r>
-        <w:t xml:space="preserve"> Un solo archivo manejaba el estado local, las peticiones HTTP (</w:t>
-      </w:r>
-      <w:proofErr w:type="spellStart"/>
-      <w:r>
-        <w:t>axios</w:t>
-      </w:r>
-      <w:proofErr w:type="spellEnd"/>
-      <w:r>
-        <w:t>), la lógica de negocio (filtrado, paginación) y el renderizado de múltiples secciones complejas de la interfaz de usuario.</w:t>
-      </w:r>
+        <w:t xml:space="preserve">: </w:t>
+      </w:r>
+      <w:r>
+        <w:t xml:space="preserve">He otorgado a estas vistas un diseño </w:t>
+      </w:r>
+      <w:r>
+        <w:t>bastante más complejo que al resto de las vistas. Lamentablemente no he sabido distribuir el tiempo adecuadamente, y no he sido capaz de ofrecer el mismo diseño en el resto de vistas.</w:t>
+      </w:r>
+    </w:p>
+    <w:p>
+      <w:r>
+        <w:lastRenderedPageBreak/>
+        <w:br w:type="page"/>
+      </w:r>
+    </w:p>
+    <w:p/>
+    <w:p>
+      <w:pPr>
+        <w:pStyle w:val="Ttulo2"/>
+      </w:pPr>
     </w:p>
     <w:p>
       <w:pPr>
         <w:ind w:left="360"/>
       </w:pPr>
       <w:r>
-        <w:t xml:space="preserve">*   </w:t>
-      </w:r>
-      <w:r>
-        <w:rPr>
-          <w:b/>
-          <w:bCs/>
-        </w:rPr>
-        <w:t xml:space="preserve">**Baja </w:t>
-      </w:r>
-      <w:proofErr w:type="gramStart"/>
-      <w:r>
-        <w:rPr>
-          <w:b/>
-          <w:bCs/>
-        </w:rPr>
-        <w:t>Mantenibilidad:*</w:t>
-      </w:r>
-      <w:proofErr w:type="gramEnd"/>
-      <w:r>
-        <w:rPr>
-          <w:b/>
-          <w:bCs/>
-        </w:rPr>
-        <w:t>*</w:t>
-      </w:r>
-      <w:r>
-        <w:t xml:space="preserve"> Archivos con cientos de líneas de código hacían que la lectura, depuración y modificación de funcionalidades específicas fuera propensa a errores.</w:t>
+        <w:t>MEJORAS PENDIENTES:</w:t>
       </w:r>
     </w:p>
     <w:p>
@@ -9033,1765 +8758,14 @@
         <w:ind w:left="360"/>
       </w:pPr>
       <w:r>
-        <w:t xml:space="preserve">*   </w:t>
-      </w:r>
-      <w:r>
-        <w:rPr>
-          <w:b/>
-          <w:bCs/>
-        </w:rPr>
-        <w:t xml:space="preserve">**Acoplamiento </w:t>
-      </w:r>
-      <w:proofErr w:type="gramStart"/>
-      <w:r>
-        <w:rPr>
-          <w:b/>
-          <w:bCs/>
-        </w:rPr>
-        <w:t>Fuerte:*</w:t>
-      </w:r>
-      <w:proofErr w:type="gramEnd"/>
-      <w:r>
-        <w:rPr>
-          <w:b/>
-          <w:bCs/>
-        </w:rPr>
-        <w:t>*</w:t>
-      </w:r>
-      <w:r>
-        <w:t xml:space="preserve"> La lógica de obtención de datos estaba fuertemente acoplada al renderizado visual, dificultando la reutilización de la lógica en otras partes de la aplicación.</w:t>
-      </w:r>
-    </w:p>
-    <w:p>
-      <w:pPr>
-        <w:ind w:left="360"/>
-      </w:pPr>
-      <w:r>
-        <w:t xml:space="preserve">*   </w:t>
-      </w:r>
-      <w:r>
-        <w:rPr>
-          <w:b/>
-          <w:bCs/>
-        </w:rPr>
-        <w:t xml:space="preserve">**Dificultad para el </w:t>
-      </w:r>
-      <w:proofErr w:type="spellStart"/>
-      <w:proofErr w:type="gramStart"/>
-      <w:r>
-        <w:rPr>
-          <w:b/>
-          <w:bCs/>
-        </w:rPr>
-        <w:t>Testing</w:t>
-      </w:r>
-      <w:proofErr w:type="spellEnd"/>
-      <w:r>
-        <w:rPr>
-          <w:b/>
-          <w:bCs/>
-        </w:rPr>
-        <w:t>:*</w:t>
-      </w:r>
-      <w:proofErr w:type="gramEnd"/>
-      <w:r>
-        <w:rPr>
-          <w:b/>
-          <w:bCs/>
-        </w:rPr>
-        <w:t>*</w:t>
-      </w:r>
-      <w:r>
-        <w:t xml:space="preserve"> Probar componentes monolíticos requiere </w:t>
-      </w:r>
-      <w:proofErr w:type="spellStart"/>
-      <w:r>
-        <w:t>mockear</w:t>
-      </w:r>
-      <w:proofErr w:type="spellEnd"/>
-      <w:r>
-        <w:t xml:space="preserve"> una gran cantidad de dependencias y estados internos, lo que hace que los </w:t>
-      </w:r>
-      <w:proofErr w:type="spellStart"/>
-      <w:r>
-        <w:t>tests</w:t>
-      </w:r>
-      <w:proofErr w:type="spellEnd"/>
-      <w:r>
-        <w:t xml:space="preserve"> sean frágiles y complejos de escribir.</w:t>
-      </w:r>
-    </w:p>
-    <w:p>
-      <w:pPr>
-        <w:ind w:left="360"/>
-      </w:pPr>
-      <w:r>
-        <w:rPr>
-          <w:b/>
-          <w:bCs/>
-        </w:rPr>
-        <w:t xml:space="preserve">## 2. La Solución: Arquitectura Basada en Páginas y </w:t>
-      </w:r>
-      <w:proofErr w:type="spellStart"/>
-      <w:r>
-        <w:rPr>
-          <w:b/>
-          <w:bCs/>
-        </w:rPr>
-        <w:t>Custom</w:t>
-      </w:r>
-      <w:proofErr w:type="spellEnd"/>
-      <w:r>
-        <w:rPr>
-          <w:b/>
-          <w:bCs/>
-        </w:rPr>
-        <w:t xml:space="preserve"> </w:t>
-      </w:r>
-      <w:proofErr w:type="spellStart"/>
-      <w:r>
-        <w:rPr>
-          <w:b/>
-          <w:bCs/>
-        </w:rPr>
-        <w:t>Hooks</w:t>
-      </w:r>
-      <w:proofErr w:type="spellEnd"/>
-    </w:p>
-    <w:p>
-      <w:pPr>
-        <w:ind w:left="360"/>
-      </w:pPr>
-      <w:r>
-        <w:t>Para resolver estos problemas, se adoptó una arquitectura más escalable y modular, basada en dos pilares fundamentales:</w:t>
-      </w:r>
-    </w:p>
-    <w:p>
-      <w:pPr>
-        <w:ind w:left="360"/>
-      </w:pPr>
-      <w:r>
-        <w:rPr>
-          <w:b/>
-          <w:bCs/>
-        </w:rPr>
-        <w:t xml:space="preserve">### A. Extracción de Lógica a </w:t>
-      </w:r>
-      <w:proofErr w:type="spellStart"/>
-      <w:r>
-        <w:rPr>
-          <w:b/>
-          <w:bCs/>
-        </w:rPr>
-        <w:t>Custom</w:t>
-      </w:r>
-      <w:proofErr w:type="spellEnd"/>
-      <w:r>
-        <w:rPr>
-          <w:b/>
-          <w:bCs/>
-        </w:rPr>
-        <w:t xml:space="preserve"> </w:t>
-      </w:r>
-      <w:proofErr w:type="spellStart"/>
-      <w:r>
-        <w:rPr>
-          <w:b/>
-          <w:bCs/>
-        </w:rPr>
-        <w:t>Hooks</w:t>
-      </w:r>
-      <w:proofErr w:type="spellEnd"/>
-      <w:r>
-        <w:rPr>
-          <w:b/>
-          <w:bCs/>
-        </w:rPr>
-        <w:t xml:space="preserve"> (Patrón </w:t>
-      </w:r>
-      <w:r>
-        <w:rPr>
-          <w:i/>
-          <w:iCs/>
-        </w:rPr>
-        <w:t>*Container/</w:t>
-      </w:r>
-      <w:proofErr w:type="spellStart"/>
-      <w:r>
-        <w:rPr>
-          <w:i/>
-          <w:iCs/>
-        </w:rPr>
-        <w:t>Presenter</w:t>
-      </w:r>
-      <w:proofErr w:type="spellEnd"/>
-      <w:r>
-        <w:rPr>
-          <w:i/>
-          <w:iCs/>
-        </w:rPr>
-        <w:t>*</w:t>
-      </w:r>
-      <w:r>
-        <w:rPr>
-          <w:b/>
-          <w:bCs/>
-        </w:rPr>
-        <w:t xml:space="preserve"> Moderno)</w:t>
-      </w:r>
-    </w:p>
-    <w:p>
-      <w:pPr>
-        <w:ind w:left="360"/>
-      </w:pPr>
-      <w:r>
-        <w:t xml:space="preserve">Se separó la lógica de negocio y el manejo de estado de la capa de presentación utilizando </w:t>
-      </w:r>
-      <w:proofErr w:type="spellStart"/>
-      <w:r>
-        <w:t>Custom</w:t>
-      </w:r>
-      <w:proofErr w:type="spellEnd"/>
-      <w:r>
-        <w:t xml:space="preserve"> </w:t>
-      </w:r>
-      <w:proofErr w:type="spellStart"/>
-      <w:r>
-        <w:t>Hooks</w:t>
-      </w:r>
-      <w:proofErr w:type="spellEnd"/>
-      <w:r>
-        <w:t xml:space="preserve"> de </w:t>
-      </w:r>
-      <w:proofErr w:type="spellStart"/>
-      <w:r>
-        <w:t>React</w:t>
-      </w:r>
-      <w:proofErr w:type="spellEnd"/>
-      <w:r>
-        <w:t>.</w:t>
-      </w:r>
-    </w:p>
-    <w:p>
-      <w:pPr>
-        <w:ind w:left="360"/>
-      </w:pPr>
-      <w:r>
-        <w:t xml:space="preserve">*   </w:t>
-      </w:r>
-      <w:r>
-        <w:rPr>
-          <w:b/>
-          <w:bCs/>
-        </w:rPr>
-        <w:t xml:space="preserve">**Ejemplos </w:t>
-      </w:r>
-      <w:proofErr w:type="gramStart"/>
-      <w:r>
-        <w:rPr>
-          <w:b/>
-          <w:bCs/>
-        </w:rPr>
-        <w:t>implementados:*</w:t>
-      </w:r>
-      <w:proofErr w:type="gramEnd"/>
-      <w:r>
-        <w:rPr>
-          <w:b/>
-          <w:bCs/>
-        </w:rPr>
-        <w:t>*</w:t>
-      </w:r>
-      <w:r>
-        <w:t xml:space="preserve"> `</w:t>
-      </w:r>
-      <w:proofErr w:type="spellStart"/>
-      <w:r>
-        <w:t>useDetalleLibro</w:t>
-      </w:r>
-      <w:proofErr w:type="spellEnd"/>
-      <w:r>
-        <w:t>`, `</w:t>
-      </w:r>
-      <w:proofErr w:type="spellStart"/>
-      <w:r>
-        <w:t>useAdminLibros</w:t>
-      </w:r>
-      <w:proofErr w:type="spellEnd"/>
-      <w:r>
-        <w:t>`, `</w:t>
-      </w:r>
-      <w:proofErr w:type="spellStart"/>
-      <w:r>
-        <w:t>useAdminUsuarios</w:t>
-      </w:r>
-      <w:proofErr w:type="spellEnd"/>
-      <w:r>
-        <w:t>`, `</w:t>
-      </w:r>
-      <w:proofErr w:type="spellStart"/>
-      <w:r>
-        <w:t>useEditoriales</w:t>
-      </w:r>
-      <w:proofErr w:type="spellEnd"/>
-      <w:r>
-        <w:t>`, `</w:t>
-      </w:r>
-      <w:proofErr w:type="spellStart"/>
-      <w:r>
-        <w:t>useEditarPerfil</w:t>
-      </w:r>
-      <w:proofErr w:type="spellEnd"/>
-      <w:r>
-        <w:t>`.</w:t>
-      </w:r>
-    </w:p>
-    <w:p>
-      <w:pPr>
-        <w:ind w:left="360"/>
-      </w:pPr>
-      <w:r>
-        <w:t xml:space="preserve">*   </w:t>
-      </w:r>
-      <w:r>
-        <w:rPr>
-          <w:b/>
-          <w:bCs/>
-        </w:rPr>
-        <w:t>**</w:t>
-      </w:r>
-      <w:proofErr w:type="gramStart"/>
-      <w:r>
-        <w:rPr>
-          <w:b/>
-          <w:bCs/>
-        </w:rPr>
-        <w:t>Beneficios:*</w:t>
-      </w:r>
-      <w:proofErr w:type="gramEnd"/>
-      <w:r>
-        <w:rPr>
-          <w:b/>
-          <w:bCs/>
-        </w:rPr>
-        <w:t>*</w:t>
-      </w:r>
-    </w:p>
-    <w:p>
-      <w:pPr>
-        <w:ind w:left="360"/>
-      </w:pPr>
-      <w:r>
-        <w:t xml:space="preserve">    *   </w:t>
-      </w:r>
-      <w:r>
-        <w:rPr>
-          <w:b/>
-          <w:bCs/>
-        </w:rPr>
-        <w:t>**Separación de Preocupaciones (</w:t>
-      </w:r>
-      <w:proofErr w:type="spellStart"/>
-      <w:r>
-        <w:rPr>
-          <w:b/>
-          <w:bCs/>
-        </w:rPr>
-        <w:t>SoC</w:t>
-      </w:r>
-      <w:proofErr w:type="spellEnd"/>
-      <w:proofErr w:type="gramStart"/>
-      <w:r>
-        <w:rPr>
-          <w:b/>
-          <w:bCs/>
-        </w:rPr>
-        <w:t>):*</w:t>
-      </w:r>
-      <w:proofErr w:type="gramEnd"/>
-      <w:r>
-        <w:rPr>
-          <w:b/>
-          <w:bCs/>
-        </w:rPr>
-        <w:t>*</w:t>
-      </w:r>
-      <w:r>
-        <w:t xml:space="preserve"> Los componentes de </w:t>
-      </w:r>
-      <w:proofErr w:type="spellStart"/>
-      <w:r>
-        <w:t>React</w:t>
-      </w:r>
-      <w:proofErr w:type="spellEnd"/>
-      <w:r>
-        <w:t xml:space="preserve"> ahora son "tontos" (</w:t>
-      </w:r>
-      <w:proofErr w:type="spellStart"/>
-      <w:r>
-        <w:t>dumb</w:t>
-      </w:r>
-      <w:proofErr w:type="spellEnd"/>
-      <w:r>
-        <w:t xml:space="preserve"> </w:t>
-      </w:r>
-      <w:proofErr w:type="spellStart"/>
-      <w:r>
-        <w:t>components</w:t>
-      </w:r>
-      <w:proofErr w:type="spellEnd"/>
-      <w:r>
-        <w:t>); se limitan a recibir datos (</w:t>
-      </w:r>
-      <w:proofErr w:type="spellStart"/>
-      <w:r>
-        <w:t>props</w:t>
-      </w:r>
-      <w:proofErr w:type="spellEnd"/>
-      <w:r>
-        <w:t xml:space="preserve">) y renderizar la UI. El </w:t>
-      </w:r>
-      <w:proofErr w:type="spellStart"/>
-      <w:r>
-        <w:t>hook</w:t>
-      </w:r>
-      <w:proofErr w:type="spellEnd"/>
-      <w:r>
-        <w:t xml:space="preserve"> actúa como el "cerebro" que provee esos datos y las funciones para modificarlos.</w:t>
-      </w:r>
-    </w:p>
-    <w:p>
-      <w:pPr>
-        <w:ind w:left="360"/>
-      </w:pPr>
-      <w:r>
-        <w:t xml:space="preserve">    *   </w:t>
-      </w:r>
-      <w:r>
-        <w:rPr>
-          <w:b/>
-          <w:bCs/>
-        </w:rPr>
-        <w:t xml:space="preserve">**Reusabilidad de la </w:t>
-      </w:r>
-      <w:proofErr w:type="gramStart"/>
-      <w:r>
-        <w:rPr>
-          <w:b/>
-          <w:bCs/>
-        </w:rPr>
-        <w:t>Lógica:*</w:t>
-      </w:r>
-      <w:proofErr w:type="gramEnd"/>
-      <w:r>
-        <w:rPr>
-          <w:b/>
-          <w:bCs/>
-        </w:rPr>
-        <w:t>*</w:t>
-      </w:r>
-      <w:r>
-        <w:t xml:space="preserve"> Si en el futuro otra vista necesita la misma lógica de filtrado de editoriales, se puede importar `</w:t>
-      </w:r>
-      <w:proofErr w:type="spellStart"/>
-      <w:r>
-        <w:t>useEditoriales</w:t>
-      </w:r>
-      <w:proofErr w:type="spellEnd"/>
-      <w:r>
-        <w:t>` sin importar su UI.</w:t>
-      </w:r>
-    </w:p>
-    <w:p>
-      <w:pPr>
-        <w:ind w:left="360"/>
-      </w:pPr>
-      <w:r>
-        <w:lastRenderedPageBreak/>
-        <w:t xml:space="preserve">    *   </w:t>
-      </w:r>
-      <w:r>
-        <w:rPr>
-          <w:b/>
-          <w:bCs/>
-        </w:rPr>
-        <w:t>**</w:t>
-      </w:r>
-      <w:proofErr w:type="spellStart"/>
-      <w:proofErr w:type="gramStart"/>
-      <w:r>
-        <w:rPr>
-          <w:b/>
-          <w:bCs/>
-        </w:rPr>
-        <w:t>Testabilidad</w:t>
-      </w:r>
-      <w:proofErr w:type="spellEnd"/>
-      <w:r>
-        <w:rPr>
-          <w:b/>
-          <w:bCs/>
-        </w:rPr>
-        <w:t>:*</w:t>
-      </w:r>
-      <w:proofErr w:type="gramEnd"/>
-      <w:r>
-        <w:rPr>
-          <w:b/>
-          <w:bCs/>
-        </w:rPr>
-        <w:t>*</w:t>
-      </w:r>
-      <w:r>
-        <w:t xml:space="preserve"> Es mucho más sencillo escribir </w:t>
-      </w:r>
-      <w:proofErr w:type="spellStart"/>
-      <w:r>
-        <w:t>tests</w:t>
-      </w:r>
-      <w:proofErr w:type="spellEnd"/>
-      <w:r>
-        <w:t xml:space="preserve"> unitarios para un </w:t>
-      </w:r>
-      <w:proofErr w:type="spellStart"/>
-      <w:r>
-        <w:t>hook</w:t>
-      </w:r>
-      <w:proofErr w:type="spellEnd"/>
-      <w:r>
-        <w:t xml:space="preserve"> puro (que retorna datos y funciones) que para un componente de UI complejo.</w:t>
-      </w:r>
-    </w:p>
-    <w:p>
-      <w:pPr>
-        <w:ind w:left="360"/>
-      </w:pPr>
-      <w:r>
-        <w:rPr>
-          <w:b/>
-          <w:bCs/>
-        </w:rPr>
-        <w:t>### B. Estructura de Carpetas Basada en Páginas (Page-</w:t>
-      </w:r>
-      <w:proofErr w:type="spellStart"/>
-      <w:r>
-        <w:rPr>
-          <w:b/>
-          <w:bCs/>
-        </w:rPr>
-        <w:t>Based</w:t>
-      </w:r>
-      <w:proofErr w:type="spellEnd"/>
-      <w:r>
-        <w:rPr>
-          <w:b/>
-          <w:bCs/>
-        </w:rPr>
-        <w:t xml:space="preserve"> </w:t>
-      </w:r>
-      <w:proofErr w:type="spellStart"/>
-      <w:r>
-        <w:rPr>
-          <w:b/>
-          <w:bCs/>
-        </w:rPr>
-        <w:t>Structure</w:t>
-      </w:r>
-      <w:proofErr w:type="spellEnd"/>
-      <w:r>
-        <w:rPr>
-          <w:b/>
-          <w:bCs/>
-        </w:rPr>
-        <w:t>)</w:t>
-      </w:r>
-    </w:p>
-    <w:p>
-      <w:pPr>
-        <w:ind w:left="360"/>
-      </w:pPr>
-      <w:r>
-        <w:t>En lugar de tener una carpeta global `</w:t>
-      </w:r>
-      <w:proofErr w:type="spellStart"/>
-      <w:r>
-        <w:t>components</w:t>
-      </w:r>
-      <w:proofErr w:type="spellEnd"/>
-      <w:r>
-        <w:t>/` saturada con subcomponentes específicos de una sola vista, se adoptó una estructura donde cada página compleja tiene su propio directorio.</w:t>
-      </w:r>
-    </w:p>
-    <w:p>
-      <w:pPr>
-        <w:ind w:left="360"/>
-      </w:pPr>
-      <w:r>
-        <w:t xml:space="preserve">*   </w:t>
-      </w:r>
-      <w:r>
-        <w:rPr>
-          <w:b/>
-          <w:bCs/>
-        </w:rPr>
-        <w:t xml:space="preserve">**Estructura </w:t>
-      </w:r>
-      <w:proofErr w:type="gramStart"/>
-      <w:r>
-        <w:rPr>
-          <w:b/>
-          <w:bCs/>
-        </w:rPr>
-        <w:t>anterior:*</w:t>
-      </w:r>
-      <w:proofErr w:type="gramEnd"/>
-      <w:r>
-        <w:rPr>
-          <w:b/>
-          <w:bCs/>
-        </w:rPr>
-        <w:t>*</w:t>
-      </w:r>
-    </w:p>
-    <w:p>
-      <w:pPr>
-        <w:ind w:left="360"/>
-      </w:pPr>
-      <w:r>
-        <w:t xml:space="preserve">    ```</w:t>
-      </w:r>
-      <w:proofErr w:type="spellStart"/>
-      <w:r>
-        <w:t>text</w:t>
-      </w:r>
-      <w:proofErr w:type="spellEnd"/>
-    </w:p>
-    <w:p>
-      <w:pPr>
-        <w:ind w:left="360"/>
-      </w:pPr>
-      <w:r>
-        <w:t xml:space="preserve">    </w:t>
-      </w:r>
-      <w:proofErr w:type="spellStart"/>
-      <w:r>
-        <w:t>src</w:t>
-      </w:r>
-      <w:proofErr w:type="spellEnd"/>
-      <w:r>
-        <w:t>/</w:t>
-      </w:r>
-    </w:p>
-    <w:p>
-      <w:pPr>
-        <w:ind w:left="360"/>
-      </w:pPr>
-      <w:r>
-        <w:t xml:space="preserve">    </w:t>
-      </w:r>
-      <w:r>
-        <w:rPr>
-          <w:rFonts w:ascii="Arial" w:hAnsi="Arial" w:cs="Arial"/>
-        </w:rPr>
-        <w:t>├</w:t>
-      </w:r>
-      <w:r>
-        <w:rPr>
-          <w:rFonts w:ascii="Aptos" w:hAnsi="Aptos" w:cs="Aptos"/>
-        </w:rPr>
-        <w:t>──</w:t>
-      </w:r>
-      <w:r>
-        <w:t xml:space="preserve"> </w:t>
-      </w:r>
-      <w:proofErr w:type="spellStart"/>
-      <w:r>
-        <w:t>components</w:t>
-      </w:r>
-      <w:proofErr w:type="spellEnd"/>
-      <w:r>
-        <w:t>/</w:t>
-      </w:r>
-    </w:p>
-    <w:p>
-      <w:pPr>
-        <w:ind w:left="360"/>
-      </w:pPr>
-      <w:r>
-        <w:t xml:space="preserve">    │   </w:t>
-      </w:r>
-      <w:r>
-        <w:rPr>
-          <w:rFonts w:ascii="Arial" w:hAnsi="Arial" w:cs="Arial"/>
-        </w:rPr>
-        <w:t>├</w:t>
-      </w:r>
-      <w:r>
-        <w:rPr>
-          <w:rFonts w:ascii="Aptos" w:hAnsi="Aptos" w:cs="Aptos"/>
-        </w:rPr>
-        <w:t>──</w:t>
-      </w:r>
-      <w:r>
-        <w:t xml:space="preserve"> </w:t>
-      </w:r>
-      <w:proofErr w:type="spellStart"/>
-      <w:r>
-        <w:t>ModalGutendex.jsx</w:t>
-      </w:r>
-      <w:proofErr w:type="spellEnd"/>
-      <w:r>
-        <w:t xml:space="preserve"> (Solo usado en </w:t>
-      </w:r>
-      <w:proofErr w:type="spellStart"/>
-      <w:r>
-        <w:t>DetalleLibro</w:t>
-      </w:r>
-      <w:proofErr w:type="spellEnd"/>
-      <w:r>
-        <w:t>)</w:t>
-      </w:r>
-    </w:p>
-    <w:p>
-      <w:pPr>
-        <w:ind w:left="360"/>
-      </w:pPr>
-      <w:r>
-        <w:t xml:space="preserve">    │   </w:t>
-      </w:r>
-      <w:r>
-        <w:rPr>
-          <w:rFonts w:ascii="Arial" w:hAnsi="Arial" w:cs="Arial"/>
-        </w:rPr>
-        <w:t>├</w:t>
-      </w:r>
-      <w:r>
-        <w:rPr>
-          <w:rFonts w:ascii="Aptos" w:hAnsi="Aptos" w:cs="Aptos"/>
-        </w:rPr>
-        <w:t>──</w:t>
-      </w:r>
-      <w:r>
-        <w:t xml:space="preserve"> </w:t>
-      </w:r>
-      <w:proofErr w:type="spellStart"/>
-      <w:r>
-        <w:t>TablaLibros.jsx</w:t>
-      </w:r>
-      <w:proofErr w:type="spellEnd"/>
-      <w:r>
-        <w:t xml:space="preserve"> (Solo usado en </w:t>
-      </w:r>
-      <w:proofErr w:type="spellStart"/>
-      <w:r>
-        <w:t>AdminLibros</w:t>
-      </w:r>
-      <w:proofErr w:type="spellEnd"/>
-      <w:r>
-        <w:t>)</w:t>
-      </w:r>
-    </w:p>
-    <w:p>
-      <w:pPr>
-        <w:ind w:left="360"/>
-      </w:pPr>
-      <w:r>
-        <w:t xml:space="preserve">    │   └── ...</w:t>
-      </w:r>
-    </w:p>
-    <w:p>
-      <w:pPr>
-        <w:ind w:left="360"/>
-      </w:pPr>
-      <w:r>
-        <w:t xml:space="preserve">    </w:t>
-      </w:r>
-      <w:r>
-        <w:rPr>
-          <w:rFonts w:ascii="Arial" w:hAnsi="Arial" w:cs="Arial"/>
-        </w:rPr>
-        <w:t>├</w:t>
-      </w:r>
-      <w:r>
-        <w:rPr>
-          <w:rFonts w:ascii="Aptos" w:hAnsi="Aptos" w:cs="Aptos"/>
-        </w:rPr>
-        <w:t>──</w:t>
-      </w:r>
-      <w:r>
-        <w:t xml:space="preserve"> </w:t>
-      </w:r>
-      <w:proofErr w:type="spellStart"/>
-      <w:r>
-        <w:t>pages</w:t>
-      </w:r>
-      <w:proofErr w:type="spellEnd"/>
-      <w:r>
-        <w:t>/</w:t>
-      </w:r>
-    </w:p>
-    <w:p>
-      <w:pPr>
-        <w:ind w:left="360"/>
-      </w:pPr>
-      <w:r>
-        <w:t xml:space="preserve">    │   </w:t>
-      </w:r>
-      <w:r>
-        <w:rPr>
-          <w:rFonts w:ascii="Arial" w:hAnsi="Arial" w:cs="Arial"/>
-        </w:rPr>
-        <w:t>├</w:t>
-      </w:r>
-      <w:r>
-        <w:rPr>
-          <w:rFonts w:ascii="Aptos" w:hAnsi="Aptos" w:cs="Aptos"/>
-        </w:rPr>
-        <w:t>──</w:t>
-      </w:r>
-      <w:r>
-        <w:t xml:space="preserve"> </w:t>
-      </w:r>
-      <w:proofErr w:type="spellStart"/>
-      <w:r>
-        <w:t>DetalleLibro.jsx</w:t>
-      </w:r>
-      <w:proofErr w:type="spellEnd"/>
-    </w:p>
-    <w:p>
-      <w:pPr>
-        <w:ind w:left="360"/>
-      </w:pPr>
-      <w:r>
-        <w:t xml:space="preserve">    │   </w:t>
-      </w:r>
-      <w:r>
-        <w:rPr>
-          <w:rFonts w:ascii="Arial" w:hAnsi="Arial" w:cs="Arial"/>
-        </w:rPr>
-        <w:t>├</w:t>
-      </w:r>
-      <w:r>
-        <w:rPr>
-          <w:rFonts w:ascii="Aptos" w:hAnsi="Aptos" w:cs="Aptos"/>
-        </w:rPr>
-        <w:t>──</w:t>
-      </w:r>
-      <w:r>
-        <w:t xml:space="preserve"> </w:t>
-      </w:r>
-      <w:proofErr w:type="spellStart"/>
-      <w:r>
-        <w:t>AdminLibros.jsx</w:t>
-      </w:r>
-      <w:proofErr w:type="spellEnd"/>
-    </w:p>
-    <w:p>
-      <w:pPr>
-        <w:ind w:left="360"/>
-      </w:pPr>
-      <w:r>
-        <w:t xml:space="preserve">    │   └── ...</w:t>
-      </w:r>
-    </w:p>
-    <w:p>
-      <w:pPr>
-        <w:ind w:left="360"/>
-      </w:pPr>
-      <w:r>
-        <w:t xml:space="preserve">    ```</w:t>
-      </w:r>
-    </w:p>
-    <w:p>
-      <w:pPr>
-        <w:ind w:left="360"/>
-      </w:pPr>
-      <w:r>
-        <w:t xml:space="preserve">*   </w:t>
-      </w:r>
-      <w:r>
-        <w:rPr>
-          <w:b/>
-          <w:bCs/>
-        </w:rPr>
-        <w:t>**Nueva Estructura (Ejemplo `</w:t>
-      </w:r>
-      <w:proofErr w:type="spellStart"/>
-      <w:r>
-        <w:rPr>
-          <w:b/>
-          <w:bCs/>
-        </w:rPr>
-        <w:t>DetalleLibro</w:t>
-      </w:r>
-      <w:proofErr w:type="spellEnd"/>
-      <w:r>
-        <w:rPr>
-          <w:b/>
-          <w:bCs/>
-        </w:rPr>
-        <w:t>` y `Editoriales`</w:t>
-      </w:r>
-      <w:proofErr w:type="gramStart"/>
-      <w:r>
-        <w:rPr>
-          <w:b/>
-          <w:bCs/>
-        </w:rPr>
-        <w:t>):*</w:t>
-      </w:r>
-      <w:proofErr w:type="gramEnd"/>
-      <w:r>
-        <w:rPr>
-          <w:b/>
-          <w:bCs/>
-        </w:rPr>
-        <w:t>*</w:t>
-      </w:r>
-    </w:p>
-    <w:p>
-      <w:pPr>
-        <w:ind w:left="360"/>
-      </w:pPr>
-      <w:r>
-        <w:t xml:space="preserve">    ```</w:t>
-      </w:r>
-      <w:proofErr w:type="spellStart"/>
-      <w:r>
-        <w:t>text</w:t>
-      </w:r>
-      <w:proofErr w:type="spellEnd"/>
-    </w:p>
-    <w:p>
-      <w:pPr>
-        <w:ind w:left="360"/>
-      </w:pPr>
-      <w:r>
-        <w:t xml:space="preserve">    </w:t>
-      </w:r>
-      <w:proofErr w:type="spellStart"/>
-      <w:r>
-        <w:t>src</w:t>
-      </w:r>
-      <w:proofErr w:type="spellEnd"/>
-      <w:r>
-        <w:t>/</w:t>
-      </w:r>
-    </w:p>
-    <w:p>
-      <w:pPr>
-        <w:ind w:left="360"/>
-      </w:pPr>
-      <w:r>
-        <w:t xml:space="preserve">    </w:t>
-      </w:r>
-      <w:r>
-        <w:rPr>
-          <w:rFonts w:ascii="Arial" w:hAnsi="Arial" w:cs="Arial"/>
-        </w:rPr>
-        <w:t>├</w:t>
-      </w:r>
-      <w:r>
-        <w:rPr>
-          <w:rFonts w:ascii="Aptos" w:hAnsi="Aptos" w:cs="Aptos"/>
-        </w:rPr>
-        <w:t>──</w:t>
-      </w:r>
-      <w:r>
-        <w:t xml:space="preserve"> </w:t>
-      </w:r>
-      <w:proofErr w:type="spellStart"/>
-      <w:r>
-        <w:t>components</w:t>
-      </w:r>
-      <w:proofErr w:type="spellEnd"/>
-      <w:r>
-        <w:t xml:space="preserve">/ (Solo componentes verdaderamente globales/reutilizables: </w:t>
-      </w:r>
-      <w:proofErr w:type="spellStart"/>
-      <w:r>
-        <w:t>Navbar</w:t>
-      </w:r>
-      <w:proofErr w:type="spellEnd"/>
-      <w:r>
-        <w:t xml:space="preserve">, </w:t>
-      </w:r>
-      <w:proofErr w:type="spellStart"/>
-      <w:r>
-        <w:t>TarjetaLibro</w:t>
-      </w:r>
-      <w:proofErr w:type="spellEnd"/>
-      <w:r>
-        <w:t>)</w:t>
-      </w:r>
-    </w:p>
-    <w:p>
-      <w:pPr>
-        <w:ind w:left="360"/>
-      </w:pPr>
-      <w:r>
-        <w:t xml:space="preserve">    </w:t>
-      </w:r>
-      <w:r>
-        <w:rPr>
-          <w:rFonts w:ascii="Arial" w:hAnsi="Arial" w:cs="Arial"/>
-        </w:rPr>
-        <w:t>├</w:t>
-      </w:r>
-      <w:r>
-        <w:rPr>
-          <w:rFonts w:ascii="Aptos" w:hAnsi="Aptos" w:cs="Aptos"/>
-        </w:rPr>
-        <w:t>──</w:t>
-      </w:r>
-      <w:r>
-        <w:t xml:space="preserve"> </w:t>
-      </w:r>
-      <w:proofErr w:type="spellStart"/>
-      <w:r>
-        <w:t>hooks</w:t>
-      </w:r>
-      <w:proofErr w:type="spellEnd"/>
-      <w:r>
-        <w:t>/</w:t>
-      </w:r>
-    </w:p>
-    <w:p>
-      <w:pPr>
-        <w:ind w:left="360"/>
-      </w:pPr>
-      <w:r>
-        <w:t xml:space="preserve">    │   </w:t>
-      </w:r>
-      <w:r>
-        <w:rPr>
-          <w:rFonts w:ascii="Arial" w:hAnsi="Arial" w:cs="Arial"/>
-        </w:rPr>
-        <w:t>├</w:t>
-      </w:r>
-      <w:r>
-        <w:rPr>
-          <w:rFonts w:ascii="Aptos" w:hAnsi="Aptos" w:cs="Aptos"/>
-        </w:rPr>
-        <w:t>──</w:t>
-      </w:r>
-      <w:r>
-        <w:t xml:space="preserve"> useDetalleLibro.js</w:t>
-      </w:r>
-    </w:p>
-    <w:p>
-      <w:pPr>
-        <w:ind w:left="360"/>
-      </w:pPr>
-      <w:r>
-        <w:t xml:space="preserve">    │   </w:t>
-      </w:r>
-      <w:r>
-        <w:rPr>
-          <w:rFonts w:ascii="Arial" w:hAnsi="Arial" w:cs="Arial"/>
-        </w:rPr>
-        <w:t>├</w:t>
-      </w:r>
-      <w:r>
-        <w:rPr>
-          <w:rFonts w:ascii="Aptos" w:hAnsi="Aptos" w:cs="Aptos"/>
-        </w:rPr>
-        <w:t>──</w:t>
-      </w:r>
-      <w:r>
-        <w:t xml:space="preserve"> useEditoriales.js</w:t>
-      </w:r>
-    </w:p>
-    <w:p>
-      <w:pPr>
-        <w:ind w:left="360"/>
-      </w:pPr>
-      <w:r>
-        <w:t xml:space="preserve">    │   └── useInfiniteScroll.js</w:t>
-      </w:r>
-    </w:p>
-    <w:p>
-      <w:pPr>
-        <w:ind w:left="360"/>
-      </w:pPr>
-      <w:r>
-        <w:t xml:space="preserve">    </w:t>
-      </w:r>
-      <w:r>
-        <w:rPr>
-          <w:rFonts w:ascii="Arial" w:hAnsi="Arial" w:cs="Arial"/>
-        </w:rPr>
-        <w:t>├</w:t>
-      </w:r>
-      <w:r>
-        <w:rPr>
-          <w:rFonts w:ascii="Aptos" w:hAnsi="Aptos" w:cs="Aptos"/>
-        </w:rPr>
-        <w:t>──</w:t>
-      </w:r>
-      <w:r>
-        <w:t xml:space="preserve"> </w:t>
-      </w:r>
-      <w:proofErr w:type="spellStart"/>
-      <w:r>
-        <w:t>pages</w:t>
-      </w:r>
-      <w:proofErr w:type="spellEnd"/>
-      <w:r>
-        <w:t>/</w:t>
-      </w:r>
-    </w:p>
-    <w:p>
-      <w:pPr>
-        <w:ind w:left="360"/>
-      </w:pPr>
-      <w:r>
-        <w:t xml:space="preserve">    │   </w:t>
-      </w:r>
-      <w:r>
-        <w:rPr>
-          <w:rFonts w:ascii="Arial" w:hAnsi="Arial" w:cs="Arial"/>
-        </w:rPr>
-        <w:t>├</w:t>
-      </w:r>
-      <w:r>
-        <w:rPr>
-          <w:rFonts w:ascii="Aptos" w:hAnsi="Aptos" w:cs="Aptos"/>
-        </w:rPr>
-        <w:t>──</w:t>
-      </w:r>
-      <w:r>
-        <w:t xml:space="preserve"> </w:t>
-      </w:r>
-      <w:proofErr w:type="spellStart"/>
-      <w:r>
-        <w:t>DetalleLibro</w:t>
-      </w:r>
-      <w:proofErr w:type="spellEnd"/>
-      <w:r>
-        <w:t>/</w:t>
-      </w:r>
-    </w:p>
-    <w:p>
-      <w:pPr>
-        <w:ind w:left="360"/>
-      </w:pPr>
-      <w:r>
-        <w:lastRenderedPageBreak/>
-        <w:t xml:space="preserve">    │   │   </w:t>
-      </w:r>
-      <w:r>
-        <w:rPr>
-          <w:rFonts w:ascii="Arial" w:hAnsi="Arial" w:cs="Arial"/>
-        </w:rPr>
-        <w:t>├</w:t>
-      </w:r>
-      <w:r>
-        <w:rPr>
-          <w:rFonts w:ascii="Aptos" w:hAnsi="Aptos" w:cs="Aptos"/>
-        </w:rPr>
-        <w:t>──</w:t>
-      </w:r>
-      <w:r>
-        <w:t xml:space="preserve"> </w:t>
-      </w:r>
-      <w:proofErr w:type="spellStart"/>
-      <w:r>
-        <w:t>index.jsx</w:t>
-      </w:r>
-      <w:proofErr w:type="spellEnd"/>
-      <w:r>
-        <w:t xml:space="preserve"> (Punto de entrada, invoca el </w:t>
-      </w:r>
-      <w:proofErr w:type="spellStart"/>
-      <w:r>
-        <w:t>hook</w:t>
-      </w:r>
-      <w:proofErr w:type="spellEnd"/>
-      <w:r>
-        <w:t xml:space="preserve"> y ensambla la UI)</w:t>
-      </w:r>
-    </w:p>
-    <w:p>
-      <w:pPr>
-        <w:ind w:left="360"/>
-      </w:pPr>
-      <w:r>
-        <w:t xml:space="preserve">    │   │   </w:t>
-      </w:r>
-      <w:r>
-        <w:rPr>
-          <w:rFonts w:ascii="Arial" w:hAnsi="Arial" w:cs="Arial"/>
-        </w:rPr>
-        <w:t>├</w:t>
-      </w:r>
-      <w:r>
-        <w:rPr>
-          <w:rFonts w:ascii="Aptos" w:hAnsi="Aptos" w:cs="Aptos"/>
-        </w:rPr>
-        <w:t>──</w:t>
-      </w:r>
-      <w:r>
-        <w:t xml:space="preserve"> </w:t>
-      </w:r>
-      <w:proofErr w:type="spellStart"/>
-      <w:r>
-        <w:t>OpcionesCompra.jsx</w:t>
-      </w:r>
-      <w:proofErr w:type="spellEnd"/>
-    </w:p>
-    <w:p>
-      <w:pPr>
-        <w:ind w:left="360"/>
-      </w:pPr>
-      <w:r>
-        <w:t xml:space="preserve">    │   │   </w:t>
-      </w:r>
-      <w:r>
-        <w:rPr>
-          <w:rFonts w:ascii="Arial" w:hAnsi="Arial" w:cs="Arial"/>
-        </w:rPr>
-        <w:t>├</w:t>
-      </w:r>
-      <w:r>
-        <w:rPr>
-          <w:rFonts w:ascii="Aptos" w:hAnsi="Aptos" w:cs="Aptos"/>
-        </w:rPr>
-        <w:t>──</w:t>
-      </w:r>
-      <w:r>
-        <w:t xml:space="preserve"> </w:t>
-      </w:r>
-      <w:proofErr w:type="spellStart"/>
-      <w:r>
-        <w:t>SeccionRelacionados.jsx</w:t>
-      </w:r>
-      <w:proofErr w:type="spellEnd"/>
-    </w:p>
-    <w:p>
-      <w:pPr>
-        <w:ind w:left="360"/>
-      </w:pPr>
-      <w:r>
-        <w:t xml:space="preserve">    │   │   └── </w:t>
-      </w:r>
-      <w:proofErr w:type="spellStart"/>
-      <w:r>
-        <w:t>ModalGutendex.jsx</w:t>
-      </w:r>
-      <w:proofErr w:type="spellEnd"/>
-    </w:p>
-    <w:p>
-      <w:pPr>
-        <w:ind w:left="360"/>
-      </w:pPr>
-      <w:r>
-        <w:t xml:space="preserve">    │   </w:t>
-      </w:r>
-      <w:r>
-        <w:rPr>
-          <w:rFonts w:ascii="Arial" w:hAnsi="Arial" w:cs="Arial"/>
-        </w:rPr>
-        <w:t>├</w:t>
-      </w:r>
-      <w:r>
-        <w:rPr>
-          <w:rFonts w:ascii="Aptos" w:hAnsi="Aptos" w:cs="Aptos"/>
-        </w:rPr>
-        <w:t>──</w:t>
-      </w:r>
-      <w:r>
-        <w:t xml:space="preserve"> Editoriales/</w:t>
-      </w:r>
-    </w:p>
-    <w:p>
-      <w:pPr>
-        <w:ind w:left="360"/>
-      </w:pPr>
-      <w:r>
-        <w:t xml:space="preserve">    │   │   </w:t>
-      </w:r>
-      <w:r>
-        <w:rPr>
-          <w:rFonts w:ascii="Arial" w:hAnsi="Arial" w:cs="Arial"/>
-        </w:rPr>
-        <w:t>├</w:t>
-      </w:r>
-      <w:r>
-        <w:rPr>
-          <w:rFonts w:ascii="Aptos" w:hAnsi="Aptos" w:cs="Aptos"/>
-        </w:rPr>
-        <w:t>──</w:t>
-      </w:r>
-      <w:r>
-        <w:t xml:space="preserve"> </w:t>
-      </w:r>
-      <w:proofErr w:type="spellStart"/>
-      <w:r>
-        <w:t>index.jsx</w:t>
-      </w:r>
-      <w:proofErr w:type="spellEnd"/>
-    </w:p>
-    <w:p>
-      <w:pPr>
-        <w:ind w:left="360"/>
-      </w:pPr>
-      <w:r>
-        <w:t xml:space="preserve">    │   │   </w:t>
-      </w:r>
-      <w:r>
-        <w:rPr>
-          <w:rFonts w:ascii="Arial" w:hAnsi="Arial" w:cs="Arial"/>
-        </w:rPr>
-        <w:t>├</w:t>
-      </w:r>
-      <w:r>
-        <w:rPr>
-          <w:rFonts w:ascii="Aptos" w:hAnsi="Aptos" w:cs="Aptos"/>
-        </w:rPr>
-        <w:t>──</w:t>
-      </w:r>
-      <w:r>
-        <w:t xml:space="preserve"> </w:t>
-      </w:r>
-      <w:proofErr w:type="spellStart"/>
-      <w:r>
-        <w:t>BuscadorEditoriales.jsx</w:t>
-      </w:r>
-      <w:proofErr w:type="spellEnd"/>
-    </w:p>
-    <w:p>
-      <w:pPr>
-        <w:ind w:left="360"/>
-      </w:pPr>
-      <w:r>
-        <w:t xml:space="preserve">    │   │   └── </w:t>
-      </w:r>
-      <w:proofErr w:type="spellStart"/>
-      <w:r>
-        <w:t>ListaEditoriales.jsx</w:t>
-      </w:r>
-      <w:proofErr w:type="spellEnd"/>
-    </w:p>
-    <w:p>
-      <w:pPr>
-        <w:ind w:left="360"/>
-      </w:pPr>
-      <w:r>
-        <w:t xml:space="preserve">    ```</w:t>
-      </w:r>
-    </w:p>
-    <w:p>
-      <w:pPr>
-        <w:ind w:left="360"/>
-      </w:pPr>
-      <w:r>
-        <w:t xml:space="preserve">*   </w:t>
-      </w:r>
-      <w:r>
-        <w:rPr>
-          <w:b/>
-          <w:bCs/>
-        </w:rPr>
-        <w:t>**</w:t>
-      </w:r>
-      <w:proofErr w:type="gramStart"/>
-      <w:r>
-        <w:rPr>
-          <w:b/>
-          <w:bCs/>
-        </w:rPr>
-        <w:t>Beneficios:*</w:t>
-      </w:r>
-      <w:proofErr w:type="gramEnd"/>
-      <w:r>
-        <w:rPr>
-          <w:b/>
-          <w:bCs/>
-        </w:rPr>
-        <w:t>*</w:t>
-      </w:r>
-    </w:p>
-    <w:p>
-      <w:pPr>
-        <w:ind w:left="360"/>
-      </w:pPr>
-      <w:r>
-        <w:t xml:space="preserve">    *   </w:t>
-      </w:r>
-      <w:r>
-        <w:rPr>
-          <w:b/>
-          <w:bCs/>
-        </w:rPr>
-        <w:t xml:space="preserve">**Cohesión </w:t>
-      </w:r>
-      <w:proofErr w:type="gramStart"/>
-      <w:r>
-        <w:rPr>
-          <w:b/>
-          <w:bCs/>
-        </w:rPr>
-        <w:t>Espacial:*</w:t>
-      </w:r>
-      <w:proofErr w:type="gramEnd"/>
-      <w:r>
-        <w:rPr>
-          <w:b/>
-          <w:bCs/>
-        </w:rPr>
-        <w:t>*</w:t>
-      </w:r>
-      <w:r>
-        <w:t xml:space="preserve"> Los archivos que cambian juntos, viven juntos. Si necesitas modificar la vista de Editoriales, sabes que todo lo relacionado (excepto la lógica del </w:t>
-      </w:r>
-      <w:proofErr w:type="spellStart"/>
-      <w:r>
-        <w:t>hook</w:t>
-      </w:r>
-      <w:proofErr w:type="spellEnd"/>
-      <w:r>
-        <w:t>) está dentro de `</w:t>
-      </w:r>
-      <w:proofErr w:type="spellStart"/>
-      <w:r>
-        <w:t>pages</w:t>
-      </w:r>
-      <w:proofErr w:type="spellEnd"/>
-      <w:r>
-        <w:t>/Editoriales/`.</w:t>
-      </w:r>
-    </w:p>
-    <w:p>
-      <w:pPr>
-        <w:ind w:left="360"/>
-      </w:pPr>
-      <w:r>
-        <w:t xml:space="preserve">    *   </w:t>
-      </w:r>
-      <w:r>
-        <w:rPr>
-          <w:b/>
-          <w:bCs/>
-        </w:rPr>
-        <w:t xml:space="preserve">**Limpieza del Directorio </w:t>
-      </w:r>
-      <w:proofErr w:type="gramStart"/>
-      <w:r>
-        <w:rPr>
-          <w:b/>
-          <w:bCs/>
-        </w:rPr>
-        <w:t>Global:*</w:t>
-      </w:r>
-      <w:proofErr w:type="gramEnd"/>
-      <w:r>
-        <w:rPr>
-          <w:b/>
-          <w:bCs/>
-        </w:rPr>
-        <w:t>*</w:t>
-      </w:r>
-      <w:r>
-        <w:t xml:space="preserve"> La carpeta `</w:t>
-      </w:r>
-      <w:proofErr w:type="spellStart"/>
-      <w:r>
-        <w:t>src</w:t>
-      </w:r>
-      <w:proofErr w:type="spellEnd"/>
-      <w:r>
-        <w:t>/</w:t>
-      </w:r>
-      <w:proofErr w:type="spellStart"/>
-      <w:r>
-        <w:t>components</w:t>
-      </w:r>
-      <w:proofErr w:type="spellEnd"/>
-      <w:r>
-        <w:t>/` vuelve a su propósito original: alojar componentes genéricos y reutilizables en toda la app.</w:t>
-      </w:r>
-    </w:p>
-    <w:p>
-      <w:pPr>
-        <w:ind w:left="360"/>
-      </w:pPr>
-      <w:r>
-        <w:rPr>
-          <w:b/>
-          <w:bCs/>
-        </w:rPr>
-        <w:t>## 3. Centralización y Reutilización de Funcionalidades Transversales</w:t>
-      </w:r>
-    </w:p>
-    <w:p>
-      <w:pPr>
-        <w:ind w:left="360"/>
-      </w:pPr>
-      <w:r>
-        <w:t>Durante la refactorización, se identificaron patrones repetidos que fueron abstraídos:</w:t>
-      </w:r>
-    </w:p>
-    <w:p>
-      <w:pPr>
-        <w:ind w:left="360"/>
-      </w:pPr>
-      <w:r>
-        <w:t xml:space="preserve">*   </w:t>
-      </w:r>
-      <w:r>
-        <w:rPr>
-          <w:b/>
-          <w:bCs/>
-        </w:rPr>
-        <w:t xml:space="preserve">**Centralización de </w:t>
-      </w:r>
-      <w:proofErr w:type="gramStart"/>
-      <w:r>
-        <w:rPr>
-          <w:b/>
-          <w:bCs/>
-        </w:rPr>
-        <w:t>Mensajes:*</w:t>
-      </w:r>
-      <w:proofErr w:type="gramEnd"/>
-      <w:r>
-        <w:rPr>
-          <w:b/>
-          <w:bCs/>
-        </w:rPr>
-        <w:t>*</w:t>
-      </w:r>
-      <w:r>
-        <w:t xml:space="preserve"> Se crearon diccionarios de constantes (`</w:t>
-      </w:r>
-      <w:proofErr w:type="spellStart"/>
-      <w:r>
-        <w:t>constants</w:t>
-      </w:r>
-      <w:proofErr w:type="spellEnd"/>
-      <w:r>
-        <w:t xml:space="preserve">/messages.js` tanto en </w:t>
-      </w:r>
-      <w:proofErr w:type="spellStart"/>
-      <w:r>
-        <w:t>frontend</w:t>
-      </w:r>
-      <w:proofErr w:type="spellEnd"/>
-      <w:r>
-        <w:t xml:space="preserve"> como en </w:t>
-      </w:r>
-      <w:proofErr w:type="spellStart"/>
-      <w:r>
-        <w:t>backend</w:t>
-      </w:r>
-      <w:proofErr w:type="spellEnd"/>
-      <w:r>
-        <w:t>) para manejar los mensajes de error, éxito y notificaciones. Esto asegura consistencia en el tono de la aplicación (Principio DRY) y facilita la internacionalización (i18n) en el futuro.</w:t>
-      </w:r>
-    </w:p>
-    <w:p>
-      <w:pPr>
-        <w:ind w:left="360"/>
-      </w:pPr>
-      <w:r>
-        <w:t xml:space="preserve">*   </w:t>
-      </w:r>
-      <w:r>
-        <w:rPr>
-          <w:b/>
-          <w:bCs/>
-        </w:rPr>
-        <w:t>**Hook `</w:t>
-      </w:r>
-      <w:proofErr w:type="spellStart"/>
-      <w:r>
-        <w:rPr>
-          <w:b/>
-          <w:bCs/>
-        </w:rPr>
-        <w:t>useInfiniteScroll</w:t>
-      </w:r>
-      <w:proofErr w:type="spellEnd"/>
-      <w:proofErr w:type="gramStart"/>
-      <w:r>
-        <w:rPr>
-          <w:b/>
-          <w:bCs/>
-        </w:rPr>
-        <w:t>`:*</w:t>
-      </w:r>
-      <w:proofErr w:type="gramEnd"/>
-      <w:r>
-        <w:rPr>
-          <w:b/>
-          <w:bCs/>
-        </w:rPr>
-        <w:t>*</w:t>
-      </w:r>
-      <w:r>
-        <w:t xml:space="preserve"> Se detectó que la lógica de paginación por </w:t>
-      </w:r>
-      <w:proofErr w:type="spellStart"/>
-      <w:r>
-        <w:t>scroll</w:t>
-      </w:r>
-      <w:proofErr w:type="spellEnd"/>
-      <w:r>
-        <w:t xml:space="preserve"> se repetía en `Editoriales`, `</w:t>
-      </w:r>
-      <w:proofErr w:type="spellStart"/>
-      <w:r>
-        <w:t>Categorias</w:t>
-      </w:r>
-      <w:proofErr w:type="spellEnd"/>
-      <w:r>
-        <w:t xml:space="preserve">` y `Autores`. Se extrajo esta lógica a un </w:t>
-      </w:r>
-      <w:proofErr w:type="spellStart"/>
-      <w:r>
-        <w:t>hook</w:t>
-      </w:r>
-      <w:proofErr w:type="spellEnd"/>
-      <w:r>
-        <w:t xml:space="preserve"> genérico `</w:t>
-      </w:r>
-      <w:proofErr w:type="spellStart"/>
-      <w:proofErr w:type="gramStart"/>
-      <w:r>
-        <w:t>useInfiniteScroll</w:t>
-      </w:r>
-      <w:proofErr w:type="spellEnd"/>
-      <w:r>
-        <w:t>(</w:t>
-      </w:r>
-      <w:proofErr w:type="spellStart"/>
-      <w:proofErr w:type="gramEnd"/>
-      <w:r>
-        <w:t>callback</w:t>
-      </w:r>
-      <w:proofErr w:type="spellEnd"/>
-      <w:r>
-        <w:t xml:space="preserve">, </w:t>
-      </w:r>
-      <w:proofErr w:type="spellStart"/>
-      <w:r>
-        <w:t>isCargando</w:t>
-      </w:r>
-      <w:proofErr w:type="spellEnd"/>
-      <w:r>
-        <w:t xml:space="preserve">, </w:t>
-      </w:r>
-      <w:proofErr w:type="spellStart"/>
-      <w:r>
-        <w:t>hasMore</w:t>
-      </w:r>
-      <w:proofErr w:type="spellEnd"/>
-      <w:r>
-        <w:t xml:space="preserve">)`, eliminando código duplicado y estandarizando el comportamiento del </w:t>
-      </w:r>
-      <w:proofErr w:type="spellStart"/>
-      <w:r>
-        <w:t>scroll</w:t>
-      </w:r>
-      <w:proofErr w:type="spellEnd"/>
-      <w:r>
-        <w:t xml:space="preserve"> en toda la plataforma.</w:t>
-      </w:r>
-    </w:p>
-    <w:p>
-      <w:pPr>
-        <w:ind w:left="360"/>
-      </w:pPr>
-      <w:r>
-        <w:rPr>
-          <w:b/>
-          <w:bCs/>
-        </w:rPr>
-        <w:t>## Conclusión</w:t>
-      </w:r>
-    </w:p>
-    <w:p>
-      <w:pPr>
-        <w:ind w:left="360"/>
-      </w:pPr>
-      <w:r>
-        <w:t xml:space="preserve">Esta refactorización transforma la base de código de un estado monolítico y acoplado a una arquitectura modular, escalable y mantenible. Facilita el trabajo en equipo (menos conflictos de </w:t>
-      </w:r>
-      <w:r>
-        <w:rPr>
-          <w:i/>
-          <w:iCs/>
-        </w:rPr>
-        <w:t>*</w:t>
-      </w:r>
-      <w:proofErr w:type="spellStart"/>
-      <w:r>
-        <w:rPr>
-          <w:i/>
-          <w:iCs/>
-        </w:rPr>
-        <w:t>merge</w:t>
-      </w:r>
-      <w:proofErr w:type="spellEnd"/>
-      <w:r>
-        <w:rPr>
-          <w:i/>
-          <w:iCs/>
-        </w:rPr>
-        <w:t>*</w:t>
-      </w:r>
-      <w:r>
-        <w:t xml:space="preserve"> al tener archivos más </w:t>
-      </w:r>
-      <w:r>
-        <w:lastRenderedPageBreak/>
-        <w:t>pequeños), mejora la legibilidad del código y sienta unas bases sólidas para la futura expansión de la aplicación.</w:t>
-      </w:r>
-    </w:p>
-    <w:p>
-      <w:pPr>
-        <w:ind w:left="360"/>
-      </w:pPr>
-    </w:p>
-    <w:p>
-      <w:pPr>
-        <w:ind w:left="360"/>
-      </w:pPr>
-    </w:p>
-    <w:p>
-      <w:pPr>
-        <w:ind w:left="360"/>
-      </w:pPr>
-      <w:r>
-        <w:t>MEJORAS PENDIENTES:</w:t>
-      </w:r>
-    </w:p>
-    <w:p>
-      <w:pPr>
-        <w:pStyle w:val="Prrafodelista"/>
-        <w:numPr>
-          <w:ilvl w:val="1"/>
-          <w:numId w:val="6"/>
-        </w:numPr>
-      </w:pPr>
-      <w:r>
-        <w:t>Cuando un usuario pierde la contraseña opción de restaurarla por email.</w:t>
-      </w:r>
-    </w:p>
-    <w:p>
-      <w:pPr>
-        <w:ind w:left="360"/>
-      </w:pPr>
-      <w:r>
         <w:rPr>
           <w:noProof/>
         </w:rPr>
         <w:drawing>
-          <wp:inline distT="0" distB="0" distL="0" distR="0" wp14:anchorId="47237619" wp14:editId="36767C8B">
-            <wp:extent cx="5363323" cy="704948"/>
-            <wp:effectExtent l="0" t="0" r="8890" b="0"/>
-            <wp:docPr id="4" name="Imagen 4"/>
+          <wp:inline distT="0" distB="0" distL="0" distR="0" wp14:anchorId="72D5F143" wp14:editId="2A456F1D">
+            <wp:extent cx="5400040" cy="3430270"/>
+            <wp:effectExtent l="0" t="0" r="0" b="0"/>
+            <wp:docPr id="33" name="Imagen 33"/>
             <wp:cNvGraphicFramePr>
               <a:graphicFrameLocks xmlns:a="http://schemas.openxmlformats.org/drawingml/2006/main" noChangeAspect="1"/>
             </wp:cNvGraphicFramePr>
@@ -10811,6 +8785,76 @@
                   <pic:spPr>
                     <a:xfrm>
                       <a:off x="0" y="0"/>
+                      <a:ext cx="5400040" cy="3430270"/>
+                    </a:xfrm>
+                    <a:prstGeom prst="rect">
+                      <a:avLst/>
+                    </a:prstGeom>
+                  </pic:spPr>
+                </pic:pic>
+              </a:graphicData>
+            </a:graphic>
+          </wp:inline>
+        </w:drawing>
+      </w:r>
+    </w:p>
+    <w:p>
+      <w:pPr>
+        <w:ind w:left="360"/>
+      </w:pPr>
+      <w:r>
+        <w:t>Creación de archivo .</w:t>
+      </w:r>
+      <w:proofErr w:type="spellStart"/>
+      <w:r>
+        <w:t>htaccess</w:t>
+      </w:r>
+      <w:proofErr w:type="spellEnd"/>
+    </w:p>
+    <w:p>
+      <w:pPr>
+        <w:pStyle w:val="Prrafodelista"/>
+        <w:numPr>
+          <w:ilvl w:val="1"/>
+          <w:numId w:val="6"/>
+        </w:numPr>
+      </w:pPr>
+      <w:r>
+        <w:t>Desde el panel de usuario opción para cambiar la contraseña</w:t>
+      </w:r>
+    </w:p>
+    <w:p>
+      <w:pPr>
+        <w:ind w:left="360"/>
+      </w:pPr>
+      <w:r>
+        <w:rPr>
+          <w:noProof/>
+        </w:rPr>
+        <w:drawing>
+          <wp:inline distT="0" distB="0" distL="0" distR="0" wp14:anchorId="47237619" wp14:editId="36767C8B">
+            <wp:extent cx="5363323" cy="704948"/>
+            <wp:effectExtent l="0" t="0" r="8890" b="0"/>
+            <wp:docPr id="4" name="Imagen 4"/>
+            <wp:cNvGraphicFramePr>
+              <a:graphicFrameLocks xmlns:a="http://schemas.openxmlformats.org/drawingml/2006/main" noChangeAspect="1"/>
+            </wp:cNvGraphicFramePr>
+            <a:graphic xmlns:a="http://schemas.openxmlformats.org/drawingml/2006/main">
+              <a:graphicData uri="http://schemas.openxmlformats.org/drawingml/2006/picture">
+                <pic:pic xmlns:pic="http://schemas.openxmlformats.org/drawingml/2006/picture">
+                  <pic:nvPicPr>
+                    <pic:cNvPr id="1" name=""/>
+                    <pic:cNvPicPr/>
+                  </pic:nvPicPr>
+                  <pic:blipFill>
+                    <a:blip r:embed="rId43"/>
+                    <a:stretch>
+                      <a:fillRect/>
+                    </a:stretch>
+                  </pic:blipFill>
+                  <pic:spPr>
+                    <a:xfrm>
+                      <a:off x="0" y="0"/>
                       <a:ext cx="5363323" cy="704948"/>
                     </a:xfrm>
                     <a:prstGeom prst="rect">
@@ -10875,7 +8919,15 @@
         </w:numPr>
       </w:pPr>
       <w:r>
-        <w:t>Revisar seguridad de password (tanto en node.js como a nivel de web)</w:t>
+        <w:t xml:space="preserve">Revisar seguridad de </w:t>
+      </w:r>
+      <w:proofErr w:type="spellStart"/>
+      <w:r>
+        <w:t>password</w:t>
+      </w:r>
+      <w:proofErr w:type="spellEnd"/>
+      <w:r>
+        <w:t xml:space="preserve"> (tanto en node.js como a nivel de web)</w:t>
       </w:r>
     </w:p>
     <w:p>
@@ -10946,6 +8998,7 @@
           <w:i/>
           <w:iCs/>
         </w:rPr>
+        <w:lastRenderedPageBreak/>
         <w:t>Por qué:</w:t>
       </w:r>
       <w:r>
@@ -11070,7 +9123,6 @@
           <w:i/>
           <w:iCs/>
         </w:rPr>
-        <w:lastRenderedPageBreak/>
         <w:t>Qué es:</w:t>
       </w:r>
       <w:r>
@@ -11393,6 +9445,7 @@
           <w:i/>
           <w:iCs/>
         </w:rPr>
+        <w:lastRenderedPageBreak/>
         <w:t>Qué es:</w:t>
       </w:r>
       <w:r>
@@ -11555,7 +9608,6 @@
           <w:i/>
           <w:iCs/>
         </w:rPr>
-        <w:lastRenderedPageBreak/>
         <w:t>Por qué:</w:t>
       </w:r>
       <w:r>
@@ -11918,6 +9970,7 @@
           <w:i/>
           <w:iCs/>
         </w:rPr>
+        <w:lastRenderedPageBreak/>
         <w:t>Qué es:</w:t>
       </w:r>
       <w:r>
@@ -11960,7 +10013,7 @@
       </w:pPr>
     </w:p>
     <w:sectPr>
-      <w:headerReference w:type="default" r:id="rId43"/>
+      <w:headerReference w:type="default" r:id="rId44"/>
       <w:pgSz w:w="11906" w:h="16838"/>
       <w:pgMar w:top="1417" w:right="1701" w:bottom="1417" w:left="1701" w:header="708" w:footer="708" w:gutter="0"/>
       <w:pgNumType w:start="0"/>
@@ -16501,7 +14554,6 @@
   <w:style w:type="character" w:default="1" w:styleId="Fuentedeprrafopredeter">
     <w:name w:val="Default Paragraph Font"/>
     <w:uiPriority w:val="1"/>
-    <w:semiHidden/>
     <w:unhideWhenUsed/>
   </w:style>
   <w:style w:type="table" w:default="1" w:styleId="Tablanormal">

</xml_diff>

<commit_message>
googleAuth -->integracion de googleAuth para iniciar sesion y registrarse. -->pequeña reestructuración de authController. -->authTokens -->separada la logica de crear tokens que se repetia en authController y authGoogle. Ahora el token y la validez del mismo se configura desde archivo authTokens
</commit_message>
<xml_diff>
--- a/proyecto.docx
+++ b/proyecto.docx
@@ -3347,7 +3347,7 @@
                   </wp:anchor>
                 </w:drawing>
               </mc:Choice>
-              <mc:Fallback xmlns:w16du="http://schemas.microsoft.com/office/word/2023/wordml/word16du" xmlns:w16sdtfl="http://schemas.microsoft.com/office/word/2024/wordml/sdtformatlock">
+              <mc:Fallback xmlns:w16sdtfl="http://schemas.microsoft.com/office/word/2024/wordml/sdtformatlock" xmlns:w16du="http://schemas.microsoft.com/office/word/2023/wordml/word16du">
                 <w:pict>
                   <v:group w14:anchorId="07305E3A" id="Grupo 26" o:spid="_x0000_s1026" style="position:absolute;margin-left:0;margin-top:0;width:168pt;height:718.55pt;z-index:-251643904;mso-height-percent:950;mso-left-percent:40;mso-position-horizontal-relative:page;mso-position-vertical:center;mso-position-vertical-relative:page;mso-height-percent:950;mso-left-percent:40" coordsize="21336,91257" o:gfxdata="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">
                     <v:rect id="Rectángulo 3" o:spid="_x0000_s1027" style="position:absolute;width:1945;height:91257;visibility:visible;mso-wrap-style:square;v-text-anchor:middle" o:gfxdata="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" fillcolor="#0e2841 [3215]" stroked="f" strokeweight="1.5pt"/>
@@ -5569,7 +5569,7 @@
           <w:noProof/>
         </w:rPr>
         <w:drawing>
-          <wp:inline distT="0" distB="0" distL="0" distR="0" wp14:anchorId="3A9F5494" wp14:editId="25D1CD82">
+          <wp:inline distT="0" distB="0" distL="0" distR="0" wp14:anchorId="3A9F5494" wp14:editId="620B4929">
             <wp:extent cx="4443624" cy="3161307"/>
             <wp:effectExtent l="76200" t="76200" r="128905" b="134620"/>
             <wp:docPr id="935891741" name="Imagen 1"/>
@@ -5722,7 +5722,7 @@
           <w:noProof/>
         </w:rPr>
         <w:drawing>
-          <wp:inline distT="0" distB="0" distL="0" distR="0" wp14:anchorId="6CC8F11D" wp14:editId="2FDBFEFC">
+          <wp:inline distT="0" distB="0" distL="0" distR="0" wp14:anchorId="6CC8F11D" wp14:editId="4AA2C924">
             <wp:extent cx="5396230" cy="3834130"/>
             <wp:effectExtent l="76200" t="76200" r="128270" b="128270"/>
             <wp:docPr id="1285130325" name="Imagen 3"/>
@@ -5878,7 +5878,7 @@
           <w:noProof/>
         </w:rPr>
         <w:drawing>
-          <wp:inline distT="0" distB="0" distL="0" distR="0" wp14:anchorId="100023D7" wp14:editId="3ED94294">
+          <wp:inline distT="0" distB="0" distL="0" distR="0" wp14:anchorId="100023D7" wp14:editId="5A13F4CA">
             <wp:extent cx="4772025" cy="3395500"/>
             <wp:effectExtent l="95250" t="95250" r="85725" b="90805"/>
             <wp:docPr id="418913" name="Imagen 8"/>
@@ -5961,7 +5961,7 @@
           <w:noProof/>
         </w:rPr>
         <w:drawing>
-          <wp:inline distT="0" distB="0" distL="0" distR="0" wp14:anchorId="252BBB8C" wp14:editId="38480AF6">
+          <wp:inline distT="0" distB="0" distL="0" distR="0" wp14:anchorId="252BBB8C" wp14:editId="3F70810F">
             <wp:extent cx="4974873" cy="3539836"/>
             <wp:effectExtent l="76200" t="76200" r="130810" b="137160"/>
             <wp:docPr id="913894690" name="Imagen 7"/>
@@ -6037,7 +6037,7 @@
           <w:noProof/>
         </w:rPr>
         <w:drawing>
-          <wp:inline distT="0" distB="0" distL="0" distR="0" wp14:anchorId="1C3A36F7" wp14:editId="49AE2180">
+          <wp:inline distT="0" distB="0" distL="0" distR="0" wp14:anchorId="1C3A36F7" wp14:editId="348723AD">
             <wp:extent cx="4949839" cy="3522023"/>
             <wp:effectExtent l="76200" t="76200" r="136525" b="135890"/>
             <wp:docPr id="1340598956" name="Imagen 1"/>
@@ -6344,7 +6344,7 @@
               </wp:anchor>
             </w:drawing>
           </mc:Choice>
-          <mc:Fallback xmlns:w16du="http://schemas.microsoft.com/office/word/2023/wordml/word16du" xmlns:w16sdtfl="http://schemas.microsoft.com/office/word/2024/wordml/sdtformatlock">
+          <mc:Fallback xmlns:w16sdtfl="http://schemas.microsoft.com/office/word/2024/wordml/sdtformatlock" xmlns:w16du="http://schemas.microsoft.com/office/word/2023/wordml/word16du">
             <w:pict>
               <v:shapetype w14:anchorId="49C09E3A" id="_x0000_t75" coordsize="21600,21600" o:spt="75" o:preferrelative="t" path="m@4@5l@4@11@9@11@9@5xe" filled="f" stroked="f">
                 <v:stroke joinstyle="miter"/>
@@ -6408,7 +6408,7 @@
               </wp:anchor>
             </w:drawing>
           </mc:Choice>
-          <mc:Fallback xmlns:w16du="http://schemas.microsoft.com/office/word/2023/wordml/word16du" xmlns:w16sdtfl="http://schemas.microsoft.com/office/word/2024/wordml/sdtformatlock">
+          <mc:Fallback xmlns:w16sdtfl="http://schemas.microsoft.com/office/word/2024/wordml/sdtformatlock" xmlns:w16du="http://schemas.microsoft.com/office/word/2023/wordml/word16du">
             <w:pict>
               <v:shape w14:anchorId="061103E0" id="Entrada de lápiz 3" o:spid="_x0000_s1026" type="#_x0000_t75" style="position:absolute;margin-left:65.5pt;margin-top:218.45pt;width:27.45pt;height:1.05pt;z-index:251664384;visibility:visible;mso-wrap-style:square;mso-wrap-distance-left:9pt;mso-wrap-distance-top:0;mso-wrap-distance-right:9pt;mso-wrap-distance-bottom:0;mso-position-horizontal:absolute;mso-position-horizontal-relative:text;mso-position-vertical:absolute;mso-position-vertical-relative:text" o:gfxdata="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">
                 <v:imagedata r:id="rId20" o:title=""/>
@@ -6453,7 +6453,7 @@
               </wp:anchor>
             </w:drawing>
           </mc:Choice>
-          <mc:Fallback xmlns:w16du="http://schemas.microsoft.com/office/word/2023/wordml/word16du" xmlns:w16sdtfl="http://schemas.microsoft.com/office/word/2024/wordml/sdtformatlock">
+          <mc:Fallback xmlns:w16sdtfl="http://schemas.microsoft.com/office/word/2024/wordml/sdtformatlock" xmlns:w16du="http://schemas.microsoft.com/office/word/2023/wordml/word16du">
             <w:pict>
               <v:shapetype w14:anchorId="26ED7025" id="_x0000_t75" coordsize="21600,21600" o:spt="75" o:preferrelative="t" path="m@4@5l@4@11@9@11@9@5xe" filled="f" stroked="f">
                 <v:stroke joinstyle="miter"/>
@@ -6550,7 +6550,7 @@
           <w:noProof/>
         </w:rPr>
         <w:drawing>
-          <wp:inline distT="0" distB="0" distL="0" distR="0" wp14:anchorId="4A834548" wp14:editId="67E4A581">
+          <wp:inline distT="0" distB="0" distL="0" distR="0" wp14:anchorId="4A834548" wp14:editId="62175790">
             <wp:extent cx="5396230" cy="3834130"/>
             <wp:effectExtent l="76200" t="76200" r="128270" b="128270"/>
             <wp:docPr id="433170619" name="Imagen 2"/>
@@ -6623,7 +6623,7 @@
           <w:noProof/>
         </w:rPr>
         <w:drawing>
-          <wp:inline distT="0" distB="0" distL="0" distR="0" wp14:anchorId="322F9951" wp14:editId="388BD7DA">
+          <wp:inline distT="0" distB="0" distL="0" distR="0" wp14:anchorId="322F9951" wp14:editId="73BAD8AD">
             <wp:extent cx="4621432" cy="3283620"/>
             <wp:effectExtent l="76200" t="76200" r="141605" b="126365"/>
             <wp:docPr id="784425407" name="Imagen 7"/>
@@ -6722,7 +6722,7 @@
           <w:noProof/>
         </w:rPr>
         <w:drawing>
-          <wp:inline distT="0" distB="0" distL="0" distR="0" wp14:anchorId="6F09FAA3" wp14:editId="1545F9C6">
+          <wp:inline distT="0" distB="0" distL="0" distR="0" wp14:anchorId="6F09FAA3" wp14:editId="02D9AC7D">
             <wp:extent cx="4461002" cy="3171884"/>
             <wp:effectExtent l="76200" t="76200" r="130175" b="123825"/>
             <wp:docPr id="1755659709" name="Imagen 12"/>
@@ -6869,7 +6869,7 @@
           <w:noProof/>
         </w:rPr>
         <w:drawing>
-          <wp:inline distT="0" distB="0" distL="0" distR="0" wp14:anchorId="5534E4D8" wp14:editId="4DCEE578">
+          <wp:inline distT="0" distB="0" distL="0" distR="0" wp14:anchorId="5534E4D8" wp14:editId="62EEEBD1">
             <wp:extent cx="4368895" cy="3106393"/>
             <wp:effectExtent l="76200" t="76200" r="127000" b="132715"/>
             <wp:docPr id="1844187693" name="Imagen 13"/>
@@ -6957,7 +6957,7 @@
           <w:noProof/>
         </w:rPr>
         <w:drawing>
-          <wp:inline distT="0" distB="0" distL="0" distR="0" wp14:anchorId="48AE76E1" wp14:editId="456BA612">
+          <wp:inline distT="0" distB="0" distL="0" distR="0" wp14:anchorId="48AE76E1" wp14:editId="75052F27">
             <wp:extent cx="4855490" cy="3452374"/>
             <wp:effectExtent l="76200" t="76200" r="135890" b="129540"/>
             <wp:docPr id="1526789695" name="Imagen 12" descr="Interfaz de usuario gráfica, Aplicación&#10;&#10;El contenido generado por IA puede ser incorrecto."/>
@@ -7030,7 +7030,7 @@
           <w:noProof/>
         </w:rPr>
         <w:drawing>
-          <wp:inline distT="0" distB="0" distL="0" distR="0" wp14:anchorId="6794A471" wp14:editId="50FE4360">
+          <wp:inline distT="0" distB="0" distL="0" distR="0" wp14:anchorId="6794A471" wp14:editId="0758CEE1">
             <wp:extent cx="4933366" cy="3507746"/>
             <wp:effectExtent l="76200" t="76200" r="133985" b="130810"/>
             <wp:docPr id="760556303" name="Imagen 1"/>
@@ -7104,7 +7104,7 @@
           <w:noProof/>
         </w:rPr>
         <w:drawing>
-          <wp:inline distT="0" distB="0" distL="0" distR="0" wp14:anchorId="41E0CD49" wp14:editId="548D6F93">
+          <wp:inline distT="0" distB="0" distL="0" distR="0" wp14:anchorId="41E0CD49" wp14:editId="5D830B63">
             <wp:extent cx="4989464" cy="3547635"/>
             <wp:effectExtent l="76200" t="76200" r="135255" b="129540"/>
             <wp:docPr id="272702160" name="Imagen 2"/>
@@ -7177,7 +7177,7 @@
           <w:noProof/>
         </w:rPr>
         <w:drawing>
-          <wp:inline distT="0" distB="0" distL="0" distR="0" wp14:anchorId="1DD9C742" wp14:editId="4F824B3E">
+          <wp:inline distT="0" distB="0" distL="0" distR="0" wp14:anchorId="1DD9C742" wp14:editId="56E9AC47">
             <wp:extent cx="5030649" cy="3576916"/>
             <wp:effectExtent l="76200" t="76200" r="132080" b="138430"/>
             <wp:docPr id="1519085843" name="Imagen 3"/>
@@ -7256,7 +7256,7 @@
           <w:noProof/>
         </w:rPr>
         <w:drawing>
-          <wp:inline distT="0" distB="0" distL="0" distR="0" wp14:anchorId="08C08F08" wp14:editId="0462707E">
+          <wp:inline distT="0" distB="0" distL="0" distR="0" wp14:anchorId="08C08F08" wp14:editId="371FB82F">
             <wp:extent cx="4873889" cy="3466106"/>
             <wp:effectExtent l="76200" t="76200" r="136525" b="134620"/>
             <wp:docPr id="1997279975" name="Imagen 1"/>
@@ -7332,7 +7332,7 @@
           <w:noProof/>
         </w:rPr>
         <w:drawing>
-          <wp:inline distT="0" distB="0" distL="0" distR="0" wp14:anchorId="68ACB7BF" wp14:editId="61D35B4C">
+          <wp:inline distT="0" distB="0" distL="0" distR="0" wp14:anchorId="68ACB7BF" wp14:editId="72AB77CC">
             <wp:extent cx="4862708" cy="3458154"/>
             <wp:effectExtent l="76200" t="76200" r="128905" b="142875"/>
             <wp:docPr id="1649579706" name="Imagen 2"/>
@@ -8734,11 +8734,55 @@
       </w:r>
     </w:p>
     <w:p>
+      <w:proofErr w:type="spellStart"/>
       <w:r>
         <w:lastRenderedPageBreak/>
+        <w:t>Webgrafia</w:t>
+      </w:r>
+      <w:proofErr w:type="spellEnd"/>
+      <w:r>
+        <w:t>:</w:t>
+      </w:r>
+    </w:p>
+    <w:p>
+      <w:proofErr w:type="spellStart"/>
+      <w:r>
+        <w:rPr>
+          <w:highlight w:val="yellow"/>
+        </w:rPr>
+        <w:t>react-oauth</w:t>
+      </w:r>
+      <w:r>
+        <w:rPr>
+          <w:highlight w:val="yellow"/>
+        </w:rPr>
+        <w:t>-</w:t>
+      </w:r>
+      <w:r>
+        <w:rPr>
+          <w:highlight w:val="yellow"/>
+        </w:rPr>
+        <w:t>google</w:t>
+      </w:r>
+      <w:proofErr w:type="spellEnd"/>
+    </w:p>
+    <w:p>
+      <w:hyperlink r:id="rId42" w:history="1">
+        <w:r>
+          <w:rPr>
+            <w:rStyle w:val="Hipervnculo"/>
+          </w:rPr>
+          <w:t>https://www.npmjs.com/package/@react-oauth/google</w:t>
+        </w:r>
+      </w:hyperlink>
+    </w:p>
+    <w:p/>
+    <w:p>
+      <w:r>
         <w:br w:type="page"/>
       </w:r>
     </w:p>
+    <w:p/>
     <w:p/>
     <w:p>
       <w:pPr>
@@ -8766,76 +8810,6 @@
             <wp:extent cx="5400040" cy="3430270"/>
             <wp:effectExtent l="0" t="0" r="0" b="0"/>
             <wp:docPr id="33" name="Imagen 33"/>
-            <wp:cNvGraphicFramePr>
-              <a:graphicFrameLocks xmlns:a="http://schemas.openxmlformats.org/drawingml/2006/main" noChangeAspect="1"/>
-            </wp:cNvGraphicFramePr>
-            <a:graphic xmlns:a="http://schemas.openxmlformats.org/drawingml/2006/main">
-              <a:graphicData uri="http://schemas.openxmlformats.org/drawingml/2006/picture">
-                <pic:pic xmlns:pic="http://schemas.openxmlformats.org/drawingml/2006/picture">
-                  <pic:nvPicPr>
-                    <pic:cNvPr id="1" name=""/>
-                    <pic:cNvPicPr/>
-                  </pic:nvPicPr>
-                  <pic:blipFill>
-                    <a:blip r:embed="rId42"/>
-                    <a:stretch>
-                      <a:fillRect/>
-                    </a:stretch>
-                  </pic:blipFill>
-                  <pic:spPr>
-                    <a:xfrm>
-                      <a:off x="0" y="0"/>
-                      <a:ext cx="5400040" cy="3430270"/>
-                    </a:xfrm>
-                    <a:prstGeom prst="rect">
-                      <a:avLst/>
-                    </a:prstGeom>
-                  </pic:spPr>
-                </pic:pic>
-              </a:graphicData>
-            </a:graphic>
-          </wp:inline>
-        </w:drawing>
-      </w:r>
-    </w:p>
-    <w:p>
-      <w:pPr>
-        <w:ind w:left="360"/>
-      </w:pPr>
-      <w:r>
-        <w:t>Creación de archivo .</w:t>
-      </w:r>
-      <w:proofErr w:type="spellStart"/>
-      <w:r>
-        <w:t>htaccess</w:t>
-      </w:r>
-      <w:proofErr w:type="spellEnd"/>
-    </w:p>
-    <w:p>
-      <w:pPr>
-        <w:pStyle w:val="Prrafodelista"/>
-        <w:numPr>
-          <w:ilvl w:val="1"/>
-          <w:numId w:val="6"/>
-        </w:numPr>
-      </w:pPr>
-      <w:r>
-        <w:t>Desde el panel de usuario opción para cambiar la contraseña</w:t>
-      </w:r>
-    </w:p>
-    <w:p>
-      <w:pPr>
-        <w:ind w:left="360"/>
-      </w:pPr>
-      <w:r>
-        <w:rPr>
-          <w:noProof/>
-        </w:rPr>
-        <w:drawing>
-          <wp:inline distT="0" distB="0" distL="0" distR="0" wp14:anchorId="47237619" wp14:editId="36767C8B">
-            <wp:extent cx="5363323" cy="704948"/>
-            <wp:effectExtent l="0" t="0" r="8890" b="0"/>
-            <wp:docPr id="4" name="Imagen 4"/>
             <wp:cNvGraphicFramePr>
               <a:graphicFrameLocks xmlns:a="http://schemas.openxmlformats.org/drawingml/2006/main" noChangeAspect="1"/>
             </wp:cNvGraphicFramePr>
@@ -8855,6 +8829,76 @@
                   <pic:spPr>
                     <a:xfrm>
                       <a:off x="0" y="0"/>
+                      <a:ext cx="5400040" cy="3430270"/>
+                    </a:xfrm>
+                    <a:prstGeom prst="rect">
+                      <a:avLst/>
+                    </a:prstGeom>
+                  </pic:spPr>
+                </pic:pic>
+              </a:graphicData>
+            </a:graphic>
+          </wp:inline>
+        </w:drawing>
+      </w:r>
+    </w:p>
+    <w:p>
+      <w:pPr>
+        <w:ind w:left="360"/>
+      </w:pPr>
+      <w:r>
+        <w:t>Creación de archivo .</w:t>
+      </w:r>
+      <w:proofErr w:type="spellStart"/>
+      <w:r>
+        <w:t>htaccess</w:t>
+      </w:r>
+      <w:proofErr w:type="spellEnd"/>
+    </w:p>
+    <w:p>
+      <w:pPr>
+        <w:pStyle w:val="Prrafodelista"/>
+        <w:numPr>
+          <w:ilvl w:val="1"/>
+          <w:numId w:val="6"/>
+        </w:numPr>
+      </w:pPr>
+      <w:r>
+        <w:t>Desde el panel de usuario opción para cambiar la contraseña</w:t>
+      </w:r>
+    </w:p>
+    <w:p>
+      <w:pPr>
+        <w:ind w:left="360"/>
+      </w:pPr>
+      <w:r>
+        <w:rPr>
+          <w:noProof/>
+        </w:rPr>
+        <w:drawing>
+          <wp:inline distT="0" distB="0" distL="0" distR="0" wp14:anchorId="47237619" wp14:editId="36767C8B">
+            <wp:extent cx="5363323" cy="704948"/>
+            <wp:effectExtent l="0" t="0" r="8890" b="0"/>
+            <wp:docPr id="4" name="Imagen 4"/>
+            <wp:cNvGraphicFramePr>
+              <a:graphicFrameLocks xmlns:a="http://schemas.openxmlformats.org/drawingml/2006/main" noChangeAspect="1"/>
+            </wp:cNvGraphicFramePr>
+            <a:graphic xmlns:a="http://schemas.openxmlformats.org/drawingml/2006/main">
+              <a:graphicData uri="http://schemas.openxmlformats.org/drawingml/2006/picture">
+                <pic:pic xmlns:pic="http://schemas.openxmlformats.org/drawingml/2006/picture">
+                  <pic:nvPicPr>
+                    <pic:cNvPr id="1" name=""/>
+                    <pic:cNvPicPr/>
+                  </pic:nvPicPr>
+                  <pic:blipFill>
+                    <a:blip r:embed="rId44"/>
+                    <a:stretch>
+                      <a:fillRect/>
+                    </a:stretch>
+                  </pic:blipFill>
+                  <pic:spPr>
+                    <a:xfrm>
+                      <a:off x="0" y="0"/>
                       <a:ext cx="5363323" cy="704948"/>
                     </a:xfrm>
                     <a:prstGeom prst="rect">
@@ -8972,6 +9016,7 @@
           <w:i/>
           <w:iCs/>
         </w:rPr>
+        <w:lastRenderedPageBreak/>
         <w:t>Qué es:</w:t>
       </w:r>
       <w:r>
@@ -8998,7 +9043,6 @@
           <w:i/>
           <w:iCs/>
         </w:rPr>
-        <w:lastRenderedPageBreak/>
         <w:t>Por qué:</w:t>
       </w:r>
       <w:r>
@@ -9412,6 +9456,7 @@
           <w:i/>
           <w:iCs/>
         </w:rPr>
+        <w:lastRenderedPageBreak/>
         <w:t>Por qué:</w:t>
       </w:r>
       <w:r>
@@ -9445,7 +9490,6 @@
           <w:i/>
           <w:iCs/>
         </w:rPr>
-        <w:lastRenderedPageBreak/>
         <w:t>Qué es:</w:t>
       </w:r>
       <w:r>
@@ -9921,6 +9965,7 @@
           <w:i/>
           <w:iCs/>
         </w:rPr>
+        <w:lastRenderedPageBreak/>
         <w:t>Por qué:</w:t>
       </w:r>
       <w:r>
@@ -9970,7 +10015,6 @@
           <w:i/>
           <w:iCs/>
         </w:rPr>
-        <w:lastRenderedPageBreak/>
         <w:t>Qué es:</w:t>
       </w:r>
       <w:r>
@@ -10013,7 +10057,7 @@
       </w:pPr>
     </w:p>
     <w:sectPr>
-      <w:headerReference w:type="default" r:id="rId44"/>
+      <w:headerReference w:type="default" r:id="rId45"/>
       <w:pgSz w:w="11906" w:h="16838"/>
       <w:pgMar w:top="1417" w:right="1701" w:bottom="1417" w:left="1701" w:header="708" w:footer="708" w:gutter="0"/>
       <w:pgNumType w:start="0"/>

</xml_diff>

<commit_message>
actualizacion documentacion del proyecto
</commit_message>
<xml_diff>
--- a/proyecto.docx
+++ b/proyecto.docx
@@ -1,6 +1,6 @@
 
 <file path=word/document.xml><?xml version="1.0" encoding="utf-8"?>
-<w:document xmlns:wpc="http://schemas.microsoft.com/office/word/2010/wordprocessingCanvas" xmlns:cx="http://schemas.microsoft.com/office/drawing/2014/chartex" xmlns:cx1="http://schemas.microsoft.com/office/drawing/2015/9/8/chartex" xmlns:cx2="http://schemas.microsoft.com/office/drawing/2015/10/21/chartex" xmlns:cx3="http://schemas.microsoft.com/office/drawing/2016/5/9/chartex" xmlns:cx4="http://schemas.microsoft.com/office/drawing/2016/5/10/chartex" xmlns:cx5="http://schemas.microsoft.com/office/drawing/2016/5/11/chartex" xmlns:cx6="http://schemas.microsoft.com/office/drawing/2016/5/12/chartex" xmlns:cx7="http://schemas.microsoft.com/office/drawing/2016/5/13/chartex" xmlns:cx8="http://schemas.microsoft.com/office/drawing/2016/5/14/chartex" xmlns:mc="http://schemas.openxmlformats.org/markup-compatibility/2006" xmlns:aink="http://schemas.microsoft.com/office/drawing/2016/ink" xmlns:am3d="http://schemas.microsoft.com/office/drawing/2017/model3d" xmlns:o="urn:schemas-microsoft-com:office:office" xmlns:oel="http://schemas.microsoft.com/office/2019/extlst" xmlns:r="http://schemas.openxmlformats.org/officeDocument/2006/relationships" xmlns:m="http://schemas.openxmlformats.org/officeDocument/2006/math" xmlns:v="urn:schemas-microsoft-com:vml" xmlns:wp14="http://schemas.microsoft.com/office/word/2010/wordprocessingDrawing" xmlns:wp="http://schemas.openxmlformats.org/drawingml/2006/wordprocessingDrawing" xmlns:w10="urn:schemas-microsoft-com:office:word" xmlns:w="http://schemas.openxmlformats.org/wordprocessingml/2006/main" xmlns:w14="http://schemas.microsoft.com/office/word/2010/wordml" xmlns:w15="http://schemas.microsoft.com/office/word/2012/wordml" xmlns:w16cex="http://schemas.microsoft.com/office/word/2018/wordml/cex" xmlns:w16cid="http://schemas.microsoft.com/office/word/2016/wordml/cid" xmlns:w16="http://schemas.microsoft.com/office/word/2018/wordml" xmlns:w16sdtdh="http://schemas.microsoft.com/office/word/2020/wordml/sdtdatahash" xmlns:w16se="http://schemas.microsoft.com/office/word/2015/wordml/symex" xmlns:wpg="http://schemas.microsoft.com/office/word/2010/wordprocessingGroup" xmlns:wpi="http://schemas.microsoft.com/office/word/2010/wordprocessingInk" xmlns:wne="http://schemas.microsoft.com/office/word/2006/wordml" xmlns:wps="http://schemas.microsoft.com/office/word/2010/wordprocessingShape" mc:Ignorable="w14 w15 w16se w16cid w16 w16cex w16sdtdh wp14">
+<w:document xmlns:wpc="http://schemas.microsoft.com/office/word/2010/wordprocessingCanvas" xmlns:cx="http://schemas.microsoft.com/office/drawing/2014/chartex" xmlns:cx1="http://schemas.microsoft.com/office/drawing/2015/9/8/chartex" xmlns:cx2="http://schemas.microsoft.com/office/drawing/2015/10/21/chartex" xmlns:cx3="http://schemas.microsoft.com/office/drawing/2016/5/9/chartex" xmlns:cx4="http://schemas.microsoft.com/office/drawing/2016/5/10/chartex" xmlns:cx5="http://schemas.microsoft.com/office/drawing/2016/5/11/chartex" xmlns:cx6="http://schemas.microsoft.com/office/drawing/2016/5/12/chartex" xmlns:cx7="http://schemas.microsoft.com/office/drawing/2016/5/13/chartex" xmlns:cx8="http://schemas.microsoft.com/office/drawing/2016/5/14/chartex" xmlns:mc="http://schemas.openxmlformats.org/markup-compatibility/2006" xmlns:aink="http://schemas.microsoft.com/office/drawing/2016/ink" xmlns:am3d="http://schemas.microsoft.com/office/drawing/2017/model3d" xmlns:o="urn:schemas-microsoft-com:office:office" xmlns:oel="http://schemas.microsoft.com/office/2019/extlst" xmlns:r="http://schemas.openxmlformats.org/officeDocument/2006/relationships" xmlns:m="http://schemas.openxmlformats.org/officeDocument/2006/math" xmlns:v="urn:schemas-microsoft-com:vml" xmlns:wp14="http://schemas.microsoft.com/office/word/2010/wordprocessingDrawing" xmlns:wp="http://schemas.openxmlformats.org/drawingml/2006/wordprocessingDrawing" xmlns:w10="urn:schemas-microsoft-com:office:word" xmlns:w="http://schemas.openxmlformats.org/wordprocessingml/2006/main" xmlns:w14="http://schemas.microsoft.com/office/word/2010/wordml" xmlns:w15="http://schemas.microsoft.com/office/word/2012/wordml" xmlns:w16cex="http://schemas.microsoft.com/office/word/2018/wordml/cex" xmlns:w16cid="http://schemas.microsoft.com/office/word/2016/wordml/cid" xmlns:w16="http://schemas.microsoft.com/office/word/2018/wordml" xmlns:w16du="http://schemas.microsoft.com/office/word/2023/wordml/word16du" xmlns:w16sdtdh="http://schemas.microsoft.com/office/word/2020/wordml/sdtdatahash" xmlns:w16sdtfl="http://schemas.microsoft.com/office/word/2024/wordml/sdtformatlock" xmlns:w16se="http://schemas.microsoft.com/office/word/2015/wordml/symex" xmlns:wpg="http://schemas.microsoft.com/office/word/2010/wordprocessingGroup" xmlns:wpi="http://schemas.microsoft.com/office/word/2010/wordprocessingInk" xmlns:wne="http://schemas.microsoft.com/office/word/2006/wordml" xmlns:wps="http://schemas.microsoft.com/office/word/2010/wordprocessingShape" mc:Ignorable="w14 w15 w16se w16cid w16 w16cex w16sdtdh w16sdtfl w16du wp14">
   <w:body>
     <w:sdt>
       <w:sdtPr>
@@ -3347,7 +3347,7 @@
                   </wp:anchor>
                 </w:drawing>
               </mc:Choice>
-              <mc:Fallback xmlns:w16sdtfl="http://schemas.microsoft.com/office/word/2024/wordml/sdtformatlock" xmlns:w16du="http://schemas.microsoft.com/office/word/2023/wordml/word16du">
+              <mc:Fallback>
                 <w:pict>
                   <v:group w14:anchorId="07305E3A" id="Grupo 26" o:spid="_x0000_s1026" style="position:absolute;margin-left:0;margin-top:0;width:168pt;height:718.55pt;z-index:-251643904;mso-height-percent:950;mso-left-percent:40;mso-position-horizontal-relative:page;mso-position-vertical:center;mso-position-vertical-relative:page;mso-height-percent:950;mso-left-percent:40" coordsize="21336,91257" o:gfxdata="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">
                     <v:rect id="Rectángulo 3" o:spid="_x0000_s1027" style="position:absolute;width:1945;height:91257;visibility:visible;mso-wrap-style:square;v-text-anchor:middle" o:gfxdata="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" fillcolor="#0e2841 [3215]" stroked="f" strokeweight="1.5pt"/>
@@ -3550,6 +3550,7 @@
                                     <w:dataBinding w:prefixMappings="xmlns:ns0='http://purl.org/dc/elements/1.1/' xmlns:ns1='http://schemas.openxmlformats.org/package/2006/metadata/core-properties' " w:xpath="/ns1:coreProperties[1]/ns0:creator[1]" w:storeItemID="{6C3C8BC8-F283-45AE-878A-BAB7291924A1}"/>
                                     <w:text/>
                                   </w:sdtPr>
+                                  <w:sdtEndPr/>
                                   <w:sdtContent>
                                     <w:r>
                                       <w:rPr>
@@ -3585,6 +3586,7 @@
                                     <w:dataBinding w:prefixMappings="xmlns:ns0='http://schemas.openxmlformats.org/officeDocument/2006/extended-properties' " w:xpath="/ns0:Properties[1]/ns0:Company[1]" w:storeItemID="{6668398D-A668-4E3E-A5EB-62B293D839F1}"/>
                                     <w:text/>
                                   </w:sdtPr>
+                                  <w:sdtEndPr/>
                                   <w:sdtContent>
                                     <w:r>
                                       <w:rPr>
@@ -3649,6 +3651,7 @@
                               <w:dataBinding w:prefixMappings="xmlns:ns0='http://purl.org/dc/elements/1.1/' xmlns:ns1='http://schemas.openxmlformats.org/package/2006/metadata/core-properties' " w:xpath="/ns1:coreProperties[1]/ns0:creator[1]" w:storeItemID="{6C3C8BC8-F283-45AE-878A-BAB7291924A1}"/>
                               <w:text/>
                             </w:sdtPr>
+                            <w:sdtEndPr/>
                             <w:sdtContent>
                               <w:r>
                                 <w:rPr>
@@ -3684,6 +3687,7 @@
                               <w:dataBinding w:prefixMappings="xmlns:ns0='http://schemas.openxmlformats.org/officeDocument/2006/extended-properties' " w:xpath="/ns0:Properties[1]/ns0:Company[1]" w:storeItemID="{6668398D-A668-4E3E-A5EB-62B293D839F1}"/>
                               <w:text/>
                             </w:sdtPr>
+                            <w:sdtEndPr/>
                             <w:sdtContent>
                               <w:r>
                                 <w:rPr>
@@ -3800,6 +3804,7 @@
                                     <w:dataBinding w:prefixMappings="xmlns:ns0='http://purl.org/dc/elements/1.1/' xmlns:ns1='http://schemas.openxmlformats.org/package/2006/metadata/core-properties' " w:xpath="/ns1:coreProperties[1]/ns0:title[1]" w:storeItemID="{6C3C8BC8-F283-45AE-878A-BAB7291924A1}"/>
                                     <w:text/>
                                   </w:sdtPr>
+                                  <w:sdtEndPr/>
                                   <w:sdtContent>
                                     <w:r>
                                       <w:rPr>
@@ -3835,6 +3840,7 @@
                                     <w:dataBinding w:prefixMappings="xmlns:ns0='http://purl.org/dc/elements/1.1/' xmlns:ns1='http://schemas.openxmlformats.org/package/2006/metadata/core-properties' " w:xpath="/ns1:coreProperties[1]/ns0:subject[1]" w:storeItemID="{6C3C8BC8-F283-45AE-878A-BAB7291924A1}"/>
                                     <w:text/>
                                   </w:sdtPr>
+                                  <w:sdtEndPr/>
                                   <w:sdtContent>
                                     <w:r>
                                       <w:rPr>
@@ -3896,6 +3902,7 @@
                               <w:dataBinding w:prefixMappings="xmlns:ns0='http://purl.org/dc/elements/1.1/' xmlns:ns1='http://schemas.openxmlformats.org/package/2006/metadata/core-properties' " w:xpath="/ns1:coreProperties[1]/ns0:title[1]" w:storeItemID="{6C3C8BC8-F283-45AE-878A-BAB7291924A1}"/>
                               <w:text/>
                             </w:sdtPr>
+                            <w:sdtEndPr/>
                             <w:sdtContent>
                               <w:r>
                                 <w:rPr>
@@ -3931,6 +3938,7 @@
                               <w:dataBinding w:prefixMappings="xmlns:ns0='http://purl.org/dc/elements/1.1/' xmlns:ns1='http://schemas.openxmlformats.org/package/2006/metadata/core-properties' " w:xpath="/ns1:coreProperties[1]/ns0:subject[1]" w:storeItemID="{6C3C8BC8-F283-45AE-878A-BAB7291924A1}"/>
                               <w:text/>
                             </w:sdtPr>
+                            <w:sdtEndPr/>
                             <w:sdtContent>
                               <w:r>
                                 <w:rPr>
@@ -4498,13 +4506,8 @@
         <w:t xml:space="preserve">de "Recomendados para ti" </w:t>
       </w:r>
       <w:r>
-        <w:t xml:space="preserve">estará en </w:t>
-      </w:r>
-      <w:proofErr w:type="gramStart"/>
-      <w:r>
-        <w:t>la home</w:t>
-      </w:r>
-      <w:proofErr w:type="gramEnd"/>
+        <w:t>estará en la home</w:t>
+      </w:r>
       <w:r>
         <w:t xml:space="preserve"> del usuario</w:t>
       </w:r>
@@ -4614,15 +4617,7 @@
         <w:t xml:space="preserve">libros relacionados </w:t>
       </w:r>
       <w:r>
-        <w:t>sin coste (PDF/</w:t>
-      </w:r>
-      <w:proofErr w:type="spellStart"/>
-      <w:r>
-        <w:t>ePub</w:t>
-      </w:r>
-      <w:proofErr w:type="spellEnd"/>
-      <w:r>
-        <w:t>).</w:t>
+        <w:t>sin coste (PDF/ePub).</w:t>
       </w:r>
     </w:p>
     <w:p>
@@ -4845,13 +4840,8 @@
       <w:pPr>
         <w:pStyle w:val="Ttulo3"/>
       </w:pPr>
-      <w:proofErr w:type="spellStart"/>
-      <w:r>
-        <w:t>FrontEnd</w:t>
-      </w:r>
-      <w:proofErr w:type="spellEnd"/>
-      <w:r>
-        <w:t xml:space="preserve"> </w:t>
+      <w:r>
+        <w:t xml:space="preserve">FrontEnd </w:t>
       </w:r>
     </w:p>
     <w:p>
@@ -4929,13 +4919,8 @@
       <w:pPr>
         <w:pStyle w:val="Ttulo4"/>
       </w:pPr>
-      <w:proofErr w:type="spellStart"/>
-      <w:r>
-        <w:t>Frameworks</w:t>
-      </w:r>
-      <w:proofErr w:type="spellEnd"/>
-      <w:r>
-        <w:t xml:space="preserve"> y Librerías:</w:t>
+      <w:r>
+        <w:t>Frameworks y Librerías:</w:t>
       </w:r>
     </w:p>
     <w:p>
@@ -4958,26 +4943,18 @@
         <w:ind w:left="1080"/>
       </w:pPr>
       <w:r>
-        <w:t xml:space="preserve">He escogido </w:t>
-      </w:r>
-      <w:proofErr w:type="spellStart"/>
-      <w:r>
-        <w:t>React</w:t>
-      </w:r>
-      <w:proofErr w:type="spellEnd"/>
+        <w:t xml:space="preserve">He escogido React </w:t>
+      </w:r>
+      <w:r>
+        <w:t xml:space="preserve">por su arquitectura basada en </w:t>
+      </w:r>
+      <w:r>
+        <w:t>componentes</w:t>
+      </w:r>
       <w:r>
         <w:t xml:space="preserve"> </w:t>
       </w:r>
       <w:r>
-        <w:t xml:space="preserve">por su arquitectura basada en </w:t>
-      </w:r>
-      <w:r>
-        <w:t>componentes</w:t>
-      </w:r>
-      <w:r>
-        <w:t xml:space="preserve"> </w:t>
-      </w:r>
-      <w:r>
         <w:t>reutilizables</w:t>
       </w:r>
       <w:r>
@@ -4987,15 +4964,7 @@
         <w:t>Con él, implementaré</w:t>
       </w:r>
       <w:r>
-        <w:t xml:space="preserve"> una Single Page </w:t>
-      </w:r>
-      <w:proofErr w:type="spellStart"/>
-      <w:r>
-        <w:t>Application</w:t>
-      </w:r>
-      <w:proofErr w:type="spellEnd"/>
-      <w:r>
-        <w:t xml:space="preserve"> (SPA) para garantizar una navegación fluida sin recargas de página.</w:t>
+        <w:t xml:space="preserve"> una Single Page Application (SPA) para garantizar una navegación fluida sin recargas de página.</w:t>
       </w:r>
     </w:p>
     <w:p>
@@ -5018,15 +4987,7 @@
         <w:t>Utilizare</w:t>
       </w:r>
       <w:r>
-        <w:t xml:space="preserve"> Bootstrap 5 (la librería </w:t>
-      </w:r>
-      <w:proofErr w:type="spellStart"/>
-      <w:r>
-        <w:t>react-bootstrap</w:t>
-      </w:r>
-      <w:proofErr w:type="spellEnd"/>
-      <w:r>
-        <w:t xml:space="preserve"> o clases nativas) para el diseño responsive y el uso de variables CSS para la identidad visual.</w:t>
+        <w:t xml:space="preserve"> Bootstrap 5 (la librería react-bootstrap o clases nativas) para el diseño responsive y el uso de variables CSS para la identidad visual.</w:t>
       </w:r>
     </w:p>
     <w:p>
@@ -5067,14 +5028,9 @@
       <w:pPr>
         <w:pStyle w:val="Ttulo3"/>
       </w:pPr>
-      <w:proofErr w:type="spellStart"/>
       <w:r>
         <w:lastRenderedPageBreak/>
-        <w:t>BackEnd</w:t>
-      </w:r>
-      <w:proofErr w:type="spellEnd"/>
-      <w:r>
-        <w:t xml:space="preserve"> (Lado del Servidor)</w:t>
+        <w:t>BackEnd (Lado del Servidor)</w:t>
       </w:r>
     </w:p>
     <w:p>
@@ -5109,11 +5065,9 @@
       <w:r>
         <w:t xml:space="preserve">Utilizaré la herramienta </w:t>
       </w:r>
-      <w:proofErr w:type="spellStart"/>
       <w:r>
         <w:t>axios</w:t>
       </w:r>
-      <w:proofErr w:type="spellEnd"/>
     </w:p>
     <w:p>
       <w:pPr>
@@ -5183,15 +5137,7 @@
         <w:t>API REST</w:t>
       </w:r>
       <w:r>
-        <w:t>. Se encargará de crear las "rutas" (</w:t>
-      </w:r>
-      <w:proofErr w:type="spellStart"/>
-      <w:r>
-        <w:t>endpoints</w:t>
-      </w:r>
-      <w:proofErr w:type="spellEnd"/>
-      <w:r>
-        <w:t>) como:</w:t>
+        <w:t>. Se encargará de crear las "rutas" (endpoints) como:</w:t>
       </w:r>
     </w:p>
     <w:p>
@@ -5213,15 +5159,7 @@
         </w:numPr>
       </w:pPr>
       <w:r>
-        <w:t>/api/</w:t>
-      </w:r>
-      <w:proofErr w:type="spellStart"/>
-      <w:r>
-        <w:t>login</w:t>
-      </w:r>
-      <w:proofErr w:type="spellEnd"/>
-      <w:r>
-        <w:t xml:space="preserve"> (verifica usuario y contraseña).</w:t>
+        <w:t>/api/login (verifica usuario y contraseña).</w:t>
       </w:r>
     </w:p>
     <w:p>
@@ -5272,15 +5210,7 @@
         </w:numPr>
       </w:pPr>
       <w:r>
-        <w:t xml:space="preserve">Modelado de Datos (ODM): </w:t>
-      </w:r>
-      <w:proofErr w:type="spellStart"/>
-      <w:r>
-        <w:t>Mongoose</w:t>
-      </w:r>
-      <w:proofErr w:type="spellEnd"/>
-      <w:r>
-        <w:t>.</w:t>
+        <w:t>Modelado de Datos (ODM): Mongoose.</w:t>
       </w:r>
     </w:p>
     <w:p>
@@ -5324,15 +5254,7 @@
         <w:ind w:left="1080"/>
       </w:pPr>
       <w:r>
-        <w:t xml:space="preserve">Para manejar las sesiones. Cuando el usuario se </w:t>
-      </w:r>
-      <w:proofErr w:type="spellStart"/>
-      <w:r>
-        <w:t>loguea</w:t>
-      </w:r>
-      <w:proofErr w:type="spellEnd"/>
-      <w:r>
-        <w:t xml:space="preserve"> para recibir recomendaciones, el sistema le da un "token" seguro para navegar sin tener </w:t>
+        <w:t xml:space="preserve">Para manejar las sesiones. Cuando el usuario se loguea para recibir recomendaciones, el sistema le da un "token" seguro para navegar sin tener </w:t>
       </w:r>
       <w:r>
         <w:t xml:space="preserve">que introducir </w:t>
@@ -5349,27 +5271,17 @@
           <w:numId w:val="9"/>
         </w:numPr>
       </w:pPr>
-      <w:proofErr w:type="spellStart"/>
       <w:r>
         <w:lastRenderedPageBreak/>
-        <w:t>Bcrypt</w:t>
-      </w:r>
-      <w:proofErr w:type="spellEnd"/>
-      <w:r>
-        <w:t>:</w:t>
+        <w:t>Bcrypt:</w:t>
       </w:r>
     </w:p>
     <w:p>
       <w:pPr>
         <w:ind w:left="1080"/>
       </w:pPr>
-      <w:proofErr w:type="spellStart"/>
-      <w:r>
-        <w:t>Bcrypt</w:t>
-      </w:r>
-      <w:proofErr w:type="spellEnd"/>
-      <w:r>
-        <w:t>:</w:t>
+      <w:r>
+        <w:t>Bcrypt:</w:t>
       </w:r>
       <w:r>
         <w:t xml:space="preserve"> Para encriptar las contraseñas en la base de datos (fundamental para la seguridad de los usuarios).</w:t>
@@ -5380,15 +5292,7 @@
         <w:pStyle w:val="Ttulo4"/>
       </w:pPr>
       <w:r>
-        <w:t xml:space="preserve">Gestión de </w:t>
-      </w:r>
-      <w:proofErr w:type="spellStart"/>
-      <w:r>
-        <w:t>APIs</w:t>
-      </w:r>
-      <w:proofErr w:type="spellEnd"/>
-      <w:r>
-        <w:t xml:space="preserve"> Externas (Proxy):</w:t>
+        <w:t>Gestión de APIs Externas (Proxy):</w:t>
       </w:r>
     </w:p>
     <w:p>
@@ -5396,23 +5300,7 @@
         <w:ind w:left="1080"/>
       </w:pPr>
       <w:r>
-        <w:t xml:space="preserve">El servidor actuará como intermediario para conectar con servicios de terceros (Google </w:t>
-      </w:r>
-      <w:proofErr w:type="spellStart"/>
-      <w:r>
-        <w:t>Books</w:t>
-      </w:r>
-      <w:proofErr w:type="spellEnd"/>
-      <w:r>
-        <w:t xml:space="preserve">, </w:t>
-      </w:r>
-      <w:proofErr w:type="spellStart"/>
-      <w:r>
-        <w:t>Gutendex</w:t>
-      </w:r>
-      <w:proofErr w:type="spellEnd"/>
-      <w:r>
-        <w:t>), garantizando la seguridad de las claves y evitando problemas de CORS en el navegador.</w:t>
+        <w:t>El servidor actuará como intermediario para conectar con servicios de terceros (Google Books, Gutendex), garantizando la seguridad de las claves y evitando problemas de CORS en el navegador.</w:t>
       </w:r>
     </w:p>
     <w:p>
@@ -5424,15 +5312,7 @@
         </w:numPr>
       </w:pPr>
       <w:r>
-        <w:t xml:space="preserve">Google </w:t>
-      </w:r>
-      <w:proofErr w:type="spellStart"/>
-      <w:r>
-        <w:t>Books</w:t>
-      </w:r>
-      <w:proofErr w:type="spellEnd"/>
-      <w:r>
-        <w:t xml:space="preserve"> API: </w:t>
+        <w:t xml:space="preserve">Google Books API: </w:t>
       </w:r>
     </w:p>
     <w:p>
@@ -5451,13 +5331,8 @@
           <w:numId w:val="9"/>
         </w:numPr>
       </w:pPr>
-      <w:proofErr w:type="spellStart"/>
-      <w:r>
-        <w:t>Gutendex</w:t>
-      </w:r>
-      <w:proofErr w:type="spellEnd"/>
-      <w:r>
-        <w:t xml:space="preserve"> (Project Gutenberg): </w:t>
+      <w:r>
+        <w:t xml:space="preserve">Gutendex (Project Gutenberg): </w:t>
       </w:r>
     </w:p>
     <w:p>
@@ -5465,15 +5340,7 @@
         <w:ind w:left="720"/>
       </w:pPr>
       <w:r>
-        <w:t>Utilizada exclusivamente para la sección de "Libros Gratuitos", proporcionando los enlaces directos de descarga en formatos electrónicos (</w:t>
-      </w:r>
-      <w:proofErr w:type="spellStart"/>
-      <w:r>
-        <w:t>ePub</w:t>
-      </w:r>
-      <w:proofErr w:type="spellEnd"/>
-      <w:r>
-        <w:t>, PDF).</w:t>
+        <w:t>Utilizada exclusivamente para la sección de "Libros Gratuitos", proporcionando los enlaces directos de descarga en formatos electrónicos (ePub, PDF).</w:t>
       </w:r>
     </w:p>
     <w:p>
@@ -5540,27 +5407,7 @@
           <w:sz w:val="20"/>
           <w:szCs w:val="20"/>
         </w:rPr>
-        <w:t xml:space="preserve">Nota: Cada uno de los apartados incluidos dentro de explorar abren diferentes vistas, idénticas a la página </w:t>
-      </w:r>
-      <w:proofErr w:type="gramStart"/>
-      <w:r>
-        <w:rPr>
-          <w:b/>
-          <w:bCs/>
-          <w:sz w:val="20"/>
-          <w:szCs w:val="20"/>
-        </w:rPr>
-        <w:t>principal</w:t>
-      </w:r>
-      <w:proofErr w:type="gramEnd"/>
-      <w:r>
-        <w:rPr>
-          <w:b/>
-          <w:bCs/>
-          <w:sz w:val="20"/>
-          <w:szCs w:val="20"/>
-        </w:rPr>
-        <w:t xml:space="preserve"> pero con diferente título y contenido: </w:t>
+        <w:t xml:space="preserve">Nota: Cada uno de los apartados incluidos dentro de explorar abren diferentes vistas, idénticas a la página principal pero con diferente título y contenido: </w:t>
       </w:r>
     </w:p>
     <w:p>
@@ -5569,7 +5416,7 @@
           <w:noProof/>
         </w:rPr>
         <w:drawing>
-          <wp:inline distT="0" distB="0" distL="0" distR="0" wp14:anchorId="3A9F5494" wp14:editId="620B4929">
+          <wp:inline distT="0" distB="0" distL="0" distR="0" wp14:anchorId="3A9F5494" wp14:editId="4533A3C4">
             <wp:extent cx="4443624" cy="3161307"/>
             <wp:effectExtent l="76200" t="76200" r="128905" b="134620"/>
             <wp:docPr id="935891741" name="Imagen 1"/>
@@ -5722,7 +5569,7 @@
           <w:noProof/>
         </w:rPr>
         <w:drawing>
-          <wp:inline distT="0" distB="0" distL="0" distR="0" wp14:anchorId="6CC8F11D" wp14:editId="4AA2C924">
+          <wp:inline distT="0" distB="0" distL="0" distR="0" wp14:anchorId="6CC8F11D" wp14:editId="6CF67000">
             <wp:extent cx="5396230" cy="3834130"/>
             <wp:effectExtent l="76200" t="76200" r="128270" b="128270"/>
             <wp:docPr id="1285130325" name="Imagen 3"/>
@@ -5878,7 +5725,7 @@
           <w:noProof/>
         </w:rPr>
         <w:drawing>
-          <wp:inline distT="0" distB="0" distL="0" distR="0" wp14:anchorId="100023D7" wp14:editId="5A13F4CA">
+          <wp:inline distT="0" distB="0" distL="0" distR="0" wp14:anchorId="100023D7" wp14:editId="4FC252FC">
             <wp:extent cx="4772025" cy="3395500"/>
             <wp:effectExtent l="95250" t="95250" r="85725" b="90805"/>
             <wp:docPr id="418913" name="Imagen 8"/>
@@ -5961,7 +5808,7 @@
           <w:noProof/>
         </w:rPr>
         <w:drawing>
-          <wp:inline distT="0" distB="0" distL="0" distR="0" wp14:anchorId="252BBB8C" wp14:editId="3F70810F">
+          <wp:inline distT="0" distB="0" distL="0" distR="0" wp14:anchorId="252BBB8C" wp14:editId="5879B284">
             <wp:extent cx="4974873" cy="3539836"/>
             <wp:effectExtent l="76200" t="76200" r="130810" b="137160"/>
             <wp:docPr id="913894690" name="Imagen 7"/>
@@ -6037,7 +5884,7 @@
           <w:noProof/>
         </w:rPr>
         <w:drawing>
-          <wp:inline distT="0" distB="0" distL="0" distR="0" wp14:anchorId="1C3A36F7" wp14:editId="348723AD">
+          <wp:inline distT="0" distB="0" distL="0" distR="0" wp14:anchorId="1C3A36F7" wp14:editId="6FDBA5EF">
             <wp:extent cx="4949839" cy="3522023"/>
             <wp:effectExtent l="76200" t="76200" r="136525" b="135890"/>
             <wp:docPr id="1340598956" name="Imagen 1"/>
@@ -6296,15 +6143,7 @@
         <w:t>” Mostrarán los libros dentro del pro</w:t>
       </w:r>
       <w:r>
-        <w:t xml:space="preserve">pio carrusel sin recargar la </w:t>
-      </w:r>
-      <w:proofErr w:type="spellStart"/>
-      <w:r>
-        <w:t>pagina</w:t>
-      </w:r>
-      <w:proofErr w:type="spellEnd"/>
-      <w:r>
-        <w:t>.</w:t>
+        <w:t>pio carrusel sin recargar la pagina.</w:t>
       </w:r>
     </w:p>
     <w:p>
@@ -6344,7 +6183,7 @@
               </wp:anchor>
             </w:drawing>
           </mc:Choice>
-          <mc:Fallback xmlns:w16sdtfl="http://schemas.microsoft.com/office/word/2024/wordml/sdtformatlock" xmlns:w16du="http://schemas.microsoft.com/office/word/2023/wordml/word16du">
+          <mc:Fallback>
             <w:pict>
               <v:shapetype w14:anchorId="49C09E3A" id="_x0000_t75" coordsize="21600,21600" o:spt="75" o:preferrelative="t" path="m@4@5l@4@11@9@11@9@5xe" filled="f" stroked="f">
                 <v:stroke joinstyle="miter"/>
@@ -6408,7 +6247,7 @@
               </wp:anchor>
             </w:drawing>
           </mc:Choice>
-          <mc:Fallback xmlns:w16sdtfl="http://schemas.microsoft.com/office/word/2024/wordml/sdtformatlock" xmlns:w16du="http://schemas.microsoft.com/office/word/2023/wordml/word16du">
+          <mc:Fallback>
             <w:pict>
               <v:shape w14:anchorId="061103E0" id="Entrada de lápiz 3" o:spid="_x0000_s1026" type="#_x0000_t75" style="position:absolute;margin-left:65.5pt;margin-top:218.45pt;width:27.45pt;height:1.05pt;z-index:251664384;visibility:visible;mso-wrap-style:square;mso-wrap-distance-left:9pt;mso-wrap-distance-top:0;mso-wrap-distance-right:9pt;mso-wrap-distance-bottom:0;mso-position-horizontal:absolute;mso-position-horizontal-relative:text;mso-position-vertical:absolute;mso-position-vertical-relative:text" o:gfxdata="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">
                 <v:imagedata r:id="rId20" o:title=""/>
@@ -6453,7 +6292,7 @@
               </wp:anchor>
             </w:drawing>
           </mc:Choice>
-          <mc:Fallback xmlns:w16sdtfl="http://schemas.microsoft.com/office/word/2024/wordml/sdtformatlock" xmlns:w16du="http://schemas.microsoft.com/office/word/2023/wordml/word16du">
+          <mc:Fallback>
             <w:pict>
               <v:shapetype w14:anchorId="26ED7025" id="_x0000_t75" coordsize="21600,21600" o:spt="75" o:preferrelative="t" path="m@4@5l@4@11@9@11@9@5xe" filled="f" stroked="f">
                 <v:stroke joinstyle="miter"/>
@@ -6550,7 +6389,7 @@
           <w:noProof/>
         </w:rPr>
         <w:drawing>
-          <wp:inline distT="0" distB="0" distL="0" distR="0" wp14:anchorId="4A834548" wp14:editId="62175790">
+          <wp:inline distT="0" distB="0" distL="0" distR="0" wp14:anchorId="4A834548" wp14:editId="3705AD71">
             <wp:extent cx="5396230" cy="3834130"/>
             <wp:effectExtent l="76200" t="76200" r="128270" b="128270"/>
             <wp:docPr id="433170619" name="Imagen 2"/>
@@ -6623,7 +6462,7 @@
           <w:noProof/>
         </w:rPr>
         <w:drawing>
-          <wp:inline distT="0" distB="0" distL="0" distR="0" wp14:anchorId="322F9951" wp14:editId="73BAD8AD">
+          <wp:inline distT="0" distB="0" distL="0" distR="0" wp14:anchorId="322F9951" wp14:editId="5FDCDC8B">
             <wp:extent cx="4621432" cy="3283620"/>
             <wp:effectExtent l="76200" t="76200" r="141605" b="126365"/>
             <wp:docPr id="784425407" name="Imagen 7"/>
@@ -6722,7 +6561,7 @@
           <w:noProof/>
         </w:rPr>
         <w:drawing>
-          <wp:inline distT="0" distB="0" distL="0" distR="0" wp14:anchorId="6F09FAA3" wp14:editId="02D9AC7D">
+          <wp:inline distT="0" distB="0" distL="0" distR="0" wp14:anchorId="6F09FAA3" wp14:editId="293E8E11">
             <wp:extent cx="4461002" cy="3171884"/>
             <wp:effectExtent l="76200" t="76200" r="130175" b="123825"/>
             <wp:docPr id="1755659709" name="Imagen 12"/>
@@ -6869,7 +6708,7 @@
           <w:noProof/>
         </w:rPr>
         <w:drawing>
-          <wp:inline distT="0" distB="0" distL="0" distR="0" wp14:anchorId="5534E4D8" wp14:editId="62EEEBD1">
+          <wp:inline distT="0" distB="0" distL="0" distR="0" wp14:anchorId="5534E4D8" wp14:editId="7B2DDB2F">
             <wp:extent cx="4368895" cy="3106393"/>
             <wp:effectExtent l="76200" t="76200" r="127000" b="132715"/>
             <wp:docPr id="1844187693" name="Imagen 13"/>
@@ -6957,7 +6796,7 @@
           <w:noProof/>
         </w:rPr>
         <w:drawing>
-          <wp:inline distT="0" distB="0" distL="0" distR="0" wp14:anchorId="48AE76E1" wp14:editId="75052F27">
+          <wp:inline distT="0" distB="0" distL="0" distR="0" wp14:anchorId="48AE76E1" wp14:editId="1D204CC5">
             <wp:extent cx="4855490" cy="3452374"/>
             <wp:effectExtent l="76200" t="76200" r="135890" b="129540"/>
             <wp:docPr id="1526789695" name="Imagen 12" descr="Interfaz de usuario gráfica, Aplicación&#10;&#10;El contenido generado por IA puede ser incorrecto."/>
@@ -7030,7 +6869,7 @@
           <w:noProof/>
         </w:rPr>
         <w:drawing>
-          <wp:inline distT="0" distB="0" distL="0" distR="0" wp14:anchorId="6794A471" wp14:editId="0758CEE1">
+          <wp:inline distT="0" distB="0" distL="0" distR="0" wp14:anchorId="6794A471" wp14:editId="5C6B581E">
             <wp:extent cx="4933366" cy="3507746"/>
             <wp:effectExtent l="76200" t="76200" r="133985" b="130810"/>
             <wp:docPr id="760556303" name="Imagen 1"/>
@@ -7104,7 +6943,7 @@
           <w:noProof/>
         </w:rPr>
         <w:drawing>
-          <wp:inline distT="0" distB="0" distL="0" distR="0" wp14:anchorId="41E0CD49" wp14:editId="5D830B63">
+          <wp:inline distT="0" distB="0" distL="0" distR="0" wp14:anchorId="41E0CD49" wp14:editId="5505D93A">
             <wp:extent cx="4989464" cy="3547635"/>
             <wp:effectExtent l="76200" t="76200" r="135255" b="129540"/>
             <wp:docPr id="272702160" name="Imagen 2"/>
@@ -7177,7 +7016,7 @@
           <w:noProof/>
         </w:rPr>
         <w:drawing>
-          <wp:inline distT="0" distB="0" distL="0" distR="0" wp14:anchorId="1DD9C742" wp14:editId="56E9AC47">
+          <wp:inline distT="0" distB="0" distL="0" distR="0" wp14:anchorId="1DD9C742" wp14:editId="2E99956A">
             <wp:extent cx="5030649" cy="3576916"/>
             <wp:effectExtent l="76200" t="76200" r="132080" b="138430"/>
             <wp:docPr id="1519085843" name="Imagen 3"/>
@@ -7256,7 +7095,7 @@
           <w:noProof/>
         </w:rPr>
         <w:drawing>
-          <wp:inline distT="0" distB="0" distL="0" distR="0" wp14:anchorId="08C08F08" wp14:editId="371FB82F">
+          <wp:inline distT="0" distB="0" distL="0" distR="0" wp14:anchorId="08C08F08" wp14:editId="23A93D18">
             <wp:extent cx="4873889" cy="3466106"/>
             <wp:effectExtent l="76200" t="76200" r="136525" b="134620"/>
             <wp:docPr id="1997279975" name="Imagen 1"/>
@@ -7332,7 +7171,7 @@
           <w:noProof/>
         </w:rPr>
         <w:drawing>
-          <wp:inline distT="0" distB="0" distL="0" distR="0" wp14:anchorId="68ACB7BF" wp14:editId="72AB77CC">
+          <wp:inline distT="0" distB="0" distL="0" distR="0" wp14:anchorId="68ACB7BF" wp14:editId="43E78369">
             <wp:extent cx="4862708" cy="3458154"/>
             <wp:effectExtent l="76200" t="76200" r="128905" b="142875"/>
             <wp:docPr id="1649579706" name="Imagen 2"/>
@@ -7404,30 +7243,43 @@
     </w:p>
     <w:p>
       <w:pPr>
+        <w:pStyle w:val="Ttulo1"/>
+      </w:pPr>
+      <w:r>
+        <w:lastRenderedPageBreak/>
+        <w:t xml:space="preserve">Diagrama de Casos de Uso: </w:t>
+      </w:r>
+    </w:p>
+    <w:p>
+      <w:pPr>
         <w:pStyle w:val="Ttulo2"/>
       </w:pPr>
       <w:r>
+        <w:t>Parte Pública</w:t>
+      </w:r>
+    </w:p>
+    <w:p>
+      <w:r>
         <w:rPr>
           <w:noProof/>
         </w:rPr>
-        <w:lastRenderedPageBreak/>
         <w:drawing>
-          <wp:anchor distT="0" distB="0" distL="114300" distR="114300" simplePos="0" relativeHeight="251658245" behindDoc="0" locked="0" layoutInCell="1" allowOverlap="1" wp14:anchorId="65EDE247" wp14:editId="39613CBD">
+          <wp:anchor distT="0" distB="0" distL="114300" distR="114300" simplePos="0" relativeHeight="251658245" behindDoc="0" locked="0" layoutInCell="1" allowOverlap="1" wp14:anchorId="65EDE247" wp14:editId="3D70A5C1">
             <wp:simplePos x="0" y="0"/>
             <wp:positionH relativeFrom="margin">
-              <wp:posOffset>-1905</wp:posOffset>
+              <wp:align>left</wp:align>
             </wp:positionH>
             <wp:positionV relativeFrom="margin">
-              <wp:posOffset>257810</wp:posOffset>
+              <wp:posOffset>836930</wp:posOffset>
             </wp:positionV>
-            <wp:extent cx="3596640" cy="8945245"/>
-            <wp:effectExtent l="0" t="0" r="3810" b="8255"/>
+            <wp:extent cx="3363595" cy="8368030"/>
+            <wp:effectExtent l="0" t="0" r="8255" b="0"/>
             <wp:wrapThrough wrapText="bothSides">
               <wp:wrapPolygon edited="0">
                 <wp:start x="0" y="0"/>
-                <wp:lineTo x="0" y="21574"/>
-                <wp:lineTo x="21508" y="21574"/>
-                <wp:lineTo x="21508" y="0"/>
+                <wp:lineTo x="0" y="21538"/>
+                <wp:lineTo x="21531" y="21538"/>
+                <wp:lineTo x="21531" y="0"/>
                 <wp:lineTo x="0" y="0"/>
               </wp:wrapPolygon>
             </wp:wrapThrough>
@@ -7460,7 +7312,7 @@
                   <pic:spPr bwMode="auto">
                     <a:xfrm>
                       <a:off x="0" y="0"/>
-                      <a:ext cx="3596640" cy="8945245"/>
+                      <a:ext cx="3363595" cy="8368030"/>
                     </a:xfrm>
                     <a:prstGeom prst="rect">
                       <a:avLst/>
@@ -7483,11 +7335,6 @@
         </w:drawing>
       </w:r>
       <w:r>
-        <w:t>Diagrama de Casos de Uso: Parte Pública</w:t>
-      </w:r>
-    </w:p>
-    <w:p>
-      <w:r>
         <w:t>E</w:t>
       </w:r>
       <w:r>
@@ -7509,9 +7356,6 @@
       </w:pPr>
       <w:r>
         <w:lastRenderedPageBreak/>
-        <w:t xml:space="preserve">Diagrama de Casos de Uso: </w:t>
-      </w:r>
-      <w:r>
         <w:t>Parte de Gestión</w:t>
       </w:r>
     </w:p>
@@ -7619,7 +7463,7 @@
     </w:p>
     <w:p>
       <w:pPr>
-        <w:pStyle w:val="Ttulo2"/>
+        <w:pStyle w:val="Ttulo1"/>
       </w:pPr>
       <w:r>
         <w:lastRenderedPageBreak/>
@@ -7628,9 +7472,6 @@
       <w:r>
         <w:t xml:space="preserve"> </w:t>
       </w:r>
-      <w:r>
-        <w:t>Completo</w:t>
-      </w:r>
     </w:p>
     <w:p>
       <w:r>
@@ -7638,9 +7479,9 @@
           <w:noProof/>
         </w:rPr>
         <w:drawing>
-          <wp:inline distT="0" distB="0" distL="0" distR="0" wp14:anchorId="603098C6" wp14:editId="5AC4D915">
-            <wp:extent cx="5460521" cy="8487437"/>
-            <wp:effectExtent l="0" t="0" r="6985" b="8890"/>
+          <wp:inline distT="0" distB="0" distL="0" distR="0" wp14:anchorId="603098C6" wp14:editId="0B53FC4E">
+            <wp:extent cx="4784267" cy="7436317"/>
+            <wp:effectExtent l="0" t="0" r="0" b="0"/>
             <wp:docPr id="320059969" name="Imagen 4"/>
             <wp:cNvGraphicFramePr>
               <a:graphicFrameLocks xmlns:a="http://schemas.openxmlformats.org/drawingml/2006/main" noChangeAspect="1"/>
@@ -7670,7 +7511,7 @@
                   <pic:spPr bwMode="auto">
                     <a:xfrm>
                       <a:off x="0" y="0"/>
-                      <a:ext cx="5464817" cy="8494115"/>
+                      <a:ext cx="4793119" cy="7450076"/>
                     </a:xfrm>
                     <a:prstGeom prst="rect">
                       <a:avLst/>
@@ -7693,13 +7534,10 @@
       </w:pPr>
       <w:r>
         <w:lastRenderedPageBreak/>
-        <w:t>Diagrama de Actividades</w:t>
-      </w:r>
-      <w:r>
-        <w:t xml:space="preserve"> </w:t>
-      </w:r>
-      <w:r>
-        <w:t>desglosado</w:t>
+        <w:t>D</w:t>
+      </w:r>
+      <w:r>
+        <w:t>esglosado</w:t>
       </w:r>
       <w:r>
         <w:t>, parte 1:</w:t>
@@ -7766,10 +7604,10 @@
       </w:pPr>
       <w:r>
         <w:lastRenderedPageBreak/>
-        <w:t>Diagrama de Actividades</w:t>
-      </w:r>
-      <w:r>
-        <w:t xml:space="preserve"> desglosado, parte 2</w:t>
+        <w:t>D</w:t>
+      </w:r>
+      <w:r>
+        <w:t>esglosado, parte 2</w:t>
       </w:r>
       <w:r>
         <w:rPr>
@@ -7836,10 +7674,10 @@
       </w:pPr>
       <w:r>
         <w:lastRenderedPageBreak/>
-        <w:t>Diagrama de Actividades</w:t>
-      </w:r>
-      <w:r>
-        <w:t xml:space="preserve"> desglosado, parte </w:t>
+        <w:t>D</w:t>
+      </w:r>
+      <w:r>
+        <w:t xml:space="preserve">esglosado, parte </w:t>
       </w:r>
       <w:r>
         <w:t>3</w:t>
@@ -7911,71 +7749,33 @@
       </w:pPr>
       <w:r>
         <w:lastRenderedPageBreak/>
-        <w:t>Despliegue:</w:t>
-      </w:r>
-    </w:p>
-    <w:p>
-      <w:r>
-        <w:t xml:space="preserve">Dado que el servicio de hosting facilitado por el centro no ofrecía en su plan básico la posibilidad de desplegar en él un proyecto con tecnología node.js, he recorrido a la web </w:t>
-      </w:r>
-      <w:hyperlink r:id="rId40" w:history="1">
-        <w:r>
-          <w:rPr>
-            <w:rStyle w:val="Hipervnculo"/>
-          </w:rPr>
-          <w:t>https://railway.com/</w:t>
-        </w:r>
-      </w:hyperlink>
-      <w:r>
-        <w:t>.</w:t>
-      </w:r>
-    </w:p>
-    <w:p/>
-    <w:p>
-      <w:pPr>
-        <w:pStyle w:val="Ttulo4"/>
-      </w:pPr>
-      <w:proofErr w:type="spellStart"/>
-      <w:r>
-        <w:t>C</w:t>
-      </w:r>
-      <w:r>
-        <w:t>loudinary</w:t>
-      </w:r>
-      <w:proofErr w:type="spellEnd"/>
-      <w:r>
-        <w:t>:</w:t>
-      </w:r>
-    </w:p>
-    <w:p>
-      <w:r>
-        <w:t xml:space="preserve">Utilizo la API de </w:t>
-      </w:r>
-      <w:proofErr w:type="spellStart"/>
-      <w:r>
-        <w:rPr>
-          <w:highlight w:val="yellow"/>
-        </w:rPr>
-        <w:t>Cloudinary</w:t>
-      </w:r>
-      <w:proofErr w:type="spellEnd"/>
-      <w:r>
-        <w:t xml:space="preserve"> para subir las imágenes de las portadas de los libros a la web.</w:t>
-      </w:r>
-    </w:p>
-    <w:p/>
-    <w:p/>
-    <w:p/>
-    <w:p>
-      <w:r>
-        <w:rPr>
-          <w:noProof/>
-        </w:rPr>
+        <w:t>Diagrama BDD</w:t>
+      </w:r>
+      <w:r>
+        <w:t xml:space="preserve"> (mongoDB):</w:t>
+      </w:r>
+    </w:p>
+    <w:p>
+      <w:pPr>
+        <w:pStyle w:val="Sinespaciado"/>
+      </w:pPr>
+      <w:r>
+        <w:t>El diagrama muestra las 4 colecciones que utilizo para guardar datos en mongoDB</w:t>
+      </w:r>
+      <w:r>
+        <w:t>, con sus PK para relacionar unas colecciones con otras.</w:t>
+      </w:r>
+    </w:p>
+    <w:p>
+      <w:pPr>
+        <w:pStyle w:val="Sinespaciado"/>
+      </w:pPr>
+      <w:r>
         <w:drawing>
-          <wp:inline distT="0" distB="0" distL="0" distR="0" wp14:anchorId="5376CD5C" wp14:editId="49B1D426">
-            <wp:extent cx="3426490" cy="2692760"/>
-            <wp:effectExtent l="0" t="0" r="2540" b="0"/>
-            <wp:docPr id="11" name="Imagen 11"/>
+          <wp:inline distT="0" distB="0" distL="0" distR="0" wp14:anchorId="43B346AD" wp14:editId="4FAB45FF">
+            <wp:extent cx="3981840" cy="7739304"/>
+            <wp:effectExtent l="0" t="0" r="0" b="0"/>
+            <wp:docPr id="1055213562" name="Imagen 1"/>
             <wp:cNvGraphicFramePr>
               <a:graphicFrameLocks xmlns:a="http://schemas.openxmlformats.org/drawingml/2006/main" noChangeAspect="1"/>
             </wp:cNvGraphicFramePr>
@@ -7983,11 +7783,11 @@
               <a:graphicData uri="http://schemas.openxmlformats.org/drawingml/2006/picture">
                 <pic:pic xmlns:pic="http://schemas.openxmlformats.org/drawingml/2006/picture">
                   <pic:nvPicPr>
-                    <pic:cNvPr id="1" name=""/>
+                    <pic:cNvPr id="1055213562" name=""/>
                     <pic:cNvPicPr/>
                   </pic:nvPicPr>
                   <pic:blipFill>
-                    <a:blip r:embed="rId41"/>
+                    <a:blip r:embed="rId40"/>
                     <a:stretch>
                       <a:fillRect/>
                     </a:stretch>
@@ -7995,7 +7795,7 @@
                   <pic:spPr>
                     <a:xfrm>
                       <a:off x="0" y="0"/>
-                      <a:ext cx="3433423" cy="2698209"/>
+                      <a:ext cx="3984544" cy="7744560"/>
                     </a:xfrm>
                     <a:prstGeom prst="rect">
                       <a:avLst/>
@@ -8018,6 +7818,308 @@
         <w:pStyle w:val="Ttulo1"/>
       </w:pPr>
       <w:r>
+        <w:t>Despliegue:</w:t>
+      </w:r>
+    </w:p>
+    <w:p>
+      <w:r>
+        <w:t>Tecnologías utilizadas en el proyecto para desplegar la aplicación web:</w:t>
+      </w:r>
+    </w:p>
+    <w:p>
+      <w:r>
+        <w:t>El plan que cdmon ofrece para estudiantes no es compatible para desplegar con node.js. Debido a eso, he tenido que utilizar Railway:</w:t>
+      </w:r>
+    </w:p>
+    <w:p>
+      <w:pPr>
+        <w:pStyle w:val="Ttulo3"/>
+      </w:pPr>
+      <w:hyperlink r:id="rId41" w:history="1">
+        <w:r>
+          <w:rPr>
+            <w:rStyle w:val="Ttulo3Car"/>
+          </w:rPr>
+          <w:t>Railway</w:t>
+        </w:r>
+      </w:hyperlink>
+      <w:r>
+        <w:rPr>
+          <w:rStyle w:val="Ttulo3Car"/>
+        </w:rPr>
+        <w:t>:</w:t>
+      </w:r>
+      <w:r>
+        <w:t xml:space="preserve"> </w:t>
+      </w:r>
+    </w:p>
+    <w:p>
+      <w:r>
+        <w:t>Es una plataforma en la nube</w:t>
+      </w:r>
+      <w:r>
+        <w:t xml:space="preserve"> </w:t>
+      </w:r>
+      <w:r>
+        <w:t>diseñada para simplificar y acelerar el proceso de desarrollo y publicación de software</w:t>
+      </w:r>
+      <w:r>
+        <w:t>. Ofrece s</w:t>
+      </w:r>
+      <w:r>
+        <w:t>oporte nativo para Node.js</w:t>
+      </w:r>
+      <w:r>
+        <w:t xml:space="preserve"> y permite un despliegue </w:t>
+      </w:r>
+      <w:r>
+        <w:t>automatizado</w:t>
+      </w:r>
+      <w:r>
+        <w:t xml:space="preserve"> ya que se integra </w:t>
+      </w:r>
+      <w:r>
+        <w:t>directamente con los repositorios de GitHub</w:t>
+      </w:r>
+      <w:r>
+        <w:t>.</w:t>
+      </w:r>
+    </w:p>
+    <w:p>
+      <w:r>
+        <w:t>Railway detecta las tecnologías empleadas (</w:t>
+      </w:r>
+      <w:r>
+        <w:t>en mi caso</w:t>
+      </w:r>
+      <w:r>
+        <w:t>, React con Vite en el frontend y Express en el backend) y genera automáticamente el entorno necesario para compilar y ejecutar la aplicación.</w:t>
+      </w:r>
+      <w:r>
+        <w:t xml:space="preserve"> Tambien permite monitorear los logs en ti</w:t>
+      </w:r>
+      <w:r>
+        <w:t>e</w:t>
+      </w:r>
+      <w:r>
+        <w:t>mpo real.</w:t>
+      </w:r>
+    </w:p>
+    <w:p>
+      <w:pPr>
+        <w:pStyle w:val="Ttulo4"/>
+      </w:pPr>
+      <w:r>
+        <w:t>V</w:t>
+      </w:r>
+      <w:r>
+        <w:t>ariables de Entorno</w:t>
+      </w:r>
+      <w:r>
+        <w:t xml:space="preserve"> (.env)</w:t>
+      </w:r>
+    </w:p>
+    <w:p>
+      <w:r>
+        <w:t>En local guardo las credenciales (</w:t>
+      </w:r>
+      <w:r>
+        <w:t>contraseñas de la base de datos, claves de APIs o el "Client ID" de Google</w:t>
+      </w:r>
+      <w:r>
+        <w:t>) en un archivo .env</w:t>
+      </w:r>
+      <w:r>
+        <w:t xml:space="preserve"> y c</w:t>
+      </w:r>
+      <w:r>
+        <w:t xml:space="preserve">on .gitignore evito que este fichero se suba a </w:t>
+      </w:r>
+      <w:r>
+        <w:t>G</w:t>
+      </w:r>
+      <w:r>
+        <w:t>it</w:t>
+      </w:r>
+      <w:r>
+        <w:t>Hub</w:t>
+      </w:r>
+      <w:r>
+        <w:t>.</w:t>
+      </w:r>
+    </w:p>
+    <w:p>
+      <w:r>
+        <w:t xml:space="preserve">Para </w:t>
+      </w:r>
+      <w:r>
+        <w:t xml:space="preserve">que el proyecto desplegado en </w:t>
+      </w:r>
+      <w:r>
+        <w:t>Railway</w:t>
+      </w:r>
+      <w:r>
+        <w:t xml:space="preserve"> </w:t>
+      </w:r>
+      <w:r>
+        <w:t>tenga acceso a las credenciales estas deben configurarse en la pestaña variables del servidor.</w:t>
+      </w:r>
+    </w:p>
+    <w:p/>
+    <w:p>
+      <w:pPr>
+        <w:pStyle w:val="Ttulo3"/>
+      </w:pPr>
+      <w:r>
+        <w:t>MongoDB:</w:t>
+      </w:r>
+    </w:p>
+    <w:p>
+      <w:r>
+        <w:t>MongoDB atlas ofrece un cluster gratuito en sus servidores para los usuarios registrados. En él he podido desplegar l</w:t>
+      </w:r>
+      <w:r>
+        <w:t xml:space="preserve">a base de datos </w:t>
+      </w:r>
+      <w:r>
+        <w:t xml:space="preserve">de mi proyecto. Gracias a </w:t>
+      </w:r>
+      <w:r>
+        <w:t xml:space="preserve">que, tanto en local en la web, utilizo </w:t>
+      </w:r>
+      <w:r>
+        <w:t xml:space="preserve">sus servidores puedo mantener sincronizada la base de datos </w:t>
+      </w:r>
+      <w:r>
+        <w:t xml:space="preserve">de mi aplicación. </w:t>
+      </w:r>
+    </w:p>
+    <w:p>
+      <w:r>
+        <w:t xml:space="preserve">¿Por qué mongoDB en lugar de mySQL? </w:t>
+      </w:r>
+      <w:r>
+        <w:t xml:space="preserve">MongoDB es extremadamente flexible y permisivo a la hora realizar modificaciones (añadir o eliminar campos) en la estructura de sus archivos. </w:t>
+      </w:r>
+    </w:p>
+    <w:p>
+      <w:r>
+        <w:t xml:space="preserve">Pero más importante aún: MongoDB es plenamente compatible con JSON, y JSON es plenamente compatible con node.js. De modo que node.js puede tratar los datos que obtiene de la base de datos sin necesitad </w:t>
+      </w:r>
+      <w:r>
+        <w:t xml:space="preserve">de </w:t>
+      </w:r>
+      <w:r>
+        <w:t>intermediarios que se encarguen de transformar los datos que devuelve la consulta sql a json.</w:t>
+      </w:r>
+    </w:p>
+    <w:p>
+      <w:r>
+        <w:lastRenderedPageBreak/>
+        <w:t xml:space="preserve">Conforme el proyecto crecía he necesitado añadir nuevos campos a la ficha de usuarios. </w:t>
+      </w:r>
+      <w:r>
+        <w:t>Para realizar estos cambios en mongoDB s</w:t>
+      </w:r>
+      <w:r>
+        <w:t xml:space="preserve">implemente </w:t>
+      </w:r>
+      <w:r>
+        <w:t>he añadido el nuevo campo al modelo y listo. A partir de ese momento estaba preparado para recibir y almacenar un nuevo dato.</w:t>
+      </w:r>
+    </w:p>
+    <w:p>
+      <w:pPr>
+        <w:pStyle w:val="Ttulo3"/>
+      </w:pPr>
+      <w:r>
+        <w:t>C</w:t>
+      </w:r>
+      <w:r>
+        <w:t>loudinary</w:t>
+      </w:r>
+      <w:r>
+        <w:t>:</w:t>
+      </w:r>
+    </w:p>
+    <w:p>
+      <w:r>
+        <w:t>Mediante parámetros insertados en la ur</w:t>
+      </w:r>
+      <w:r>
+        <w:t>l, C</w:t>
+      </w:r>
+      <w:r>
+        <w:t>loudinary</w:t>
+      </w:r>
+      <w:r>
+        <w:t xml:space="preserve"> permite redimensionar, </w:t>
+      </w:r>
+      <w:r>
+        <w:t>recortar, aplicar filtros o cambiar el formato</w:t>
+      </w:r>
+      <w:r>
+        <w:t xml:space="preserve"> a las imágenes </w:t>
+      </w:r>
+      <w:r>
+        <w:t>sin necesidad de editar la imagen original.</w:t>
+      </w:r>
+    </w:p>
+    <w:p>
+      <w:r>
+        <w:t xml:space="preserve">Utilizo la plataforma de </w:t>
+      </w:r>
+      <w:r>
+        <w:t>gestión de archivos digitales Cloudinary para</w:t>
+      </w:r>
+      <w:r>
+        <w:t xml:space="preserve"> subir las imágenes de las portadas de los libros a la web. En la base de datos solo guardo las URL.</w:t>
+      </w:r>
+    </w:p>
+    <w:p>
+      <w:pPr>
+        <w:pStyle w:val="Ttulo3"/>
+      </w:pPr>
+      <w:r>
+        <w:t>OAuth con Google</w:t>
+      </w:r>
+    </w:p>
+    <w:p>
+      <w:r>
+        <w:t xml:space="preserve">He integrado en la web el servicio de </w:t>
+      </w:r>
+      <w:r>
+        <w:t>inicio de sesión con Google.</w:t>
+      </w:r>
+    </w:p>
+    <w:p>
+      <w:pPr>
+        <w:pStyle w:val="Ttulo3"/>
+      </w:pPr>
+      <w:r>
+        <w:t>Servidor SMTP</w:t>
+      </w:r>
+      <w:r>
+        <w:t xml:space="preserve"> (recuperación de contraseña)</w:t>
+      </w:r>
+    </w:p>
+    <w:p>
+      <w:r>
+        <w:t xml:space="preserve">He configurado nodemailer y lo he integrado con el servidor </w:t>
+      </w:r>
+      <w:r>
+        <w:t>SMTP</w:t>
+      </w:r>
+      <w:r>
+        <w:t xml:space="preserve"> de Gmail para que el usuario pueda recuperar la contraseña en caso de olvidarla</w:t>
+      </w:r>
+    </w:p>
+    <w:p/>
+    <w:p>
+      <w:pPr>
+        <w:pStyle w:val="Ttulo1"/>
+      </w:pPr>
+      <w:r>
         <w:t>Mejoras</w:t>
       </w:r>
       <w:r>
@@ -8051,162 +8153,97 @@
         <w:pStyle w:val="Ttulo3"/>
       </w:pPr>
       <w:r>
+        <w:t>¿Cómo lo he implementado?</w:t>
+      </w:r>
+    </w:p>
+    <w:p>
+      <w:r>
+        <w:t>H</w:t>
+      </w:r>
+      <w:r>
+        <w:t>e añadido</w:t>
+      </w:r>
+      <w:r>
+        <w:t xml:space="preserve"> </w:t>
+      </w:r>
+      <w:r>
+        <w:t xml:space="preserve">cache </w:t>
+      </w:r>
+      <w:r>
+        <w:t xml:space="preserve">en las rutas encargadas </w:t>
+      </w:r>
+      <w:r>
+        <w:t>de realizar las consultas a mongoDB</w:t>
+      </w:r>
+      <w:r>
+        <w:t xml:space="preserve">. </w:t>
+      </w:r>
+      <w:r>
+        <w:t xml:space="preserve">El sistema realiza una primera consulta a la </w:t>
+      </w:r>
+      <w:r>
+        <w:t>base de datos</w:t>
+      </w:r>
+      <w:r>
+        <w:t xml:space="preserve"> cuando un usuario hace una petición</w:t>
+      </w:r>
+      <w:r>
+        <w:t xml:space="preserve"> y</w:t>
+      </w:r>
+      <w:r>
+        <w:t xml:space="preserve"> almacena los datos en node.js</w:t>
+      </w:r>
+      <w:r>
+        <w:t xml:space="preserve">. Cuando un segundo usuario </w:t>
+      </w:r>
+      <w:r>
+        <w:t>vuelve</w:t>
+      </w:r>
+      <w:r>
+        <w:t xml:space="preserve"> a </w:t>
+      </w:r>
+      <w:r>
+        <w:t xml:space="preserve">visitar la misma vista el sistema devuelve los datos almacenados en cache. </w:t>
+      </w:r>
+      <w:r>
+        <w:t>El cache se resetea cuando un usuario añade un nuevo libro</w:t>
+      </w:r>
+      <w:r>
+        <w:t>, lo elimina o lo edita.</w:t>
+      </w:r>
+    </w:p>
+    <w:p>
+      <w:pPr>
+        <w:pStyle w:val="Ttulo2"/>
+      </w:pPr>
+      <w:bookmarkStart w:id="0" w:name="_Hlk227607073"/>
+      <w:r>
+        <w:t>L</w:t>
+      </w:r>
+      <w:r>
+        <w:t>ocalStorage</w:t>
+      </w:r>
+      <w:r>
+        <w:t xml:space="preserve"> y sesionStorage:</w:t>
+      </w:r>
+    </w:p>
+    <w:p>
+      <w:r>
+        <w:t>No caí en la necesidad de utilizarlo hasta que recordé el uso de sessions y cokies para guardar sesiones temporales (sessions) y guardar datos en el navegador (cokies).</w:t>
+      </w:r>
+    </w:p>
+    <w:p>
+      <w:r>
         <w:lastRenderedPageBreak/>
-        <w:t>¿Cómo lo he implementado?</w:t>
-      </w:r>
-    </w:p>
-    <w:p>
-      <w:r>
-        <w:t>H</w:t>
-      </w:r>
-      <w:r>
-        <w:t>e añadido</w:t>
-      </w:r>
-      <w:r>
-        <w:t xml:space="preserve"> </w:t>
-      </w:r>
-      <w:r>
-        <w:t xml:space="preserve">cache </w:t>
-      </w:r>
-      <w:r>
-        <w:t xml:space="preserve">en las rutas encargadas </w:t>
-      </w:r>
-      <w:r>
-        <w:t xml:space="preserve">de realizar las consultas a </w:t>
-      </w:r>
-      <w:proofErr w:type="spellStart"/>
-      <w:r>
-        <w:t>mongoDB</w:t>
-      </w:r>
-      <w:proofErr w:type="spellEnd"/>
-      <w:r>
-        <w:t xml:space="preserve">. </w:t>
-      </w:r>
-      <w:r>
-        <w:t xml:space="preserve">El sistema realiza una primera consulta a la </w:t>
-      </w:r>
-      <w:r>
-        <w:t>base de datos</w:t>
-      </w:r>
-      <w:r>
-        <w:t xml:space="preserve"> cuando un usuario hace una petición</w:t>
-      </w:r>
-      <w:r>
-        <w:t xml:space="preserve"> y</w:t>
-      </w:r>
-      <w:r>
-        <w:t xml:space="preserve"> almacena los datos en node.js</w:t>
-      </w:r>
-      <w:r>
-        <w:t xml:space="preserve">. Cuando un segundo usuario </w:t>
-      </w:r>
-      <w:r>
-        <w:t>vuelve</w:t>
-      </w:r>
-      <w:r>
-        <w:t xml:space="preserve"> a </w:t>
-      </w:r>
-      <w:r>
-        <w:t xml:space="preserve">visitar la misma vista el sistema devuelve los datos almacenados en cache. </w:t>
-      </w:r>
-      <w:r>
-        <w:t>El cache se resetea cuando un usuario añade un nuevo libro</w:t>
-      </w:r>
-      <w:r>
-        <w:t>, lo elimina o lo edita.</w:t>
-      </w:r>
-    </w:p>
-    <w:p>
-      <w:pPr>
-        <w:pStyle w:val="Ttulo2"/>
-      </w:pPr>
-      <w:bookmarkStart w:id="0" w:name="_Hlk227607073"/>
-      <w:proofErr w:type="spellStart"/>
-      <w:r>
-        <w:t>L</w:t>
-      </w:r>
-      <w:r>
-        <w:t>ocalStorage</w:t>
-      </w:r>
-      <w:proofErr w:type="spellEnd"/>
-      <w:r>
-        <w:t xml:space="preserve"> y </w:t>
-      </w:r>
-      <w:proofErr w:type="spellStart"/>
-      <w:r>
-        <w:t>sesionStorage</w:t>
-      </w:r>
-      <w:proofErr w:type="spellEnd"/>
-      <w:r>
-        <w:t>:</w:t>
-      </w:r>
-    </w:p>
-    <w:p>
-      <w:r>
-        <w:t xml:space="preserve">No caí en la necesidad de utilizarlo hasta que recordé el uso de </w:t>
-      </w:r>
-      <w:proofErr w:type="spellStart"/>
-      <w:r>
-        <w:t>sessions</w:t>
-      </w:r>
-      <w:proofErr w:type="spellEnd"/>
-      <w:r>
-        <w:t xml:space="preserve"> y </w:t>
-      </w:r>
-      <w:proofErr w:type="spellStart"/>
-      <w:r>
-        <w:t>cokies</w:t>
-      </w:r>
-      <w:proofErr w:type="spellEnd"/>
-      <w:r>
-        <w:t xml:space="preserve"> para guardar sesiones temporales (</w:t>
-      </w:r>
-      <w:proofErr w:type="spellStart"/>
-      <w:r>
-        <w:t>sessions</w:t>
-      </w:r>
-      <w:proofErr w:type="spellEnd"/>
-      <w:r>
-        <w:t>) y guardar datos en el navegador (</w:t>
-      </w:r>
-      <w:proofErr w:type="spellStart"/>
-      <w:r>
-        <w:t>cokies</w:t>
-      </w:r>
-      <w:proofErr w:type="spellEnd"/>
-      <w:r>
-        <w:t>).</w:t>
-      </w:r>
-    </w:p>
-    <w:p>
-      <w:r>
-        <w:t xml:space="preserve">Dado que utilizo node.js y </w:t>
-      </w:r>
-      <w:proofErr w:type="spellStart"/>
-      <w:r>
-        <w:t>react</w:t>
-      </w:r>
-      <w:proofErr w:type="spellEnd"/>
-      <w:r>
-        <w:t xml:space="preserve"> </w:t>
+        <w:t xml:space="preserve">Dado que utilizo node.js y react </w:t>
       </w:r>
       <w:bookmarkEnd w:id="0"/>
       <w:r>
         <w:t xml:space="preserve">tuve que recurrir a </w:t>
       </w:r>
-      <w:proofErr w:type="spellStart"/>
-      <w:r>
-        <w:t>LocalStorage</w:t>
-      </w:r>
-      <w:proofErr w:type="spellEnd"/>
-      <w:r>
-        <w:t xml:space="preserve"> y </w:t>
-      </w:r>
-      <w:proofErr w:type="spellStart"/>
-      <w:r>
-        <w:t>sesionStorage</w:t>
-      </w:r>
-      <w:proofErr w:type="spellEnd"/>
+      <w:r>
+        <w:t>LocalStorage y sesionStorage</w:t>
+      </w:r>
       <w:r>
         <w:t>, que</w:t>
       </w:r>
@@ -8250,15 +8287,7 @@
         <w:t>el servidor, que actúa como un pase con fecha de caducidad."</w:t>
       </w:r>
       <w:r>
-        <w:t xml:space="preserve"> Esto significa </w:t>
-      </w:r>
-      <w:proofErr w:type="gramStart"/>
-      <w:r>
-        <w:t>que</w:t>
-      </w:r>
-      <w:proofErr w:type="gramEnd"/>
-      <w:r>
-        <w:t xml:space="preserve"> aunque un usuario seleccioné la opción recordar sesión, pasados X días (los configurados en el servidor) el servidor rechazara el token guardado en el navegador del usuario y lo obligará a volver a iniciar sesión.</w:t>
+        <w:t xml:space="preserve"> Esto significa que aunque un usuario seleccioné la opción recordar sesión, pasados X días (los configurados en el servidor) el servidor rechazara el token guardado en el navegador del usuario y lo obligará a volver a iniciar sesión.</w:t>
       </w:r>
     </w:p>
     <w:p>
@@ -8302,15 +8331,7 @@
     </w:p>
     <w:p>
       <w:r>
-        <w:t xml:space="preserve">Si el usuario esta registrado, coteja esta información con los gustos literarios definidos en el perfil y cruza los datos para mostrar libros de interés en la </w:t>
-      </w:r>
-      <w:proofErr w:type="spellStart"/>
-      <w:r>
-        <w:t>pagina</w:t>
-      </w:r>
-      <w:proofErr w:type="spellEnd"/>
-      <w:r>
-        <w:t xml:space="preserve"> principal.</w:t>
+        <w:t>Si el usuario esta registrado, coteja esta información con los gustos literarios definidos en el perfil y cruza los datos para mostrar libros de interés en la pagina principal.</w:t>
       </w:r>
     </w:p>
     <w:p>
@@ -8336,101 +8357,132 @@
         <w:pStyle w:val="Ttulo4"/>
       </w:pPr>
       <w:r>
+        <w:t xml:space="preserve">1. </w:t>
+      </w:r>
+      <w:r>
+        <w:t>P</w:t>
+      </w:r>
+      <w:r>
+        <w:t>ara usuarios no registrados:</w:t>
+      </w:r>
+    </w:p>
+    <w:p>
+      <w:r>
+        <w:t>De base, la página principal muestra:</w:t>
+      </w:r>
+    </w:p>
+    <w:p>
+      <w:pPr>
+        <w:pStyle w:val="Prrafodelista"/>
+        <w:numPr>
+          <w:ilvl w:val="0"/>
+          <w:numId w:val="9"/>
+        </w:numPr>
+      </w:pPr>
+      <w:r>
+        <w:t>Novedades</w:t>
+      </w:r>
+      <w:r>
+        <w:t>: Últimos libros añadidos</w:t>
+      </w:r>
+    </w:p>
+    <w:p>
+      <w:pPr>
+        <w:pStyle w:val="Prrafodelista"/>
+        <w:numPr>
+          <w:ilvl w:val="0"/>
+          <w:numId w:val="9"/>
+        </w:numPr>
+      </w:pPr>
+      <w:r>
+        <w:t>Top Ventas Global</w:t>
+      </w:r>
+      <w:r>
+        <w:t>: Los libros más comprados de todos los tiempos</w:t>
+      </w:r>
+    </w:p>
+    <w:p>
+      <w:pPr>
+        <w:pStyle w:val="Prrafodelista"/>
+        <w:numPr>
+          <w:ilvl w:val="0"/>
+          <w:numId w:val="9"/>
+        </w:numPr>
+      </w:pPr>
+      <w:r>
+        <w:t>Tendencias de la Semana</w:t>
+      </w:r>
+      <w:r>
+        <w:t>: Los libros más visitados/comprados de la semana.</w:t>
+      </w:r>
+    </w:p>
+    <w:p>
+      <w:pPr>
+        <w:pStyle w:val="Ttulo4"/>
+      </w:pPr>
+      <w:r>
+        <w:t xml:space="preserve">2. </w:t>
+      </w:r>
+      <w:r>
+        <w:t>P</w:t>
+      </w:r>
+      <w:r>
+        <w:t>ara usuarios registrados:</w:t>
+      </w:r>
+    </w:p>
+    <w:p>
+      <w:pPr>
+        <w:pStyle w:val="Prrafodelista"/>
+        <w:numPr>
+          <w:ilvl w:val="0"/>
+          <w:numId w:val="9"/>
+        </w:numPr>
+      </w:pPr>
+      <w:r>
+        <w:t>Porque leíste</w:t>
+      </w:r>
+      <w:r>
+        <w:t xml:space="preserve"> [titulo de libro]</w:t>
+      </w:r>
+      <w:r>
+        <w:t xml:space="preserve">: Se basa en los libros que has comprado. Muestra libros relacionados con la categoría del libro. </w:t>
+      </w:r>
+    </w:p>
+    <w:p>
+      <w:pPr>
+        <w:pStyle w:val="Prrafodelista"/>
+        <w:numPr>
+          <w:ilvl w:val="0"/>
+          <w:numId w:val="9"/>
+        </w:numPr>
+      </w:pPr>
+      <w:r>
+        <w:t>Porque te gusta</w:t>
+      </w:r>
+      <w:r>
+        <w:t xml:space="preserve"> [genero favorito]</w:t>
+      </w:r>
+      <w:r>
+        <w:t xml:space="preserve">: </w:t>
+      </w:r>
+      <w:r>
+        <w:t xml:space="preserve">Se basa en los generos que has seleccionado como favoritos en tu ficha de perfil y en tu historial de navegación </w:t>
+      </w:r>
+      <w:hyperlink w:anchor="_Sistema_de_recomendaciones" w:history="1">
+        <w:r>
+          <w:rPr>
+            <w:rStyle w:val="Hipervnculo"/>
+          </w:rPr>
+          <w:t>(sistema de recomendaciones)</w:t>
+        </w:r>
+      </w:hyperlink>
+    </w:p>
+    <w:p>
+      <w:pPr>
+        <w:pStyle w:val="Ttulo2"/>
+      </w:pPr>
+      <w:r>
         <w:lastRenderedPageBreak/>
-        <w:t xml:space="preserve">1. </w:t>
-      </w:r>
-      <w:r>
-        <w:t>P</w:t>
-      </w:r>
-      <w:r>
-        <w:t>ara usuarios no registrados:</w:t>
-      </w:r>
-    </w:p>
-    <w:p>
-      <w:r>
-        <w:t>De base, la página principal muestra:</w:t>
-      </w:r>
-    </w:p>
-    <w:p>
-      <w:r>
-        <w:rPr>
-          <w:highlight w:val="yellow"/>
-        </w:rPr>
-        <w:t>¿Qué tres categorías muestra?</w:t>
-      </w:r>
-    </w:p>
-    <w:p>
-      <w:pPr>
-        <w:rPr>
-          <w:strike/>
-        </w:rPr>
-      </w:pPr>
-      <w:r>
-        <w:rPr>
-          <w:strike/>
-        </w:rPr>
-        <w:t>Top Ventas Global Novedades, Tendencias de la semana (</w:t>
-      </w:r>
-      <w:proofErr w:type="spellStart"/>
-      <w:r>
-        <w:rPr>
-          <w:strike/>
-        </w:rPr>
-        <w:t>Trending</w:t>
-      </w:r>
-      <w:proofErr w:type="spellEnd"/>
-      <w:r>
-        <w:rPr>
-          <w:strike/>
-        </w:rPr>
-        <w:t>), Autores del Momento y Autores Emergentes.</w:t>
-      </w:r>
-    </w:p>
-    <w:p>
-      <w:pPr>
-        <w:pStyle w:val="Ttulo4"/>
-      </w:pPr>
-      <w:r>
-        <w:t xml:space="preserve">2. </w:t>
-      </w:r>
-      <w:r>
-        <w:t>P</w:t>
-      </w:r>
-      <w:r>
-        <w:t>ara usuarios registrados:</w:t>
-      </w:r>
-    </w:p>
-    <w:p>
-      <w:r>
-        <w:t>Porque leíste</w:t>
-      </w:r>
-      <w:r>
-        <w:t xml:space="preserve"> [</w:t>
-      </w:r>
-      <w:proofErr w:type="spellStart"/>
-      <w:r>
-        <w:t>titulo</w:t>
-      </w:r>
-      <w:proofErr w:type="spellEnd"/>
-      <w:r>
-        <w:t xml:space="preserve"> de libro],</w:t>
-      </w:r>
-      <w:r>
-        <w:t xml:space="preserve"> </w:t>
-      </w:r>
-      <w:r>
-        <w:t>Tus géneros favoritos</w:t>
-      </w:r>
-      <w:r>
-        <w:t>, tus autores favoritos…</w:t>
-      </w:r>
-    </w:p>
-    <w:p/>
-    <w:p>
-      <w:pPr>
-        <w:pStyle w:val="Ttulo2"/>
-      </w:pPr>
-      <w:r>
         <w:t xml:space="preserve">Refactorización de código </w:t>
       </w:r>
     </w:p>
@@ -8438,11 +8490,9 @@
       <w:pPr>
         <w:pStyle w:val="Ttulo3"/>
       </w:pPr>
-      <w:proofErr w:type="spellStart"/>
       <w:r>
         <w:t>Frontend</w:t>
       </w:r>
-      <w:proofErr w:type="spellEnd"/>
     </w:p>
     <w:p>
       <w:r>
@@ -8508,31 +8558,13 @@
       <w:pPr>
         <w:pStyle w:val="Ttulo3"/>
       </w:pPr>
-      <w:proofErr w:type="spellStart"/>
       <w:r>
         <w:t>Bakend</w:t>
       </w:r>
-      <w:proofErr w:type="spellEnd"/>
-    </w:p>
-    <w:p>
-      <w:r>
-        <w:t xml:space="preserve">Como en el </w:t>
-      </w:r>
-      <w:proofErr w:type="spellStart"/>
-      <w:r>
-        <w:t>frontend</w:t>
-      </w:r>
-      <w:proofErr w:type="spellEnd"/>
-      <w:r>
-        <w:t xml:space="preserve">, el </w:t>
-      </w:r>
-      <w:proofErr w:type="spellStart"/>
-      <w:r>
-        <w:t>bakend</w:t>
-      </w:r>
-      <w:proofErr w:type="spellEnd"/>
-      <w:r>
-        <w:t xml:space="preserve"> también sigue el diseño de la arquitectura </w:t>
+    </w:p>
+    <w:p>
+      <w:r>
+        <w:t xml:space="preserve">Como en el frontend, el bakend también sigue el diseño de la arquitectura </w:t>
       </w:r>
       <w:r>
         <w:rPr>
@@ -8655,9 +8687,181 @@
     </w:p>
     <w:p>
       <w:pPr>
+        <w:numPr>
+          <w:ilvl w:val="0"/>
+          <w:numId w:val="27"/>
+        </w:numPr>
+      </w:pPr>
+      <w:r>
+        <w:t>Diagrama de Classes</w:t>
+      </w:r>
+    </w:p>
+    <w:p/>
+    <w:p>
+      <w:r>
+        <w:br w:type="page"/>
+      </w:r>
+    </w:p>
+    <w:p>
+      <w:pPr>
+        <w:ind w:left="720"/>
+      </w:pPr>
+    </w:p>
+    <w:p>
+      <w:pPr>
+        <w:numPr>
+          <w:ilvl w:val="0"/>
+          <w:numId w:val="27"/>
+        </w:numPr>
+      </w:pPr>
+      <w:r>
+        <w:t>Implementació</w:t>
+      </w:r>
+    </w:p>
+    <w:p>
+      <w:pPr>
+        <w:numPr>
+          <w:ilvl w:val="1"/>
+          <w:numId w:val="27"/>
+        </w:numPr>
+      </w:pPr>
+      <w:r>
+        <w:t>Proves unitàries</w:t>
+      </w:r>
+    </w:p>
+    <w:p>
+      <w:pPr>
+        <w:numPr>
+          <w:ilvl w:val="0"/>
+          <w:numId w:val="27"/>
+        </w:numPr>
+      </w:pPr>
+      <w:r>
+        <w:t>Desplegament del projecte</w:t>
+      </w:r>
+    </w:p>
+    <w:p>
+      <w:pPr>
+        <w:numPr>
+          <w:ilvl w:val="1"/>
+          <w:numId w:val="27"/>
+        </w:numPr>
+      </w:pPr>
+      <w:r>
+        <w:t>Sistema, Laravel, PHP, Nginx, MariaDB, MySQL, Hosting..</w:t>
+      </w:r>
+    </w:p>
+    <w:p>
+      <w:pPr>
+        <w:numPr>
+          <w:ilvl w:val="1"/>
+          <w:numId w:val="27"/>
+        </w:numPr>
+      </w:pPr>
+      <w:r>
+        <w:t>Enllaços al projecte</w:t>
+      </w:r>
+    </w:p>
+    <w:p>
+      <w:pPr>
+        <w:numPr>
+          <w:ilvl w:val="1"/>
+          <w:numId w:val="27"/>
+        </w:numPr>
+      </w:pPr>
+      <w:r>
+        <w:t>Proves unitàries</w:t>
+      </w:r>
+    </w:p>
+    <w:p>
+      <w:pPr>
+        <w:numPr>
+          <w:ilvl w:val="0"/>
+          <w:numId w:val="27"/>
+        </w:numPr>
+      </w:pPr>
+      <w:r>
+        <w:t>Propostes de millora</w:t>
+      </w:r>
+    </w:p>
+    <w:p/>
+    <w:p/>
+    <w:p/>
+    <w:p>
+      <w:pPr>
+        <w:numPr>
+          <w:ilvl w:val="0"/>
+          <w:numId w:val="27"/>
+        </w:numPr>
+      </w:pPr>
+      <w:r>
+        <w:t>Conclusions</w:t>
+      </w:r>
+    </w:p>
+    <w:p>
+      <w:pPr>
+        <w:numPr>
+          <w:ilvl w:val="0"/>
+          <w:numId w:val="27"/>
+        </w:numPr>
+      </w:pPr>
+      <w:r>
+        <w:t>Webgrafia</w:t>
+      </w:r>
+    </w:p>
+    <w:p>
+      <w:pPr>
+        <w:numPr>
+          <w:ilvl w:val="1"/>
+          <w:numId w:val="27"/>
+        </w:numPr>
+      </w:pPr>
+      <w:r>
+        <w:t>Documentació i ajuda</w:t>
+      </w:r>
+    </w:p>
+    <w:p>
+      <w:pPr>
+        <w:numPr>
+          <w:ilvl w:val="1"/>
+          <w:numId w:val="27"/>
+        </w:numPr>
+      </w:pPr>
+      <w:r>
+        <w:t>Eines</w:t>
+      </w:r>
+    </w:p>
+    <w:p>
+      <w:pPr>
+        <w:numPr>
+          <w:ilvl w:val="1"/>
+          <w:numId w:val="27"/>
+        </w:numPr>
+      </w:pPr>
+      <w:r>
+        <w:t>Recursos</w:t>
+      </w:r>
+    </w:p>
+    <w:p/>
+    <w:p>
+      <w:pPr>
+        <w:rPr>
+          <w:rFonts w:asciiTheme="majorHAnsi" w:eastAsiaTheme="majorEastAsia" w:hAnsiTheme="majorHAnsi" w:cstheme="majorBidi"/>
+          <w:color w:val="0F4761" w:themeColor="accent1" w:themeShade="BF"/>
+          <w:sz w:val="40"/>
+          <w:szCs w:val="40"/>
+        </w:rPr>
+      </w:pPr>
+      <w:r>
+        <w:br w:type="page"/>
+      </w:r>
+    </w:p>
+    <w:p>
+      <w:pPr>
         <w:pStyle w:val="Ttulo1"/>
       </w:pPr>
       <w:r>
+        <w:lastRenderedPageBreak/>
         <w:t>Cambios realizados</w:t>
       </w:r>
     </w:p>
@@ -8733,19 +8937,28 @@
         <w:t>bastante más complejo que al resto de las vistas. Lamentablemente no he sabido distribuir el tiempo adecuadamente, y no he sido capaz de ofrecer el mismo diseño en el resto de vistas.</w:t>
       </w:r>
     </w:p>
-    <w:p>
-      <w:proofErr w:type="spellStart"/>
-      <w:r>
-        <w:lastRenderedPageBreak/>
+    <w:p/>
+    <w:p>
+      <w:r>
+        <w:br w:type="page"/>
+      </w:r>
+    </w:p>
+    <w:p/>
+    <w:p>
+      <w:pPr>
+        <w:pStyle w:val="Ttulo1"/>
+      </w:pPr>
+      <w:r>
+        <w:rPr>
+          <w:rStyle w:val="Ttulo1Car"/>
+        </w:rPr>
         <w:t>Webgrafia</w:t>
       </w:r>
-      <w:proofErr w:type="spellEnd"/>
       <w:r>
         <w:t>:</w:t>
       </w:r>
     </w:p>
     <w:p>
-      <w:proofErr w:type="spellStart"/>
       <w:r>
         <w:rPr>
           <w:highlight w:val="yellow"/>
@@ -8764,7 +8977,6 @@
         </w:rPr>
         <w:t>google</w:t>
       </w:r>
-      <w:proofErr w:type="spellEnd"/>
     </w:p>
     <w:p>
       <w:hyperlink r:id="rId42" w:history="1">
@@ -8847,13 +9059,8 @@
         <w:ind w:left="360"/>
       </w:pPr>
       <w:r>
-        <w:t>Creación de archivo .</w:t>
-      </w:r>
-      <w:proofErr w:type="spellStart"/>
-      <w:r>
-        <w:t>htaccess</w:t>
-      </w:r>
-      <w:proofErr w:type="spellEnd"/>
+        <w:t>Creación de archivo .htaccess</w:t>
+      </w:r>
     </w:p>
     <w:p>
       <w:pPr>
@@ -8963,15 +9170,7 @@
         </w:numPr>
       </w:pPr>
       <w:r>
-        <w:t xml:space="preserve">Revisar seguridad de </w:t>
-      </w:r>
-      <w:proofErr w:type="spellStart"/>
-      <w:r>
-        <w:t>password</w:t>
-      </w:r>
-      <w:proofErr w:type="spellEnd"/>
-      <w:r>
-        <w:t xml:space="preserve"> (tanto en node.js como a nivel de web)</w:t>
+        <w:t>Revisar seguridad de password (tanto en node.js como a nivel de web)</w:t>
       </w:r>
     </w:p>
     <w:p>
@@ -9020,15 +9219,7 @@
         <w:t>Qué es:</w:t>
       </w:r>
       <w:r>
-        <w:t> Una barra de búsqueda en el </w:t>
-      </w:r>
-      <w:proofErr w:type="spellStart"/>
-      <w:r>
-        <w:t>Navbar</w:t>
-      </w:r>
-      <w:proofErr w:type="spellEnd"/>
-      <w:r>
-        <w:t> que, al ir escribiendo, muestre un desplegable con sugerencias en tiempo real (libros, autores o categorías) sin tener que recargar la página.</w:t>
+        <w:t> Una barra de búsqueda en el Navbar que, al ir escribiendo, muestre un desplegable con sugerencias en tiempo real (libros, autores o categorías) sin tener que recargar la página.</w:t>
       </w:r>
     </w:p>
     <w:p>
@@ -9046,15 +9237,7 @@
         <w:t>Por qué:</w:t>
       </w:r>
       <w:r>
-        <w:t> Es el estándar en cualquier e-</w:t>
-      </w:r>
-      <w:proofErr w:type="spellStart"/>
-      <w:r>
-        <w:t>commerce</w:t>
-      </w:r>
-      <w:proofErr w:type="spellEnd"/>
-      <w:r>
-        <w:t xml:space="preserve"> moderno. Facilita enormemente encontrar un libro específico.</w:t>
+        <w:t> Es el estándar en cualquier e-commerce moderno. Facilita enormemente encontrar un libro específico.</w:t>
       </w:r>
     </w:p>
     <w:p>
@@ -9120,39 +9303,7 @@
           <w:b/>
           <w:bCs/>
         </w:rPr>
-        <w:t xml:space="preserve">Paginación Real en el </w:t>
-      </w:r>
-      <w:proofErr w:type="spellStart"/>
-      <w:r>
-        <w:rPr>
-          <w:b/>
-          <w:bCs/>
-        </w:rPr>
-        <w:t>Backend</w:t>
-      </w:r>
-      <w:proofErr w:type="spellEnd"/>
-      <w:r>
-        <w:rPr>
-          <w:b/>
-          <w:bCs/>
-        </w:rPr>
-        <w:t xml:space="preserve"> (Infinite </w:t>
-      </w:r>
-      <w:proofErr w:type="spellStart"/>
-      <w:r>
-        <w:rPr>
-          <w:b/>
-          <w:bCs/>
-        </w:rPr>
-        <w:t>Scroll</w:t>
-      </w:r>
-      <w:proofErr w:type="spellEnd"/>
-      <w:r>
-        <w:rPr>
-          <w:b/>
-          <w:bCs/>
-        </w:rPr>
-        <w:t xml:space="preserve"> o Botones):</w:t>
+        <w:t>Paginación Real en el Backend (Infinite Scroll o Botones):</w:t>
       </w:r>
     </w:p>
     <w:p>
@@ -9170,39 +9321,7 @@
         <w:t>Qué es:</w:t>
       </w:r>
       <w:r>
-        <w:t xml:space="preserve"> Actualmente, si tienes 1000 libros, el </w:t>
-      </w:r>
-      <w:proofErr w:type="spellStart"/>
-      <w:r>
-        <w:t>backend</w:t>
-      </w:r>
-      <w:proofErr w:type="spellEnd"/>
-      <w:r>
-        <w:t xml:space="preserve"> envía los 1000 de golpe al </w:t>
-      </w:r>
-      <w:proofErr w:type="spellStart"/>
-      <w:r>
-        <w:t>frontend</w:t>
-      </w:r>
-      <w:proofErr w:type="spellEnd"/>
-      <w:r>
-        <w:t>. La mejora consiste en enviar los datos de 20 en 20 usando </w:t>
-      </w:r>
-      <w:proofErr w:type="spellStart"/>
-      <w:r>
-        <w:t>limit</w:t>
-      </w:r>
-      <w:proofErr w:type="spellEnd"/>
-      <w:r>
-        <w:t> y </w:t>
-      </w:r>
-      <w:proofErr w:type="spellStart"/>
-      <w:r>
-        <w:t>skip</w:t>
-      </w:r>
-      <w:proofErr w:type="spellEnd"/>
-      <w:r>
-        <w:t> en MongoDB.</w:t>
+        <w:t> Actualmente, si tienes 1000 libros, el backend envía los 1000 de golpe al frontend. La mejora consiste en enviar los datos de 20 en 20 usando limit y skip en MongoDB.</w:t>
       </w:r>
     </w:p>
     <w:p>
@@ -9276,23 +9395,7 @@
           <w:b/>
           <w:bCs/>
         </w:rPr>
-        <w:t xml:space="preserve">️ 2. Mejoras de Administración y Gestión (Para el </w:t>
-      </w:r>
-      <w:proofErr w:type="spellStart"/>
-      <w:r>
-        <w:rPr>
-          <w:b/>
-          <w:bCs/>
-        </w:rPr>
-        <w:t>Admin</w:t>
-      </w:r>
-      <w:proofErr w:type="spellEnd"/>
-      <w:r>
-        <w:rPr>
-          <w:b/>
-          <w:bCs/>
-        </w:rPr>
-        <w:t>/Editorial)</w:t>
+        <w:t>️ 2. Mejoras de Administración y Gestión (Para el Admin/Editorial)</w:t>
       </w:r>
     </w:p>
     <w:p>
@@ -9307,23 +9410,7 @@
           <w:b/>
           <w:bCs/>
         </w:rPr>
-        <w:t>Panel de Estadísticas (</w:t>
-      </w:r>
-      <w:proofErr w:type="spellStart"/>
-      <w:r>
-        <w:rPr>
-          <w:b/>
-          <w:bCs/>
-        </w:rPr>
-        <w:t>Dashboard</w:t>
-      </w:r>
-      <w:proofErr w:type="spellEnd"/>
-      <w:r>
-        <w:rPr>
-          <w:b/>
-          <w:bCs/>
-        </w:rPr>
-        <w:t>):</w:t>
+        <w:t>Panel de Estadísticas (Dashboard):</w:t>
       </w:r>
     </w:p>
     <w:p>
@@ -9341,23 +9428,7 @@
         <w:t>Qué es:</w:t>
       </w:r>
       <w:r>
-        <w:t> Una vista principal en /</w:t>
-      </w:r>
-      <w:proofErr w:type="spellStart"/>
-      <w:r>
-        <w:t>admin</w:t>
-      </w:r>
-      <w:proofErr w:type="spellEnd"/>
-      <w:r>
-        <w:t> con gráficos (usando librerías como Chart.js o </w:t>
-      </w:r>
-      <w:proofErr w:type="spellStart"/>
-      <w:r>
-        <w:t>Recharts</w:t>
-      </w:r>
-      <w:proofErr w:type="spellEnd"/>
-      <w:r>
-        <w:t>) que muestre: Ventas del mes, libros más populares, géneros más descargados, etc.</w:t>
+        <w:t> Una vista principal en /admin con gráficos (usando librerías como Chart.js o Recharts) que muestre: Ventas del mes, libros más populares, géneros más descargados, etc.</w:t>
       </w:r>
     </w:p>
     <w:p>
@@ -9385,37 +9456,12 @@
           <w:numId w:val="24"/>
         </w:numPr>
       </w:pPr>
-      <w:proofErr w:type="spellStart"/>
       <w:r>
         <w:rPr>
           <w:b/>
           <w:bCs/>
         </w:rPr>
-        <w:t>Soft</w:t>
-      </w:r>
-      <w:proofErr w:type="spellEnd"/>
-      <w:r>
-        <w:rPr>
-          <w:b/>
-          <w:bCs/>
-        </w:rPr>
-        <w:t xml:space="preserve"> </w:t>
-      </w:r>
-      <w:proofErr w:type="spellStart"/>
-      <w:r>
-        <w:rPr>
-          <w:b/>
-          <w:bCs/>
-        </w:rPr>
-        <w:t>Delete</w:t>
-      </w:r>
-      <w:proofErr w:type="spellEnd"/>
-      <w:r>
-        <w:rPr>
-          <w:b/>
-          <w:bCs/>
-        </w:rPr>
-        <w:t xml:space="preserve"> (Borrado Lógico) para Libros y Usuarios:</w:t>
+        <w:t>Soft Delete (Borrado Lógico) para Libros y Usuarios:</w:t>
       </w:r>
     </w:p>
     <w:p>
@@ -9433,15 +9479,7 @@
         <w:t>Qué es:</w:t>
       </w:r>
       <w:r>
-        <w:t> En lugar de usar </w:t>
-      </w:r>
-      <w:proofErr w:type="spellStart"/>
-      <w:r>
-        <w:t>findByIdAndDelete</w:t>
-      </w:r>
-      <w:proofErr w:type="spellEnd"/>
-      <w:r>
-        <w:t> (que borra el registro para siempre), añadir un campo activo: false.</w:t>
+        <w:t> En lugar de usar findByIdAndDelete (que borra el registro para siempre), añadir un campo activo: false.</w:t>
       </w:r>
     </w:p>
     <w:p>
@@ -9516,55 +9554,7 @@
           <w:b/>
           <w:bCs/>
         </w:rPr>
-        <w:t>️ 3. Mejoras Técnicas y de Rendimiento (</w:t>
-      </w:r>
-      <w:proofErr w:type="spellStart"/>
-      <w:r>
-        <w:rPr>
-          <w:b/>
-          <w:bCs/>
-        </w:rPr>
-        <w:t>Under</w:t>
-      </w:r>
-      <w:proofErr w:type="spellEnd"/>
-      <w:r>
-        <w:rPr>
-          <w:b/>
-          <w:bCs/>
-        </w:rPr>
-        <w:t xml:space="preserve"> </w:t>
-      </w:r>
-      <w:proofErr w:type="spellStart"/>
-      <w:r>
-        <w:rPr>
-          <w:b/>
-          <w:bCs/>
-        </w:rPr>
-        <w:t>the</w:t>
-      </w:r>
-      <w:proofErr w:type="spellEnd"/>
-      <w:r>
-        <w:rPr>
-          <w:b/>
-          <w:bCs/>
-        </w:rPr>
-        <w:t xml:space="preserve"> </w:t>
-      </w:r>
-      <w:proofErr w:type="spellStart"/>
-      <w:r>
-        <w:rPr>
-          <w:b/>
-          <w:bCs/>
-        </w:rPr>
-        <w:t>hood</w:t>
-      </w:r>
-      <w:proofErr w:type="spellEnd"/>
-      <w:r>
-        <w:rPr>
-          <w:b/>
-          <w:bCs/>
-        </w:rPr>
-        <w:t>)</w:t>
+        <w:t>️ 3. Mejoras Técnicas y de Rendimiento (Under the hood)</w:t>
       </w:r>
     </w:p>
     <w:p>
@@ -9579,39 +9569,7 @@
           <w:b/>
           <w:bCs/>
         </w:rPr>
-        <w:t>Pasarela de Pago Simulada (</w:t>
-      </w:r>
-      <w:proofErr w:type="spellStart"/>
-      <w:r>
-        <w:rPr>
-          <w:b/>
-          <w:bCs/>
-        </w:rPr>
-        <w:t>Stripe</w:t>
-      </w:r>
-      <w:proofErr w:type="spellEnd"/>
-      <w:r>
-        <w:rPr>
-          <w:b/>
-          <w:bCs/>
-        </w:rPr>
-        <w:t xml:space="preserve"> / PayPal Test </w:t>
-      </w:r>
-      <w:proofErr w:type="spellStart"/>
-      <w:r>
-        <w:rPr>
-          <w:b/>
-          <w:bCs/>
-        </w:rPr>
-        <w:t>Mode</w:t>
-      </w:r>
-      <w:proofErr w:type="spellEnd"/>
-      <w:r>
-        <w:rPr>
-          <w:b/>
-          <w:bCs/>
-        </w:rPr>
-        <w:t>):</w:t>
+        <w:t>Pasarela de Pago Simulada (Stripe / PayPal Test Mode):</w:t>
       </w:r>
     </w:p>
     <w:p>
@@ -9629,15 +9587,7 @@
         <w:t>Qué es:</w:t>
       </w:r>
       <w:r>
-        <w:t xml:space="preserve"> Integrar el SDK de </w:t>
-      </w:r>
-      <w:proofErr w:type="spellStart"/>
-      <w:r>
-        <w:t>Stripe</w:t>
-      </w:r>
-      <w:proofErr w:type="spellEnd"/>
-      <w:r>
-        <w:t xml:space="preserve"> en modo prueba para que el flujo del carrito termine en un pago "real" (con tarjetas de prueba).</w:t>
+        <w:t> Integrar el SDK de Stripe en modo prueba para que el flujo del carrito termine en un pago "real" (con tarjetas de prueba).</w:t>
       </w:r>
     </w:p>
     <w:p>
@@ -9655,15 +9605,7 @@
         <w:t>Por qué:</w:t>
       </w:r>
       <w:r>
-        <w:t xml:space="preserve"> Es un requisito casi obligatorio si este proyecto es para un portfolio o trabajo de fin de grado (DAW). Demuestra conocimientos avanzados de integración de </w:t>
-      </w:r>
-      <w:proofErr w:type="spellStart"/>
-      <w:r>
-        <w:t>APIs</w:t>
-      </w:r>
-      <w:proofErr w:type="spellEnd"/>
-      <w:r>
-        <w:t xml:space="preserve"> de terceros.</w:t>
+        <w:t> Es un requisito casi obligatorio si este proyecto es para un portfolio o trabajo de fin de grado (DAW). Demuestra conocimientos avanzados de integración de APIs de terceros.</w:t>
       </w:r>
     </w:p>
     <w:p>
@@ -9678,23 +9620,7 @@
           <w:b/>
           <w:bCs/>
         </w:rPr>
-        <w:t>Optimización de Imágenes (</w:t>
-      </w:r>
-      <w:proofErr w:type="spellStart"/>
-      <w:r>
-        <w:rPr>
-          <w:b/>
-          <w:bCs/>
-        </w:rPr>
-        <w:t>Cloudinary</w:t>
-      </w:r>
-      <w:proofErr w:type="spellEnd"/>
-      <w:r>
-        <w:rPr>
-          <w:b/>
-          <w:bCs/>
-        </w:rPr>
-        <w:t>):</w:t>
+        <w:t>Optimización de Imágenes (Cloudinary):</w:t>
       </w:r>
     </w:p>
     <w:p>
@@ -9712,23 +9638,7 @@
         <w:t>Qué es:</w:t>
       </w:r>
       <w:r>
-        <w:t xml:space="preserve"> Ya usas </w:t>
-      </w:r>
-      <w:proofErr w:type="spellStart"/>
-      <w:r>
-        <w:t>Cloudinary</w:t>
-      </w:r>
-      <w:proofErr w:type="spellEnd"/>
-      <w:r>
-        <w:t xml:space="preserve">, pero podrías configurarlo para que, al subir una portada, automáticamente la redimensione, la comprima y la convierta a formato </w:t>
-      </w:r>
-      <w:proofErr w:type="spellStart"/>
-      <w:r>
-        <w:t>WebP</w:t>
-      </w:r>
-      <w:proofErr w:type="spellEnd"/>
-      <w:r>
-        <w:t>.</w:t>
+        <w:t> Ya usas Cloudinary, pero podrías configurarlo para que, al subir una portada, automáticamente la redimensione, la comprima y la convierta a formato WebP.</w:t>
       </w:r>
     </w:p>
     <w:p>
@@ -9761,23 +9671,7 @@
           <w:b/>
           <w:bCs/>
         </w:rPr>
-        <w:t>Refresco de Token (</w:t>
-      </w:r>
-      <w:proofErr w:type="spellStart"/>
-      <w:r>
-        <w:rPr>
-          <w:b/>
-          <w:bCs/>
-        </w:rPr>
-        <w:t>Refresh</w:t>
-      </w:r>
-      <w:proofErr w:type="spellEnd"/>
-      <w:r>
-        <w:rPr>
-          <w:b/>
-          <w:bCs/>
-        </w:rPr>
-        <w:t xml:space="preserve"> Tokens):</w:t>
+        <w:t>Refresco de Token (Refresh Tokens):</w:t>
       </w:r>
     </w:p>
     <w:p>
@@ -9807,32 +9701,15 @@
       <w:r>
         <w:t> (caduca en 15 min) y un </w:t>
       </w:r>
-      <w:proofErr w:type="spellStart"/>
       <w:r>
         <w:rPr>
           <w:i/>
           <w:iCs/>
         </w:rPr>
-        <w:t>Refresh</w:t>
-      </w:r>
-      <w:proofErr w:type="spellEnd"/>
-      <w:r>
-        <w:rPr>
-          <w:i/>
-          <w:iCs/>
-        </w:rPr>
-        <w:t xml:space="preserve"> Token</w:t>
-      </w:r>
-      <w:r>
-        <w:t xml:space="preserve"> (caduca en 7 días y se guarda en una cookie </w:t>
-      </w:r>
-      <w:proofErr w:type="spellStart"/>
-      <w:r>
-        <w:t>HttpOnly</w:t>
-      </w:r>
-      <w:proofErr w:type="spellEnd"/>
-      <w:r>
-        <w:t>) para pedir un nuevo Access Token sin molestar al usuario.</w:t>
+        <w:t>Refresh Token</w:t>
+      </w:r>
+      <w:r>
+        <w:t> (caduca en 7 días y se guarda en una cookie HttpOnly) para pedir un nuevo Access Token sin molestar al usuario.</w:t>
       </w:r>
     </w:p>
     <w:p>
@@ -9888,23 +9765,7 @@
           <w:b/>
           <w:bCs/>
         </w:rPr>
-        <w:t>Sistema de "Libros Relacionados" (Cross-</w:t>
-      </w:r>
-      <w:proofErr w:type="spellStart"/>
-      <w:r>
-        <w:rPr>
-          <w:b/>
-          <w:bCs/>
-        </w:rPr>
-        <w:t>selling</w:t>
-      </w:r>
-      <w:proofErr w:type="spellEnd"/>
-      <w:r>
-        <w:rPr>
-          <w:b/>
-          <w:bCs/>
-        </w:rPr>
-        <w:t>):</w:t>
+        <w:t>Sistema de "Libros Relacionados" (Cross-selling):</w:t>
       </w:r>
     </w:p>
     <w:p>
@@ -9922,15 +9783,7 @@
         <w:t>Qué es:</w:t>
       </w:r>
       <w:r>
-        <w:t> En la vista de </w:t>
-      </w:r>
-      <w:proofErr w:type="spellStart"/>
-      <w:r>
-        <w:t>DetalleLibro</w:t>
-      </w:r>
-      <w:proofErr w:type="spellEnd"/>
-      <w:r>
-        <w:t>, mostrar una sección abajo que diga: </w:t>
+        <w:t> En la vista de DetalleLibro, mostrar una sección abajo que diga: </w:t>
       </w:r>
       <w:r>
         <w:rPr>
@@ -9984,23 +9837,7 @@
           <w:b/>
           <w:bCs/>
         </w:rPr>
-        <w:t xml:space="preserve">Notificaciones </w:t>
-      </w:r>
-      <w:proofErr w:type="spellStart"/>
-      <w:r>
-        <w:rPr>
-          <w:b/>
-          <w:bCs/>
-        </w:rPr>
-        <w:t>Toast</w:t>
-      </w:r>
-      <w:proofErr w:type="spellEnd"/>
-      <w:r>
-        <w:rPr>
-          <w:b/>
-          <w:bCs/>
-        </w:rPr>
-        <w:t xml:space="preserve"> para Acciones Secundarias:</w:t>
+        <w:t>Notificaciones Toast para Acciones Secundarias:</w:t>
       </w:r>
     </w:p>
     <w:p>
@@ -10018,15 +9855,7 @@
         <w:t>Qué es:</w:t>
       </w:r>
       <w:r>
-        <w:t> Ya usas </w:t>
-      </w:r>
-      <w:proofErr w:type="spellStart"/>
-      <w:r>
-        <w:t>react-hot-toast</w:t>
-      </w:r>
-      <w:proofErr w:type="spellEnd"/>
-      <w:r>
-        <w:t>. Asegúrate de usarlo para </w:t>
+        <w:t> Ya usas react-hot-toast. Asegúrate de usarlo para </w:t>
       </w:r>
       <w:r>
         <w:rPr>
@@ -10070,7 +9899,7 @@
 </file>
 
 <file path=word/endnotes.xml><?xml version="1.0" encoding="utf-8"?>
-<w:endnotes xmlns:wpc="http://schemas.microsoft.com/office/word/2010/wordprocessingCanvas" xmlns:cx="http://schemas.microsoft.com/office/drawing/2014/chartex" xmlns:cx1="http://schemas.microsoft.com/office/drawing/2015/9/8/chartex" xmlns:cx2="http://schemas.microsoft.com/office/drawing/2015/10/21/chartex" xmlns:cx3="http://schemas.microsoft.com/office/drawing/2016/5/9/chartex" xmlns:cx4="http://schemas.microsoft.com/office/drawing/2016/5/10/chartex" xmlns:cx5="http://schemas.microsoft.com/office/drawing/2016/5/11/chartex" xmlns:cx6="http://schemas.microsoft.com/office/drawing/2016/5/12/chartex" xmlns:cx7="http://schemas.microsoft.com/office/drawing/2016/5/13/chartex" xmlns:cx8="http://schemas.microsoft.com/office/drawing/2016/5/14/chartex" xmlns:mc="http://schemas.openxmlformats.org/markup-compatibility/2006" xmlns:aink="http://schemas.microsoft.com/office/drawing/2016/ink" xmlns:am3d="http://schemas.microsoft.com/office/drawing/2017/model3d" xmlns:o="urn:schemas-microsoft-com:office:office" xmlns:oel="http://schemas.microsoft.com/office/2019/extlst" xmlns:r="http://schemas.openxmlformats.org/officeDocument/2006/relationships" xmlns:m="http://schemas.openxmlformats.org/officeDocument/2006/math" xmlns:v="urn:schemas-microsoft-com:vml" xmlns:wp14="http://schemas.microsoft.com/office/word/2010/wordprocessingDrawing" xmlns:wp="http://schemas.openxmlformats.org/drawingml/2006/wordprocessingDrawing" xmlns:w10="urn:schemas-microsoft-com:office:word" xmlns:w="http://schemas.openxmlformats.org/wordprocessingml/2006/main" xmlns:w14="http://schemas.microsoft.com/office/word/2010/wordml" xmlns:w15="http://schemas.microsoft.com/office/word/2012/wordml" xmlns:w16cex="http://schemas.microsoft.com/office/word/2018/wordml/cex" xmlns:w16cid="http://schemas.microsoft.com/office/word/2016/wordml/cid" xmlns:w16="http://schemas.microsoft.com/office/word/2018/wordml" xmlns:w16sdtdh="http://schemas.microsoft.com/office/word/2020/wordml/sdtdatahash" xmlns:w16se="http://schemas.microsoft.com/office/word/2015/wordml/symex" xmlns:wpg="http://schemas.microsoft.com/office/word/2010/wordprocessingGroup" xmlns:wpi="http://schemas.microsoft.com/office/word/2010/wordprocessingInk" xmlns:wne="http://schemas.microsoft.com/office/word/2006/wordml" xmlns:wps="http://schemas.microsoft.com/office/word/2010/wordprocessingShape" mc:Ignorable="w14 w15 w16se w16cid w16 w16cex w16sdtdh wp14">
+<w:endnotes xmlns:wpc="http://schemas.microsoft.com/office/word/2010/wordprocessingCanvas" xmlns:cx="http://schemas.microsoft.com/office/drawing/2014/chartex" xmlns:cx1="http://schemas.microsoft.com/office/drawing/2015/9/8/chartex" xmlns:cx2="http://schemas.microsoft.com/office/drawing/2015/10/21/chartex" xmlns:cx3="http://schemas.microsoft.com/office/drawing/2016/5/9/chartex" xmlns:cx4="http://schemas.microsoft.com/office/drawing/2016/5/10/chartex" xmlns:cx5="http://schemas.microsoft.com/office/drawing/2016/5/11/chartex" xmlns:cx6="http://schemas.microsoft.com/office/drawing/2016/5/12/chartex" xmlns:cx7="http://schemas.microsoft.com/office/drawing/2016/5/13/chartex" xmlns:cx8="http://schemas.microsoft.com/office/drawing/2016/5/14/chartex" xmlns:mc="http://schemas.openxmlformats.org/markup-compatibility/2006" xmlns:aink="http://schemas.microsoft.com/office/drawing/2016/ink" xmlns:am3d="http://schemas.microsoft.com/office/drawing/2017/model3d" xmlns:o="urn:schemas-microsoft-com:office:office" xmlns:oel="http://schemas.microsoft.com/office/2019/extlst" xmlns:r="http://schemas.openxmlformats.org/officeDocument/2006/relationships" xmlns:m="http://schemas.openxmlformats.org/officeDocument/2006/math" xmlns:v="urn:schemas-microsoft-com:vml" xmlns:wp14="http://schemas.microsoft.com/office/word/2010/wordprocessingDrawing" xmlns:wp="http://schemas.openxmlformats.org/drawingml/2006/wordprocessingDrawing" xmlns:w10="urn:schemas-microsoft-com:office:word" xmlns:w="http://schemas.openxmlformats.org/wordprocessingml/2006/main" xmlns:w14="http://schemas.microsoft.com/office/word/2010/wordml" xmlns:w15="http://schemas.microsoft.com/office/word/2012/wordml" xmlns:w16cex="http://schemas.microsoft.com/office/word/2018/wordml/cex" xmlns:w16cid="http://schemas.microsoft.com/office/word/2016/wordml/cid" xmlns:w16="http://schemas.microsoft.com/office/word/2018/wordml" xmlns:w16du="http://schemas.microsoft.com/office/word/2023/wordml/word16du" xmlns:w16sdtdh="http://schemas.microsoft.com/office/word/2020/wordml/sdtdatahash" xmlns:w16sdtfl="http://schemas.microsoft.com/office/word/2024/wordml/sdtformatlock" xmlns:w16se="http://schemas.microsoft.com/office/word/2015/wordml/symex" xmlns:wpg="http://schemas.microsoft.com/office/word/2010/wordprocessingGroup" xmlns:wpi="http://schemas.microsoft.com/office/word/2010/wordprocessingInk" xmlns:wne="http://schemas.microsoft.com/office/word/2006/wordml" xmlns:wps="http://schemas.microsoft.com/office/word/2010/wordprocessingShape" mc:Ignorable="w14 w15 w16se w16cid w16 w16cex w16sdtdh w16sdtfl w16du wp14">
   <w:endnote w:type="separator" w:id="-1">
     <w:p>
       <w:pPr>
@@ -10102,7 +9931,7 @@
 </file>
 
 <file path=word/footnotes.xml><?xml version="1.0" encoding="utf-8"?>
-<w:footnotes xmlns:wpc="http://schemas.microsoft.com/office/word/2010/wordprocessingCanvas" xmlns:cx="http://schemas.microsoft.com/office/drawing/2014/chartex" xmlns:cx1="http://schemas.microsoft.com/office/drawing/2015/9/8/chartex" xmlns:cx2="http://schemas.microsoft.com/office/drawing/2015/10/21/chartex" xmlns:cx3="http://schemas.microsoft.com/office/drawing/2016/5/9/chartex" xmlns:cx4="http://schemas.microsoft.com/office/drawing/2016/5/10/chartex" xmlns:cx5="http://schemas.microsoft.com/office/drawing/2016/5/11/chartex" xmlns:cx6="http://schemas.microsoft.com/office/drawing/2016/5/12/chartex" xmlns:cx7="http://schemas.microsoft.com/office/drawing/2016/5/13/chartex" xmlns:cx8="http://schemas.microsoft.com/office/drawing/2016/5/14/chartex" xmlns:mc="http://schemas.openxmlformats.org/markup-compatibility/2006" xmlns:aink="http://schemas.microsoft.com/office/drawing/2016/ink" xmlns:am3d="http://schemas.microsoft.com/office/drawing/2017/model3d" xmlns:o="urn:schemas-microsoft-com:office:office" xmlns:oel="http://schemas.microsoft.com/office/2019/extlst" xmlns:r="http://schemas.openxmlformats.org/officeDocument/2006/relationships" xmlns:m="http://schemas.openxmlformats.org/officeDocument/2006/math" xmlns:v="urn:schemas-microsoft-com:vml" xmlns:wp14="http://schemas.microsoft.com/office/word/2010/wordprocessingDrawing" xmlns:wp="http://schemas.openxmlformats.org/drawingml/2006/wordprocessingDrawing" xmlns:w10="urn:schemas-microsoft-com:office:word" xmlns:w="http://schemas.openxmlformats.org/wordprocessingml/2006/main" xmlns:w14="http://schemas.microsoft.com/office/word/2010/wordml" xmlns:w15="http://schemas.microsoft.com/office/word/2012/wordml" xmlns:w16cex="http://schemas.microsoft.com/office/word/2018/wordml/cex" xmlns:w16cid="http://schemas.microsoft.com/office/word/2016/wordml/cid" xmlns:w16="http://schemas.microsoft.com/office/word/2018/wordml" xmlns:w16sdtdh="http://schemas.microsoft.com/office/word/2020/wordml/sdtdatahash" xmlns:w16se="http://schemas.microsoft.com/office/word/2015/wordml/symex" xmlns:wpg="http://schemas.microsoft.com/office/word/2010/wordprocessingGroup" xmlns:wpi="http://schemas.microsoft.com/office/word/2010/wordprocessingInk" xmlns:wne="http://schemas.microsoft.com/office/word/2006/wordml" xmlns:wps="http://schemas.microsoft.com/office/word/2010/wordprocessingShape" mc:Ignorable="w14 w15 w16se w16cid w16 w16cex w16sdtdh wp14">
+<w:footnotes xmlns:wpc="http://schemas.microsoft.com/office/word/2010/wordprocessingCanvas" xmlns:cx="http://schemas.microsoft.com/office/drawing/2014/chartex" xmlns:cx1="http://schemas.microsoft.com/office/drawing/2015/9/8/chartex" xmlns:cx2="http://schemas.microsoft.com/office/drawing/2015/10/21/chartex" xmlns:cx3="http://schemas.microsoft.com/office/drawing/2016/5/9/chartex" xmlns:cx4="http://schemas.microsoft.com/office/drawing/2016/5/10/chartex" xmlns:cx5="http://schemas.microsoft.com/office/drawing/2016/5/11/chartex" xmlns:cx6="http://schemas.microsoft.com/office/drawing/2016/5/12/chartex" xmlns:cx7="http://schemas.microsoft.com/office/drawing/2016/5/13/chartex" xmlns:cx8="http://schemas.microsoft.com/office/drawing/2016/5/14/chartex" xmlns:mc="http://schemas.openxmlformats.org/markup-compatibility/2006" xmlns:aink="http://schemas.microsoft.com/office/drawing/2016/ink" xmlns:am3d="http://schemas.microsoft.com/office/drawing/2017/model3d" xmlns:o="urn:schemas-microsoft-com:office:office" xmlns:oel="http://schemas.microsoft.com/office/2019/extlst" xmlns:r="http://schemas.openxmlformats.org/officeDocument/2006/relationships" xmlns:m="http://schemas.openxmlformats.org/officeDocument/2006/math" xmlns:v="urn:schemas-microsoft-com:vml" xmlns:wp14="http://schemas.microsoft.com/office/word/2010/wordprocessingDrawing" xmlns:wp="http://schemas.openxmlformats.org/drawingml/2006/wordprocessingDrawing" xmlns:w10="urn:schemas-microsoft-com:office:word" xmlns:w="http://schemas.openxmlformats.org/wordprocessingml/2006/main" xmlns:w14="http://schemas.microsoft.com/office/word/2010/wordml" xmlns:w15="http://schemas.microsoft.com/office/word/2012/wordml" xmlns:w16cex="http://schemas.microsoft.com/office/word/2018/wordml/cex" xmlns:w16cid="http://schemas.microsoft.com/office/word/2016/wordml/cid" xmlns:w16="http://schemas.microsoft.com/office/word/2018/wordml" xmlns:w16du="http://schemas.microsoft.com/office/word/2023/wordml/word16du" xmlns:w16sdtdh="http://schemas.microsoft.com/office/word/2020/wordml/sdtdatahash" xmlns:w16sdtfl="http://schemas.microsoft.com/office/word/2024/wordml/sdtformatlock" xmlns:w16se="http://schemas.microsoft.com/office/word/2015/wordml/symex" xmlns:wpg="http://schemas.microsoft.com/office/word/2010/wordprocessingGroup" xmlns:wpi="http://schemas.microsoft.com/office/word/2010/wordprocessingInk" xmlns:wne="http://schemas.microsoft.com/office/word/2006/wordml" xmlns:wps="http://schemas.microsoft.com/office/word/2010/wordprocessingShape" mc:Ignorable="w14 w15 w16se w16cid w16 w16cex w16sdtdh w16sdtfl w16du wp14">
   <w:footnote w:type="separator" w:id="-1">
     <w:p>
       <w:pPr>
@@ -10134,7 +9963,7 @@
 </file>
 
 <file path=word/header1.xml><?xml version="1.0" encoding="utf-8"?>
-<w:hdr xmlns:wpc="http://schemas.microsoft.com/office/word/2010/wordprocessingCanvas" xmlns:cx="http://schemas.microsoft.com/office/drawing/2014/chartex" xmlns:cx1="http://schemas.microsoft.com/office/drawing/2015/9/8/chartex" xmlns:cx2="http://schemas.microsoft.com/office/drawing/2015/10/21/chartex" xmlns:cx3="http://schemas.microsoft.com/office/drawing/2016/5/9/chartex" xmlns:cx4="http://schemas.microsoft.com/office/drawing/2016/5/10/chartex" xmlns:cx5="http://schemas.microsoft.com/office/drawing/2016/5/11/chartex" xmlns:cx6="http://schemas.microsoft.com/office/drawing/2016/5/12/chartex" xmlns:cx7="http://schemas.microsoft.com/office/drawing/2016/5/13/chartex" xmlns:cx8="http://schemas.microsoft.com/office/drawing/2016/5/14/chartex" xmlns:mc="http://schemas.openxmlformats.org/markup-compatibility/2006" xmlns:aink="http://schemas.microsoft.com/office/drawing/2016/ink" xmlns:am3d="http://schemas.microsoft.com/office/drawing/2017/model3d" xmlns:o="urn:schemas-microsoft-com:office:office" xmlns:oel="http://schemas.microsoft.com/office/2019/extlst" xmlns:r="http://schemas.openxmlformats.org/officeDocument/2006/relationships" xmlns:m="http://schemas.openxmlformats.org/officeDocument/2006/math" xmlns:v="urn:schemas-microsoft-com:vml" xmlns:wp14="http://schemas.microsoft.com/office/word/2010/wordprocessingDrawing" xmlns:wp="http://schemas.openxmlformats.org/drawingml/2006/wordprocessingDrawing" xmlns:w10="urn:schemas-microsoft-com:office:word" xmlns:w="http://schemas.openxmlformats.org/wordprocessingml/2006/main" xmlns:w14="http://schemas.microsoft.com/office/word/2010/wordml" xmlns:w15="http://schemas.microsoft.com/office/word/2012/wordml" xmlns:w16cex="http://schemas.microsoft.com/office/word/2018/wordml/cex" xmlns:w16cid="http://schemas.microsoft.com/office/word/2016/wordml/cid" xmlns:w16="http://schemas.microsoft.com/office/word/2018/wordml" xmlns:w16sdtdh="http://schemas.microsoft.com/office/word/2020/wordml/sdtdatahash" xmlns:w16se="http://schemas.microsoft.com/office/word/2015/wordml/symex" xmlns:wpg="http://schemas.microsoft.com/office/word/2010/wordprocessingGroup" xmlns:wpi="http://schemas.microsoft.com/office/word/2010/wordprocessingInk" xmlns:wne="http://schemas.microsoft.com/office/word/2006/wordml" xmlns:wps="http://schemas.microsoft.com/office/word/2010/wordprocessingShape" mc:Ignorable="w14 w15 w16se w16cid w16 w16cex w16sdtdh wp14">
+<w:hdr xmlns:wpc="http://schemas.microsoft.com/office/word/2010/wordprocessingCanvas" xmlns:cx="http://schemas.microsoft.com/office/drawing/2014/chartex" xmlns:cx1="http://schemas.microsoft.com/office/drawing/2015/9/8/chartex" xmlns:cx2="http://schemas.microsoft.com/office/drawing/2015/10/21/chartex" xmlns:cx3="http://schemas.microsoft.com/office/drawing/2016/5/9/chartex" xmlns:cx4="http://schemas.microsoft.com/office/drawing/2016/5/10/chartex" xmlns:cx5="http://schemas.microsoft.com/office/drawing/2016/5/11/chartex" xmlns:cx6="http://schemas.microsoft.com/office/drawing/2016/5/12/chartex" xmlns:cx7="http://schemas.microsoft.com/office/drawing/2016/5/13/chartex" xmlns:cx8="http://schemas.microsoft.com/office/drawing/2016/5/14/chartex" xmlns:mc="http://schemas.openxmlformats.org/markup-compatibility/2006" xmlns:aink="http://schemas.microsoft.com/office/drawing/2016/ink" xmlns:am3d="http://schemas.microsoft.com/office/drawing/2017/model3d" xmlns:o="urn:schemas-microsoft-com:office:office" xmlns:oel="http://schemas.microsoft.com/office/2019/extlst" xmlns:r="http://schemas.openxmlformats.org/officeDocument/2006/relationships" xmlns:m="http://schemas.openxmlformats.org/officeDocument/2006/math" xmlns:v="urn:schemas-microsoft-com:vml" xmlns:wp14="http://schemas.microsoft.com/office/word/2010/wordprocessingDrawing" xmlns:wp="http://schemas.openxmlformats.org/drawingml/2006/wordprocessingDrawing" xmlns:w10="urn:schemas-microsoft-com:office:word" xmlns:w="http://schemas.openxmlformats.org/wordprocessingml/2006/main" xmlns:w14="http://schemas.microsoft.com/office/word/2010/wordml" xmlns:w15="http://schemas.microsoft.com/office/word/2012/wordml" xmlns:w16cex="http://schemas.microsoft.com/office/word/2018/wordml/cex" xmlns:w16cid="http://schemas.microsoft.com/office/word/2016/wordml/cid" xmlns:w16="http://schemas.microsoft.com/office/word/2018/wordml" xmlns:w16du="http://schemas.microsoft.com/office/word/2023/wordml/word16du" xmlns:w16sdtdh="http://schemas.microsoft.com/office/word/2020/wordml/sdtdatahash" xmlns:w16sdtfl="http://schemas.microsoft.com/office/word/2024/wordml/sdtformatlock" xmlns:w16se="http://schemas.microsoft.com/office/word/2015/wordml/symex" xmlns:wpg="http://schemas.microsoft.com/office/word/2010/wordprocessingGroup" xmlns:wpi="http://schemas.microsoft.com/office/word/2010/wordprocessingInk" xmlns:wne="http://schemas.microsoft.com/office/word/2006/wordml" xmlns:wps="http://schemas.microsoft.com/office/word/2010/wordprocessingShape" mc:Ignorable="w14 w15 w16se w16cid w16 w16cex w16sdtdh w16sdtfl w16du wp14">
   <w:p>
     <w:pPr>
       <w:pStyle w:val="Encabezado"/>
@@ -10157,7 +9986,7 @@
 </file>
 
 <file path=word/numbering.xml><?xml version="1.0" encoding="utf-8"?>
-<w:numbering xmlns:wpc="http://schemas.microsoft.com/office/word/2010/wordprocessingCanvas" xmlns:cx="http://schemas.microsoft.com/office/drawing/2014/chartex" xmlns:cx1="http://schemas.microsoft.com/office/drawing/2015/9/8/chartex" xmlns:cx2="http://schemas.microsoft.com/office/drawing/2015/10/21/chartex" xmlns:cx3="http://schemas.microsoft.com/office/drawing/2016/5/9/chartex" xmlns:cx4="http://schemas.microsoft.com/office/drawing/2016/5/10/chartex" xmlns:cx5="http://schemas.microsoft.com/office/drawing/2016/5/11/chartex" xmlns:cx6="http://schemas.microsoft.com/office/drawing/2016/5/12/chartex" xmlns:cx7="http://schemas.microsoft.com/office/drawing/2016/5/13/chartex" xmlns:cx8="http://schemas.microsoft.com/office/drawing/2016/5/14/chartex" xmlns:mc="http://schemas.openxmlformats.org/markup-compatibility/2006" xmlns:aink="http://schemas.microsoft.com/office/drawing/2016/ink" xmlns:am3d="http://schemas.microsoft.com/office/drawing/2017/model3d" xmlns:o="urn:schemas-microsoft-com:office:office" xmlns:oel="http://schemas.microsoft.com/office/2019/extlst" xmlns:r="http://schemas.openxmlformats.org/officeDocument/2006/relationships" xmlns:m="http://schemas.openxmlformats.org/officeDocument/2006/math" xmlns:v="urn:schemas-microsoft-com:vml" xmlns:wp14="http://schemas.microsoft.com/office/word/2010/wordprocessingDrawing" xmlns:wp="http://schemas.openxmlformats.org/drawingml/2006/wordprocessingDrawing" xmlns:w10="urn:schemas-microsoft-com:office:word" xmlns:w="http://schemas.openxmlformats.org/wordprocessingml/2006/main" xmlns:w14="http://schemas.microsoft.com/office/word/2010/wordml" xmlns:w15="http://schemas.microsoft.com/office/word/2012/wordml" xmlns:w16cex="http://schemas.microsoft.com/office/word/2018/wordml/cex" xmlns:w16cid="http://schemas.microsoft.com/office/word/2016/wordml/cid" xmlns:w16="http://schemas.microsoft.com/office/word/2018/wordml" xmlns:w16sdtdh="http://schemas.microsoft.com/office/word/2020/wordml/sdtdatahash" xmlns:w16se="http://schemas.microsoft.com/office/word/2015/wordml/symex" xmlns:wpg="http://schemas.microsoft.com/office/word/2010/wordprocessingGroup" xmlns:wpi="http://schemas.microsoft.com/office/word/2010/wordprocessingInk" xmlns:wne="http://schemas.microsoft.com/office/word/2006/wordml" xmlns:wps="http://schemas.microsoft.com/office/word/2010/wordprocessingShape" mc:Ignorable="w14 w15 w16se w16cid w16 w16cex w16sdtdh wp14">
+<w:numbering xmlns:wpc="http://schemas.microsoft.com/office/word/2010/wordprocessingCanvas" xmlns:cx="http://schemas.microsoft.com/office/drawing/2014/chartex" xmlns:cx1="http://schemas.microsoft.com/office/drawing/2015/9/8/chartex" xmlns:cx2="http://schemas.microsoft.com/office/drawing/2015/10/21/chartex" xmlns:cx3="http://schemas.microsoft.com/office/drawing/2016/5/9/chartex" xmlns:cx4="http://schemas.microsoft.com/office/drawing/2016/5/10/chartex" xmlns:cx5="http://schemas.microsoft.com/office/drawing/2016/5/11/chartex" xmlns:cx6="http://schemas.microsoft.com/office/drawing/2016/5/12/chartex" xmlns:cx7="http://schemas.microsoft.com/office/drawing/2016/5/13/chartex" xmlns:cx8="http://schemas.microsoft.com/office/drawing/2016/5/14/chartex" xmlns:mc="http://schemas.openxmlformats.org/markup-compatibility/2006" xmlns:aink="http://schemas.microsoft.com/office/drawing/2016/ink" xmlns:am3d="http://schemas.microsoft.com/office/drawing/2017/model3d" xmlns:o="urn:schemas-microsoft-com:office:office" xmlns:oel="http://schemas.microsoft.com/office/2019/extlst" xmlns:r="http://schemas.openxmlformats.org/officeDocument/2006/relationships" xmlns:m="http://schemas.openxmlformats.org/officeDocument/2006/math" xmlns:v="urn:schemas-microsoft-com:vml" xmlns:wp14="http://schemas.microsoft.com/office/word/2010/wordprocessingDrawing" xmlns:wp="http://schemas.openxmlformats.org/drawingml/2006/wordprocessingDrawing" xmlns:w10="urn:schemas-microsoft-com:office:word" xmlns:w="http://schemas.openxmlformats.org/wordprocessingml/2006/main" xmlns:w14="http://schemas.microsoft.com/office/word/2010/wordml" xmlns:w15="http://schemas.microsoft.com/office/word/2012/wordml" xmlns:w16cex="http://schemas.microsoft.com/office/word/2018/wordml/cex" xmlns:w16cid="http://schemas.microsoft.com/office/word/2016/wordml/cid" xmlns:w16="http://schemas.microsoft.com/office/word/2018/wordml" xmlns:w16du="http://schemas.microsoft.com/office/word/2023/wordml/word16du" xmlns:w16sdtdh="http://schemas.microsoft.com/office/word/2020/wordml/sdtdatahash" xmlns:w16sdtfl="http://schemas.microsoft.com/office/word/2024/wordml/sdtformatlock" xmlns:w16se="http://schemas.microsoft.com/office/word/2015/wordml/symex" xmlns:wpg="http://schemas.microsoft.com/office/word/2010/wordprocessingGroup" xmlns:wpi="http://schemas.microsoft.com/office/word/2010/wordprocessingInk" xmlns:wne="http://schemas.microsoft.com/office/word/2006/wordml" xmlns:wps="http://schemas.microsoft.com/office/word/2010/wordprocessingShape" mc:Ignorable="w14 w15 w16se w16cid w16 w16cex w16sdtdh w16sdtfl w16du wp14">
   <w:abstractNum w:abstractNumId="0" w15:restartNumberingAfterBreak="0">
     <w:nsid w:val="008651CD"/>
     <w:multiLevelType w:val="multilevel"/>
@@ -11615,7 +11444,7 @@
   <w:abstractNum w:abstractNumId="10" w15:restartNumberingAfterBreak="0">
     <w:nsid w:val="2BBA3020"/>
     <w:multiLevelType w:val="hybridMultilevel"/>
-    <w:tmpl w:val="B9EAD044"/>
+    <w:tmpl w:val="1690D3E2"/>
     <w:lvl w:ilvl="0" w:tplc="0C0A0001">
       <w:start w:val="1"/>
       <w:numFmt w:val="bullet"/>
@@ -11628,7 +11457,7 @@
         <w:rFonts w:ascii="Symbol" w:hAnsi="Symbol" w:hint="default"/>
       </w:rPr>
     </w:lvl>
-    <w:lvl w:ilvl="1" w:tplc="0C0A0003" w:tentative="1">
+    <w:lvl w:ilvl="1" w:tplc="0C0A0003">
       <w:start w:val="1"/>
       <w:numFmt w:val="bullet"/>
       <w:lvlText w:val="o"/>
@@ -13792,6 +13621,155 @@
       </w:rPr>
     </w:lvl>
     <w:lvl w:ilvl="1" w:tentative="1">
+      <w:start w:val="1"/>
+      <w:numFmt w:val="bullet"/>
+      <w:lvlText w:val="o"/>
+      <w:lvlJc w:val="left"/>
+      <w:pPr>
+        <w:tabs>
+          <w:tab w:val="num" w:pos="1440"/>
+        </w:tabs>
+        <w:ind w:left="1440" w:hanging="360"/>
+      </w:pPr>
+      <w:rPr>
+        <w:rFonts w:ascii="Courier New" w:hAnsi="Courier New" w:hint="default"/>
+        <w:sz w:val="20"/>
+      </w:rPr>
+    </w:lvl>
+    <w:lvl w:ilvl="2" w:tentative="1">
+      <w:start w:val="1"/>
+      <w:numFmt w:val="bullet"/>
+      <w:lvlText w:val=""/>
+      <w:lvlJc w:val="left"/>
+      <w:pPr>
+        <w:tabs>
+          <w:tab w:val="num" w:pos="2160"/>
+        </w:tabs>
+        <w:ind w:left="2160" w:hanging="360"/>
+      </w:pPr>
+      <w:rPr>
+        <w:rFonts w:ascii="Wingdings" w:hAnsi="Wingdings" w:hint="default"/>
+        <w:sz w:val="20"/>
+      </w:rPr>
+    </w:lvl>
+    <w:lvl w:ilvl="3" w:tentative="1">
+      <w:start w:val="1"/>
+      <w:numFmt w:val="bullet"/>
+      <w:lvlText w:val=""/>
+      <w:lvlJc w:val="left"/>
+      <w:pPr>
+        <w:tabs>
+          <w:tab w:val="num" w:pos="2880"/>
+        </w:tabs>
+        <w:ind w:left="2880" w:hanging="360"/>
+      </w:pPr>
+      <w:rPr>
+        <w:rFonts w:ascii="Wingdings" w:hAnsi="Wingdings" w:hint="default"/>
+        <w:sz w:val="20"/>
+      </w:rPr>
+    </w:lvl>
+    <w:lvl w:ilvl="4" w:tentative="1">
+      <w:start w:val="1"/>
+      <w:numFmt w:val="bullet"/>
+      <w:lvlText w:val=""/>
+      <w:lvlJc w:val="left"/>
+      <w:pPr>
+        <w:tabs>
+          <w:tab w:val="num" w:pos="3600"/>
+        </w:tabs>
+        <w:ind w:left="3600" w:hanging="360"/>
+      </w:pPr>
+      <w:rPr>
+        <w:rFonts w:ascii="Wingdings" w:hAnsi="Wingdings" w:hint="default"/>
+        <w:sz w:val="20"/>
+      </w:rPr>
+    </w:lvl>
+    <w:lvl w:ilvl="5" w:tentative="1">
+      <w:start w:val="1"/>
+      <w:numFmt w:val="bullet"/>
+      <w:lvlText w:val=""/>
+      <w:lvlJc w:val="left"/>
+      <w:pPr>
+        <w:tabs>
+          <w:tab w:val="num" w:pos="4320"/>
+        </w:tabs>
+        <w:ind w:left="4320" w:hanging="360"/>
+      </w:pPr>
+      <w:rPr>
+        <w:rFonts w:ascii="Wingdings" w:hAnsi="Wingdings" w:hint="default"/>
+        <w:sz w:val="20"/>
+      </w:rPr>
+    </w:lvl>
+    <w:lvl w:ilvl="6" w:tentative="1">
+      <w:start w:val="1"/>
+      <w:numFmt w:val="bullet"/>
+      <w:lvlText w:val=""/>
+      <w:lvlJc w:val="left"/>
+      <w:pPr>
+        <w:tabs>
+          <w:tab w:val="num" w:pos="5040"/>
+        </w:tabs>
+        <w:ind w:left="5040" w:hanging="360"/>
+      </w:pPr>
+      <w:rPr>
+        <w:rFonts w:ascii="Wingdings" w:hAnsi="Wingdings" w:hint="default"/>
+        <w:sz w:val="20"/>
+      </w:rPr>
+    </w:lvl>
+    <w:lvl w:ilvl="7" w:tentative="1">
+      <w:start w:val="1"/>
+      <w:numFmt w:val="bullet"/>
+      <w:lvlText w:val=""/>
+      <w:lvlJc w:val="left"/>
+      <w:pPr>
+        <w:tabs>
+          <w:tab w:val="num" w:pos="5760"/>
+        </w:tabs>
+        <w:ind w:left="5760" w:hanging="360"/>
+      </w:pPr>
+      <w:rPr>
+        <w:rFonts w:ascii="Wingdings" w:hAnsi="Wingdings" w:hint="default"/>
+        <w:sz w:val="20"/>
+      </w:rPr>
+    </w:lvl>
+    <w:lvl w:ilvl="8" w:tentative="1">
+      <w:start w:val="1"/>
+      <w:numFmt w:val="bullet"/>
+      <w:lvlText w:val=""/>
+      <w:lvlJc w:val="left"/>
+      <w:pPr>
+        <w:tabs>
+          <w:tab w:val="num" w:pos="6480"/>
+        </w:tabs>
+        <w:ind w:left="6480" w:hanging="360"/>
+      </w:pPr>
+      <w:rPr>
+        <w:rFonts w:ascii="Wingdings" w:hAnsi="Wingdings" w:hint="default"/>
+        <w:sz w:val="20"/>
+      </w:rPr>
+    </w:lvl>
+  </w:abstractNum>
+  <w:abstractNum w:abstractNumId="26" w15:restartNumberingAfterBreak="0">
+    <w:nsid w:val="781B76AF"/>
+    <w:multiLevelType w:val="multilevel"/>
+    <w:tmpl w:val="D4FC85D4"/>
+    <w:lvl w:ilvl="0">
+      <w:start w:val="1"/>
+      <w:numFmt w:val="bullet"/>
+      <w:lvlText w:val=""/>
+      <w:lvlJc w:val="left"/>
+      <w:pPr>
+        <w:tabs>
+          <w:tab w:val="num" w:pos="720"/>
+        </w:tabs>
+        <w:ind w:left="720" w:hanging="360"/>
+      </w:pPr>
+      <w:rPr>
+        <w:rFonts w:ascii="Symbol" w:hAnsi="Symbol" w:hint="default"/>
+        <w:sz w:val="20"/>
+      </w:rPr>
+    </w:lvl>
+    <w:lvl w:ilvl="1">
       <w:start w:val="1"/>
       <w:numFmt w:val="bullet"/>
       <w:lvlText w:val="o"/>
@@ -13998,11 +13976,14 @@
   <w:num w:numId="26" w16cid:durableId="150371805">
     <w:abstractNumId w:val="24"/>
   </w:num>
+  <w:num w:numId="27" w16cid:durableId="1516724294">
+    <w:abstractNumId w:val="26"/>
+  </w:num>
 </w:numbering>
 </file>
 
 <file path=word/styles.xml><?xml version="1.0" encoding="utf-8"?>
-<w:styles xmlns:mc="http://schemas.openxmlformats.org/markup-compatibility/2006" xmlns:r="http://schemas.openxmlformats.org/officeDocument/2006/relationships" xmlns:w="http://schemas.openxmlformats.org/wordprocessingml/2006/main" xmlns:w14="http://schemas.microsoft.com/office/word/2010/wordml" xmlns:w15="http://schemas.microsoft.com/office/word/2012/wordml" xmlns:w16cex="http://schemas.microsoft.com/office/word/2018/wordml/cex" xmlns:w16cid="http://schemas.microsoft.com/office/word/2016/wordml/cid" xmlns:w16="http://schemas.microsoft.com/office/word/2018/wordml" xmlns:w16sdtdh="http://schemas.microsoft.com/office/word/2020/wordml/sdtdatahash" xmlns:w16se="http://schemas.microsoft.com/office/word/2015/wordml/symex" mc:Ignorable="w14 w15 w16se w16cid w16 w16cex w16sdtdh">
+<w:styles xmlns:mc="http://schemas.openxmlformats.org/markup-compatibility/2006" xmlns:r="http://schemas.openxmlformats.org/officeDocument/2006/relationships" xmlns:w="http://schemas.openxmlformats.org/wordprocessingml/2006/main" xmlns:w14="http://schemas.microsoft.com/office/word/2010/wordml" xmlns:w15="http://schemas.microsoft.com/office/word/2012/wordml" xmlns:w16cex="http://schemas.microsoft.com/office/word/2018/wordml/cex" xmlns:w16cid="http://schemas.microsoft.com/office/word/2016/wordml/cid" xmlns:w16="http://schemas.microsoft.com/office/word/2018/wordml" xmlns:w16du="http://schemas.microsoft.com/office/word/2023/wordml/word16du" xmlns:w16sdtdh="http://schemas.microsoft.com/office/word/2020/wordml/sdtdatahash" xmlns:w16sdtfl="http://schemas.microsoft.com/office/word/2024/wordml/sdtformatlock" xmlns:w16se="http://schemas.microsoft.com/office/word/2015/wordml/symex" mc:Ignorable="w14 w15 w16se w16cid w16 w16cex w16sdtdh w16sdtfl w16du">
   <w:docDefaults>
     <w:rPrDefault>
       <w:rPr>

</xml_diff>